<commit_message>
Resolve Pages directory collision and refine reviewed project wording
</commit_message>
<xml_diff>
--- a/resume.docx
+++ b/resume.docx
@@ -166,7 +166,7 @@
         <w:keepLines/>
       </w:pPr>
       <w:r>
-        <w:t xml:space="preserve">팀 조율 · 일정·업무를 나누고 팀원·멘토와 구현 대안 검토</w:t>
+        <w:t xml:space="preserve">팀 조율 · 일정을 조율하고 업무를 나누며, 팀원·멘토와 구현 대안을 검토합니다.</w:t>
       </w:r>
     </w:p>
     <w:p>
@@ -479,7 +479,7 @@
         <w:keepLines/>
       </w:pPr>
       <w:r>
-        <w:t xml:space="preserve">행동 · 일정과 업무를 나누고 멘토와 진행 상황을 공유했습니다. FnGuide·WiseReport 등 리포트 소스의 기본 수집 코드를 작성하고, PDF 본문·표·이미지의 처리 문제를 담당 팀원·멘토와 검토했습니다.</w:t>
+        <w:t xml:space="preserve">행동 · 5인 팀의 일정을 조율하고 업무를 나눴으며, 멘토와 진행 상황을 공유했습니다. FnGuide·WiseReport 등에서 자료를 수집하는 기본 코드를 작성했습니다. PDF 파싱 문제는 본문·표·이미지로 나눠 대안을 검토했습니다.</w:t>
       </w:r>
     </w:p>
     <w:p>
@@ -541,7 +541,7 @@
         <w:keepLines/>
       </w:pPr>
       <w:r>
-        <w:t xml:space="preserve">결과 · 자료 대조 화면 제공과 평가 수치 공개 중단 기록이 있습니다. 2025 경기청년 갭이어 우수 참여자로 선정됐습니다.</w:t>
+        <w:t xml:space="preserve">결과 · 2025 경기청년 갭이어 우수 참여자로 선정됐습니다.</w:t>
       </w:r>
     </w:p>
     <w:p>
@@ -615,7 +615,7 @@
         <w:keepLines/>
       </w:pPr>
       <w:r>
-        <w:t xml:space="preserve">2026 · 6인 팀 백엔드·AI 에이전트 담당 / 후속 구현·감사는 AI 협업</w:t>
+        <w:t xml:space="preserve">2026 · 팀 백엔드·AI 에이전트 담당 / 후속 구현·점검은 AI 협업으로 진행</w:t>
       </w:r>
     </w:p>
     <w:p>
@@ -635,17 +635,17 @@
         <w:keepLines/>
       </w:pPr>
       <w:r>
-        <w:t xml:space="preserve">행동 · 백엔드 연결·AI 에이전트 흐름을 맡고 데모의 글자 잘림·줄바꿈·동의 설정·모바일 화면 수정 사항을 정리했습니다. 팀 PM은 별도 담당이며, 보호자·시니어 역할을 나눈 PRD·사용자 여정·화면과 동의 5종은 팀 산출물입니다.</w:t>
-      </w:r>
-    </w:p>
-    <w:p>
-      <w:pPr>
-        <w:pStyle w:val="Normal"/>
-        <w:spacing w:before="0" w:after="55"/>
-        <w:keepLines/>
-      </w:pPr>
-      <w:r>
-        <w:t xml:space="preserve">결과 · 캡스톤 대상을 수상했습니다. 소개 화면 접속은 확인했으며 전체 기능과 실제 이용 효과는 추가 검증이 필요합니다.</w:t>
+        <w:t xml:space="preserve">행동 · 백엔드 연결·에이전트 흐름을 맡고 데모에서 글자 잘림·줄바꿈·동의 설정·모바일 화면 등의 수정 사항을 정리했습니다. 서비스는 보호자가 질문·사진을 준비하고 결과를 검수하며, 시니어는 답변에 집중하는 흐름으로 구성되어 있습니다. 팀 자료에는 PRD·사용자 여정·화면 설계와 목적별 동의 5종이 정리되어 있습니다.</w:t>
+      </w:r>
+    </w:p>
+    <w:p>
+      <w:pPr>
+        <w:pStyle w:val="Normal"/>
+        <w:spacing w:before="0" w:after="55"/>
+        <w:keepLines/>
+      </w:pPr>
+      <w:r>
+        <w:t xml:space="preserve">결과 · 캡스톤 대상을 수상했습니다. 소개 화면이 열리는 것은 확인했습니다. 전체 기능의 동작과 실제 이용 효과는 별도 검증이 필요합니다.</w:t>
       </w:r>
     </w:p>
     <w:p>

</xml_diff>

<commit_message>
Sync six verified portfolio cases and resume documents
</commit_message>
<xml_diff>
--- a/resume.docx
+++ b/resume.docx
@@ -98,6 +98,7 @@
           <w:p>
             <w:pPr>
               <w:jc w:val="right"/>
+              <w:spacing w:line="240" w:lineRule="auto"/>
             </w:pPr>
             <w:r>
               <w:drawing>
@@ -583,7 +584,7 @@
         <w:keepLines/>
       </w:pPr>
       <w:r>
-        <w:t xml:space="preserve">행동 · 좌석 0·정보 미제공·수집 실패를 구분하고 관측 시각을 응답에 넣었습니다. 근거가 없는 예측값은 null로 남겼습니다. AI와 협업한 SQLite 로컬 백엔드의 원천 데이터와 HTTP 응답을 4개 정류장·6개 노선/방향에서 대조했습니다.</w:t>
+        <w:t xml:space="preserve">행동 · 좌석 0·정보 미제공·수집 실패를 구분하고 관측 시각을 응답에 넣었습니다. 근거가 없는 예측값은 null로 남겼습니다. AI와 협업한 SQLite 로컬 백엔드의 원천 데이터와 HTTP 응답을 정류장 4곳의 노선·방향 매핑 6건을 대조했습니다.</w:t>
       </w:r>
     </w:p>
     <w:p>
@@ -645,7 +646,7 @@
         <w:keepLines/>
       </w:pPr>
       <w:r>
-        <w:t xml:space="preserve">결과 · 캡스톤 대상을 수상했습니다. 소개 화면이 열리는 것은 확인했습니다. 전체 기능의 동작과 실제 이용 효과는 별도 검증이 필요합니다.</w:t>
+        <w:t xml:space="preserve">결과 · 데모 검토 요청 10건과 팀 완료 표시가 남아 있습니다. 같은 화면의 수정 후 캡처와 캡스톤 수상 원본은 보완이 필요합니다. 전체 기능 흐름과 실제 이용 효과는 후속 확인 대상입니다.</w:t>
       </w:r>
     </w:p>
     <w:p>
@@ -697,7 +698,7 @@
         <w:keepLines/>
       </w:pPr>
       <w:r>
-        <w:t xml:space="preserve">결과 · 경기청년 연구랩업 대상을 수상했습니다. 정책 채택과 실제 접근성 개선 효과는 확인되지 않았습니다.</w:t>
+        <w:t xml:space="preserve">결과 · 팀은 2025 경기청년 연구 랩업 대상을 수상했습니다. 정책 채택과 실제 접근성 개선 효과는 확인되지 않았습니다.</w:t>
       </w:r>
     </w:p>
     <w:p>
@@ -719,7 +720,7 @@
         <w:keepLines/>
       </w:pPr>
       <w:r>
-        <w:t xml:space="preserve">KBI 금융 AI 리터러시 카드뉴스 · 2026</w:t>
+        <w:t xml:space="preserve">KBI 금융 AI 리터러시 카드뉴스 · 2026 수상</w:t>
       </w:r>
     </w:p>
     <w:p>
@@ -801,17 +802,23 @@
     </w:rPrDefault>
     <w:pPrDefault>
       <w:pPr>
-        <w:spacing w:line="276" w:lineRule="auto"/>
+        <w:spacing w:line="263" w:lineRule="exact"/>
         <w:widowControl/>
       </w:pPr>
     </w:pPrDefault>
   </w:docDefaults>
   <w:style w:type="paragraph" w:default="1" w:styleId="Normal">
     <w:name w:val="Normal"/>
+    <w:pPr>
+      <w:spacing w:line="262" w:lineRule="exact"/>
+    </w:pPr>
   </w:style>
   <w:style w:type="paragraph" w:styleId="Title">
     <w:name w:val="Title"/>
     <w:basedOn w:val="Normal"/>
+    <w:pPr>
+      <w:spacing w:line="600" w:lineRule="exact"/>
+    </w:pPr>
     <w:rPr>
       <w:sz w:val="48"/>
       <w:color w:val="17242A"/>
@@ -821,6 +828,9 @@
   <w:style w:type="paragraph" w:styleId="Subtitle">
     <w:name w:val="Subtitle"/>
     <w:basedOn w:val="Normal"/>
+    <w:pPr>
+      <w:spacing w:line="325" w:lineRule="exact"/>
+    </w:pPr>
     <w:rPr>
       <w:sz w:val="26"/>
       <w:color w:val="194ACB"/>
@@ -831,6 +841,7 @@
     <w:name w:val="Heading1"/>
     <w:basedOn w:val="Normal"/>
     <w:pPr>
+      <w:spacing w:line="325" w:lineRule="exact"/>
       <w:outlineLvl w:val="0"/>
     </w:pPr>
     <w:rPr>
@@ -843,6 +854,7 @@
     <w:name w:val="Heading2"/>
     <w:basedOn w:val="Normal"/>
     <w:pPr>
+      <w:spacing w:line="262" w:lineRule="exact"/>
       <w:outlineLvl w:val="1"/>
     </w:pPr>
     <w:rPr>
@@ -854,6 +866,9 @@
   <w:style w:type="paragraph" w:styleId="Meta">
     <w:name w:val="Meta"/>
     <w:basedOn w:val="Normal"/>
+    <w:pPr>
+      <w:spacing w:line="225" w:lineRule="exact"/>
+    </w:pPr>
     <w:rPr>
       <w:sz w:val="18"/>
       <w:color w:val="455567"/>
@@ -862,6 +877,9 @@
   <w:style w:type="paragraph" w:styleId="Contact">
     <w:name w:val="Contact"/>
     <w:basedOn w:val="Normal"/>
+    <w:pPr>
+      <w:spacing w:line="225" w:lineRule="exact"/>
+    </w:pPr>
     <w:rPr>
       <w:sz w:val="18"/>
       <w:color w:val="455567"/>
@@ -871,6 +889,7 @@
     <w:name w:val="EducationDetail"/>
     <w:basedOn w:val="Normal"/>
     <w:pPr>
+      <w:spacing w:line="238" w:lineRule="exact"/>
       <w:ind w:left="160"/>
     </w:pPr>
     <w:rPr>

</xml_diff>

<commit_message>
Publish two-page resume and twelve-page portfolio summary
</commit_message>
<xml_diff>
--- a/resume.docx
+++ b/resume.docx
@@ -57,9 +57,11 @@
       <w:pPr>
         <w:keepNext/>
         <w:keepLines/>
+        <w:spacing w:line="380" w:lineRule="exact" w:before="0" w:after="80"/>
       </w:pPr>
       <w:r>
         <w:rPr>
+          <w:color w:val="000000"/>
           <w:sz w:val="28"/>
         </w:rPr>
         <w:t>서비스 기획 / PM</w:t>
@@ -69,26 +71,40 @@
       <w:pPr>
         <w:keepNext/>
         <w:keepLines/>
+        <w:spacing w:line="270" w:lineRule="exact" w:before="0" w:after="80"/>
       </w:pPr>
       <w:r>
+        <w:rPr>
+          <w:color w:val="000000"/>
+          <w:sz w:val="22"/>
+        </w:rPr>
         <w:t>화면과 데이터의 표시 기준을 정리하고, 팀의 일정과 범위를 조율합니다.</w:t>
       </w:r>
     </w:p>
     <w:p>
       <w:pPr>
-        <w:spacing w:after="60"/>
+        <w:keepNext w:val="0"/>
+        <w:keepLines/>
+        <w:spacing w:line="270" w:lineRule="exact" w:before="0" w:after="40"/>
       </w:pPr>
       <w:r>
         <w:rPr>
           <w:b/>
+          <w:sz w:val="22"/>
         </w:rPr>
         <w:t xml:space="preserve">이메일 · </w:t>
+      </w:r>
+      <w:r>
+        <w:rPr>
+          <w:color w:val="000000"/>
+          <w:sz w:val="22"/>
+        </w:rPr>
       </w:r>
       <w:hyperlink r:id="rId10">
         <w:r>
           <w:rPr>
             <w:color w:val="194ACB"/>
-            <w:u w:val="single"/>
+            <w:sz w:val="22"/>
           </w:rPr>
           <w:t>mdh0204@naver.com</w:t>
         </w:r>
@@ -96,19 +112,28 @@
     </w:p>
     <w:p>
       <w:pPr>
-        <w:spacing w:after="60"/>
+        <w:keepNext w:val="0"/>
+        <w:keepLines/>
+        <w:spacing w:line="270" w:lineRule="exact" w:before="0" w:after="40"/>
       </w:pPr>
       <w:r>
         <w:rPr>
           <w:b/>
+          <w:sz w:val="22"/>
         </w:rPr>
         <w:t xml:space="preserve">포트폴리오 · </w:t>
+      </w:r>
+      <w:r>
+        <w:rPr>
+          <w:color w:val="000000"/>
+          <w:sz w:val="22"/>
+        </w:rPr>
       </w:r>
       <w:hyperlink r:id="rId11">
         <w:r>
           <w:rPr>
             <w:color w:val="194ACB"/>
-            <w:u w:val="single"/>
+            <w:sz w:val="22"/>
           </w:rPr>
           <w:t>moondh99.github.io</w:t>
         </w:r>
@@ -116,19 +141,28 @@
     </w:p>
     <w:p>
       <w:pPr>
-        <w:spacing w:after="60"/>
+        <w:keepNext w:val="0"/>
+        <w:keepLines/>
+        <w:spacing w:line="270" w:lineRule="exact" w:before="0" w:after="40"/>
       </w:pPr>
       <w:r>
         <w:rPr>
           <w:b/>
+          <w:sz w:val="22"/>
         </w:rPr>
         <w:t xml:space="preserve">GitHub · </w:t>
+      </w:r>
+      <w:r>
+        <w:rPr>
+          <w:color w:val="000000"/>
+          <w:sz w:val="22"/>
+        </w:rPr>
       </w:r>
       <w:hyperlink r:id="rId12">
         <w:r>
           <w:rPr>
             <w:color w:val="194ACB"/>
-            <w:u w:val="single"/>
+            <w:sz w:val="22"/>
           </w:rPr>
           <w:t>github.com/moondh99</w:t>
         </w:r>
@@ -136,38 +170,47 @@
     </w:p>
     <w:p>
       <w:pPr>
-        <w:keepNext w:val="0"/>
+        <w:pStyle w:val="Heading1"/>
+        <w:keepNext/>
         <w:keepLines/>
+        <w:spacing w:line="320" w:lineRule="exact" w:before="140" w:after="60"/>
       </w:pPr>
       <w:r>
         <w:rPr>
-          <w:sz w:val="20"/>
+          <w:b/>
+          <w:color w:val="000000"/>
+          <w:sz w:val="26"/>
         </w:rPr>
-        <w:t>Notion 공개 링크는 확인 필요입니다.</w:t>
-      </w:r>
-    </w:p>
-    <w:p>
-      <w:pPr>
-        <w:pStyle w:val="Heading1"/>
-      </w:pPr>
-      <w:r>
         <w:t>핵심 역량</w:t>
       </w:r>
     </w:p>
     <w:p>
       <w:pPr>
         <w:pStyle w:val="Heading2"/>
+        <w:keepNext/>
+        <w:keepLines/>
+        <w:spacing w:line="270" w:lineRule="exact" w:before="80" w:after="20"/>
       </w:pPr>
       <w:r>
-        <w:t>화면·응답 기준 작성</w:t>
+        <w:rPr>
+          <w:b/>
+          <w:color w:val="000000"/>
+          <w:sz w:val="22"/>
+        </w:rPr>
+        <w:t>화면과 응답 기준 작성</w:t>
       </w:r>
     </w:p>
     <w:p>
       <w:pPr>
-        <w:keepNext w:val="0"/>
+        <w:keepNext/>
         <w:keepLines/>
+        <w:spacing w:line="270" w:lineRule="exact" w:before="0" w:after="40"/>
       </w:pPr>
       <w:r>
+        <w:rPr>
+          <w:color w:val="000000"/>
+          <w:sz w:val="22"/>
+        </w:rPr>
         <w:t>사용자 역할과 값·상태·시각을 구분해 화면 정책·개발 명세로 정리합니다.</w:t>
       </w:r>
     </w:p>
@@ -175,16 +218,19 @@
       <w:pPr>
         <w:keepNext w:val="0"/>
         <w:keepLines/>
+        <w:spacing w:line="270" w:lineRule="exact" w:before="0" w:after="40"/>
       </w:pPr>
       <w:r>
         <w:rPr>
           <w:b/>
+          <w:sz w:val="22"/>
         </w:rPr>
         <w:t xml:space="preserve">근거 · </w:t>
       </w:r>
       <w:r>
         <w:rPr>
-          <w:sz w:val="20"/>
+          <w:color w:val="000000"/>
+          <w:sz w:val="22"/>
         </w:rPr>
         <w:t>Dear Log 데모 수정 요청 10건, 양주 관측·결측 명세와 매핑 6건 대조</w:t>
       </w:r>
@@ -192,17 +238,30 @@
     <w:p>
       <w:pPr>
         <w:pStyle w:val="Heading2"/>
+        <w:keepNext/>
+        <w:keepLines/>
+        <w:spacing w:line="270" w:lineRule="exact" w:before="80" w:after="20"/>
       </w:pPr>
       <w:r>
+        <w:rPr>
+          <w:b/>
+          <w:color w:val="000000"/>
+          <w:sz w:val="22"/>
+        </w:rPr>
         <w:t>팀 일정과 구현 문제 조율</w:t>
       </w:r>
     </w:p>
     <w:p>
       <w:pPr>
-        <w:keepNext w:val="0"/>
+        <w:keepNext/>
         <w:keepLines/>
+        <w:spacing w:line="270" w:lineRule="exact" w:before="0" w:after="40"/>
       </w:pPr>
       <w:r>
+        <w:rPr>
+          <w:color w:val="000000"/>
+          <w:sz w:val="22"/>
+        </w:rPr>
         <w:t>일정·업무를 나누고 처리 문제를 유형별로 정리해 팀원·멘토와 대안을 검토합니다.</w:t>
       </w:r>
     </w:p>
@@ -210,77 +269,66 @@
       <w:pPr>
         <w:keepNext w:val="0"/>
         <w:keepLines/>
+        <w:spacing w:line="270" w:lineRule="exact" w:before="0" w:after="40"/>
       </w:pPr>
       <w:r>
         <w:rPr>
           <w:b/>
+          <w:sz w:val="22"/>
         </w:rPr>
         <w:t xml:space="preserve">근거 · </w:t>
       </w:r>
       <w:r>
         <w:rPr>
-          <w:sz w:val="20"/>
+          <w:color w:val="000000"/>
+          <w:sz w:val="22"/>
         </w:rPr>
         <w:t>Finsight 5인 팀 조율·PDF 문제 검토·팀 웹 배포, 온통청년 범위·우선순위 조정</w:t>
       </w:r>
     </w:p>
     <w:p>
       <w:pPr>
-        <w:pStyle w:val="Heading2"/>
-      </w:pPr>
-      <w:r>
-        <w:t>데이터 근거와 공개 범위 검토</w:t>
-      </w:r>
-    </w:p>
-    <w:p>
-      <w:pPr>
-        <w:keepNext w:val="0"/>
+        <w:pStyle w:val="Heading1"/>
+        <w:keepNext/>
         <w:keepLines/>
-      </w:pPr>
-      <w:r>
-        <w:t>원문·저장 내용·응답을 대조하고 확인 범위와 정보 미제공 사유를 요구사항으로 정리합니다.</w:t>
-      </w:r>
-    </w:p>
-    <w:p>
-      <w:pPr>
-        <w:keepNext w:val="0"/>
-        <w:keepLines/>
+        <w:spacing w:line="320" w:lineRule="exact" w:before="140" w:after="60"/>
       </w:pPr>
       <w:r>
         <w:rPr>
           <w:b/>
+          <w:color w:val="000000"/>
+          <w:sz w:val="26"/>
         </w:rPr>
-        <w:t xml:space="preserve">근거 · </w:t>
-      </w:r>
-      <w:r>
-        <w:rPr>
-          <w:sz w:val="20"/>
-        </w:rPr>
-        <w:t>NCA 2025 원문 대조·2026 공개 기준 승인, 양주 원천·HTTP 응답 대조</w:t>
-      </w:r>
-    </w:p>
-    <w:p>
-      <w:pPr>
-        <w:pStyle w:val="Heading1"/>
-      </w:pPr>
-      <w:r>
         <w:t>학력</w:t>
       </w:r>
     </w:p>
     <w:p>
       <w:pPr>
         <w:pStyle w:val="Heading2"/>
+        <w:keepNext/>
+        <w:keepLines/>
+        <w:spacing w:line="270" w:lineRule="exact" w:before="80" w:after="20"/>
       </w:pPr>
       <w:r>
+        <w:rPr>
+          <w:b/>
+          <w:color w:val="000000"/>
+          <w:sz w:val="22"/>
+        </w:rPr>
         <w:t>국민대학교</w:t>
       </w:r>
     </w:p>
     <w:p>
       <w:pPr>
-        <w:keepNext w:val="0"/>
+        <w:keepNext/>
         <w:keepLines/>
+        <w:spacing w:line="270" w:lineRule="exact" w:before="0" w:after="40"/>
       </w:pPr>
       <w:r>
+        <w:rPr>
+          <w:color w:val="000000"/>
+          <w:sz w:val="22"/>
+        </w:rPr>
         <w:t>AI빅데이터융합경영학 · 경영정보학 복수전공</w:t>
       </w:r>
     </w:p>
@@ -288,9 +336,231 @@
       <w:pPr>
         <w:keepNext w:val="0"/>
         <w:keepLines/>
+        <w:spacing w:line="270" w:lineRule="exact" w:before="0" w:after="40"/>
       </w:pPr>
       <w:r>
+        <w:rPr>
+          <w:color w:val="000000"/>
+          <w:sz w:val="22"/>
+        </w:rPr>
         <w:t>2019.03-2026.08 · 졸업 · 학점 3.24/4.5</w:t>
+      </w:r>
+    </w:p>
+    <w:p>
+      <w:pPr>
+        <w:pStyle w:val="Heading1"/>
+        <w:keepNext/>
+        <w:keepLines/>
+        <w:spacing w:line="320" w:lineRule="exact" w:before="140" w:after="60"/>
+      </w:pPr>
+      <w:r>
+        <w:rPr>
+          <w:b/>
+          <w:color w:val="000000"/>
+          <w:sz w:val="26"/>
+        </w:rPr>
+        <w:t>교육 이수</w:t>
+      </w:r>
+    </w:p>
+    <w:p>
+      <w:pPr>
+        <w:pStyle w:val="Heading2"/>
+        <w:keepNext/>
+        <w:keepLines/>
+        <w:spacing w:line="270" w:lineRule="exact" w:before="80" w:after="20"/>
+      </w:pPr>
+      <w:r>
+        <w:rPr>
+          <w:b/>
+          <w:color w:val="000000"/>
+          <w:sz w:val="22"/>
+        </w:rPr>
+        <w:t>수도권 ICT 이노베이션스퀘어 서비스 기획 과정</w:t>
+      </w:r>
+    </w:p>
+    <w:p>
+      <w:pPr>
+        <w:keepNext w:val="0"/>
+        <w:keepLines/>
+        <w:spacing w:line="270" w:lineRule="exact" w:before="0" w:after="40"/>
+      </w:pPr>
+      <w:r>
+        <w:rPr>
+          <w:color w:val="000000"/>
+          <w:sz w:val="22"/>
+        </w:rPr>
+        <w:t>2024.12.02-12.13 · 40시간 수료</w:t>
+      </w:r>
+    </w:p>
+    <w:p>
+      <w:pPr>
+        <w:pStyle w:val="Heading2"/>
+        <w:keepNext/>
+        <w:keepLines/>
+        <w:spacing w:line="270" w:lineRule="exact" w:before="80" w:after="20"/>
+      </w:pPr>
+      <w:r>
+        <w:rPr>
+          <w:b/>
+          <w:color w:val="000000"/>
+          <w:sz w:val="22"/>
+        </w:rPr>
+        <w:t>국립한국교통대학교 산업 인공지능 과정</w:t>
+      </w:r>
+    </w:p>
+    <w:p>
+      <w:pPr>
+        <w:keepNext w:val="0"/>
+        <w:keepLines/>
+        <w:spacing w:line="270" w:lineRule="exact" w:before="0" w:after="40"/>
+      </w:pPr>
+      <w:r>
+        <w:rPr>
+          <w:color w:val="000000"/>
+          <w:sz w:val="22"/>
+        </w:rPr>
+        <w:t>2024.04.01-06.19 · Python·Jupyter Notebook의 변수·기본 자료형 교육 수료</w:t>
+      </w:r>
+    </w:p>
+    <w:p>
+      <w:pPr>
+        <w:pStyle w:val="Heading2"/>
+        <w:keepNext/>
+        <w:keepLines/>
+        <w:spacing w:line="270" w:lineRule="exact" w:before="80" w:after="20"/>
+      </w:pPr>
+      <w:r>
+        <w:rPr>
+          <w:b/>
+          <w:color w:val="000000"/>
+          <w:sz w:val="22"/>
+        </w:rPr>
+        <w:t>서울 ICT 이노베이션스퀘어 데이터 엔지니어링 중급 과정</w:t>
+      </w:r>
+    </w:p>
+    <w:p>
+      <w:pPr>
+        <w:keepNext w:val="0"/>
+        <w:keepLines/>
+        <w:spacing w:line="270" w:lineRule="exact" w:before="0" w:after="40"/>
+      </w:pPr>
+      <w:r>
+        <w:rPr>
+          <w:color w:val="000000"/>
+          <w:sz w:val="22"/>
+        </w:rPr>
+        <w:t>2023 · SQL·Spark, Kafka·Flink, Airflow 교육 수료</w:t>
+      </w:r>
+    </w:p>
+    <w:p>
+      <w:pPr>
+        <w:pStyle w:val="Heading1"/>
+        <w:keepNext/>
+        <w:keepLines/>
+        <w:spacing w:line="320" w:lineRule="exact" w:before="140" w:after="60"/>
+      </w:pPr>
+      <w:r>
+        <w:rPr>
+          <w:b/>
+          <w:color w:val="000000"/>
+          <w:sz w:val="26"/>
+        </w:rPr>
+        <w:t>경험사항</w:t>
+      </w:r>
+    </w:p>
+    <w:p>
+      <w:pPr>
+        <w:pStyle w:val="Heading2"/>
+        <w:keepNext/>
+        <w:keepLines/>
+        <w:spacing w:line="270" w:lineRule="exact" w:before="80" w:after="20"/>
+      </w:pPr>
+      <w:r>
+        <w:rPr>
+          <w:b/>
+          <w:color w:val="000000"/>
+          <w:sz w:val="22"/>
+        </w:rPr>
+        <w:t>셀렉트스타 프로젝트3팀</w:t>
+      </w:r>
+    </w:p>
+    <w:p>
+      <w:pPr>
+        <w:keepNext/>
+        <w:keepLines/>
+        <w:spacing w:line="270" w:lineRule="exact" w:before="0" w:after="40"/>
+      </w:pPr>
+      <w:r>
+        <w:rPr>
+          <w:color w:val="000000"/>
+          <w:sz w:val="21"/>
+        </w:rPr>
+        <w:t>2025.09-12 · Data Assistant</w:t>
+      </w:r>
+    </w:p>
+    <w:p>
+      <w:pPr>
+        <w:keepNext/>
+        <w:keepLines/>
+        <w:spacing w:line="270" w:lineRule="exact" w:before="0" w:after="40"/>
+      </w:pPr>
+      <w:r>
+        <w:rPr>
+          <w:color w:val="000000"/>
+          <w:sz w:val="22"/>
+        </w:rPr>
+        <w:t>LLM 검수 프롬프트 초안을 작성하고 모델별 결과를 비교했습니다. 질문·답변을 어노테이션하고 근거 부족·질문 미응답·표기 오류를 작업시트에 남겼습니다.</w:t>
+      </w:r>
+    </w:p>
+    <w:p>
+      <w:pPr>
+        <w:keepNext w:val="0"/>
+        <w:keepLines/>
+        <w:spacing w:line="270" w:lineRule="exact" w:before="0" w:after="40"/>
+      </w:pPr>
+      <w:r>
+        <w:rPr>
+          <w:b/>
+          <w:sz w:val="22"/>
+        </w:rPr>
+        <w:t xml:space="preserve">결과 · </w:t>
+      </w:r>
+      <w:r>
+        <w:rPr>
+          <w:color w:val="000000"/>
+          <w:sz w:val="22"/>
+        </w:rPr>
+        <w:t>검수 프롬프트 초안과 오류 비고 기록</w:t>
+      </w:r>
+    </w:p>
+    <w:p>
+      <w:pPr>
+        <w:pStyle w:val="Heading2"/>
+        <w:keepNext/>
+        <w:keepLines/>
+        <w:spacing w:line="270" w:lineRule="exact" w:before="80" w:after="20"/>
+      </w:pPr>
+      <w:r>
+        <w:rPr>
+          <w:b/>
+          <w:color w:val="000000"/>
+          <w:sz w:val="22"/>
+        </w:rPr>
+        <w:t>한국금융연수원 출판미디어사업부</w:t>
+      </w:r>
+    </w:p>
+    <w:p>
+      <w:pPr>
+        <w:keepNext w:val="0"/>
+        <w:keepLines/>
+        <w:spacing w:line="270" w:lineRule="exact" w:before="0" w:after="40"/>
+      </w:pPr>
+      <w:r>
+        <w:rPr>
+          <w:color w:val="000000"/>
+          <w:sz w:val="21"/>
+        </w:rPr>
+        <w:t>2024.01-12 · 아르바이트 · 사무보조</w:t>
       </w:r>
     </w:p>
     <w:p>
@@ -301,672 +571,32 @@
     <w:p>
       <w:pPr>
         <w:pStyle w:val="Heading1"/>
+        <w:keepNext/>
+        <w:keepLines/>
+        <w:spacing w:line="320" w:lineRule="exact" w:before="140" w:after="60"/>
       </w:pPr>
       <w:r>
-        <w:t>교육 이수</w:t>
+        <w:rPr>
+          <w:b/>
+          <w:color w:val="000000"/>
+          <w:sz w:val="26"/>
+        </w:rPr>
+        <w:t>대표 프로젝트 경험</w:t>
       </w:r>
     </w:p>
     <w:p>
       <w:pPr>
         <w:pStyle w:val="Heading2"/>
-        <w:spacing w:before="140"/>
-      </w:pPr>
-      <w:r>
-        <w:t>수도권 ICT 이노베이션스퀘어 서비스 기획 과정</w:t>
-      </w:r>
-    </w:p>
-    <w:p>
-      <w:pPr>
         <w:keepNext/>
         <w:keepLines/>
-        <w:spacing w:after="60"/>
-      </w:pPr>
-      <w:r>
-        <w:rPr>
-          <w:sz w:val="20"/>
-        </w:rPr>
-        <w:t>2024.12.02-12.13 · 40시간</w:t>
-      </w:r>
-    </w:p>
-    <w:p>
-      <w:pPr>
-        <w:keepNext/>
-        <w:keepLines/>
-        <w:spacing w:after="60"/>
+        <w:spacing w:line="270" w:lineRule="exact" w:before="80" w:after="20"/>
       </w:pPr>
       <w:r>
         <w:rPr>
           <w:b/>
+          <w:color w:val="000000"/>
+          <w:sz w:val="22"/>
         </w:rPr>
-        <w:t xml:space="preserve">배운 내용 · </w:t>
-      </w:r>
-      <w:r>
-        <w:t>구체적인 교육 내용은 확인 필요입니다.</w:t>
-        <w:br/>
-      </w:r>
-      <w:r>
-        <w:rPr>
-          <w:b/>
-        </w:rPr>
-        <w:t xml:space="preserve">도구와 방법 · </w:t>
-      </w:r>
-      <w:r>
-        <w:t>사용 도구·방법은 확인 필요입니다.</w:t>
-      </w:r>
-    </w:p>
-    <w:p>
-      <w:pPr>
-        <w:keepLines/>
-        <w:spacing w:after="60"/>
-      </w:pPr>
-      <w:r>
-        <w:rPr>
-          <w:b/>
-        </w:rPr>
-        <w:t xml:space="preserve">직접 실습 · </w:t>
-      </w:r>
-      <w:r>
-        <w:t>직접 수행한 실습·산출물은 확인 필요입니다.</w:t>
-        <w:br/>
-      </w:r>
-      <w:r>
-        <w:rPr>
-          <w:b/>
-        </w:rPr>
-        <w:t xml:space="preserve">확인한 결과 · </w:t>
-      </w:r>
-      <w:r>
-        <w:t>수료 기록. 실습 결과는 미확정입니다.</w:t>
-      </w:r>
-    </w:p>
-    <w:p>
-      <w:pPr>
-        <w:pStyle w:val="Heading2"/>
-        <w:spacing w:before="140"/>
-      </w:pPr>
-      <w:r>
-        <w:t>국립한국교통대학교 산학연공유·협업센터 산업 인공지능 과정</w:t>
-      </w:r>
-    </w:p>
-    <w:p>
-      <w:pPr>
-        <w:keepNext/>
-        <w:keepLines/>
-        <w:spacing w:after="60"/>
-      </w:pPr>
-      <w:r>
-        <w:rPr>
-          <w:sz w:val="20"/>
-        </w:rPr>
-        <w:t>2024.04.01-06.19</w:t>
-      </w:r>
-    </w:p>
-    <w:p>
-      <w:pPr>
-        <w:keepNext/>
-        <w:keepLines/>
-        <w:spacing w:after="60"/>
-      </w:pPr>
-      <w:r>
-        <w:rPr>
-          <w:b/>
-        </w:rPr>
-        <w:t xml:space="preserve">배운 내용 · </w:t>
-      </w:r>
-      <w:r>
-        <w:t>Python 변수·기본 자료형</w:t>
-        <w:br/>
-      </w:r>
-      <w:r>
-        <w:rPr>
-          <w:b/>
-        </w:rPr>
-        <w:t xml:space="preserve">도구와 방법 · </w:t>
-      </w:r>
-      <w:r>
-        <w:t>Python · Jupyter Notebook</w:t>
-      </w:r>
-    </w:p>
-    <w:p>
-      <w:pPr>
-        <w:keepLines/>
-        <w:spacing w:after="60"/>
-      </w:pPr>
-      <w:r>
-        <w:rPr>
-          <w:b/>
-        </w:rPr>
-        <w:t xml:space="preserve">직접 실습 · </w:t>
-      </w:r>
-      <w:r>
-        <w:t>직접 수행한 실습 과제·결과물은 확인 필요입니다.</w:t>
-        <w:br/>
-      </w:r>
-      <w:r>
-        <w:rPr>
-          <w:b/>
-        </w:rPr>
-        <w:t xml:space="preserve">확인한 결과 · </w:t>
-      </w:r>
-      <w:r>
-        <w:t>수료 기록. 개별 실습 결과는 미확정입니다.</w:t>
-      </w:r>
-    </w:p>
-    <w:p>
-      <w:pPr>
-        <w:pStyle w:val="Heading2"/>
-        <w:spacing w:before="140"/>
-      </w:pPr>
-      <w:r>
-        <w:t>정보통신산업진흥원 인공지능 BM 과정</w:t>
-      </w:r>
-    </w:p>
-    <w:p>
-      <w:pPr>
-        <w:keepNext/>
-        <w:keepLines/>
-        <w:spacing w:after="60"/>
-      </w:pPr>
-      <w:r>
-        <w:rPr>
-          <w:sz w:val="20"/>
-        </w:rPr>
-        <w:t>2023.12.11-12.22</w:t>
-      </w:r>
-    </w:p>
-    <w:p>
-      <w:pPr>
-        <w:keepNext/>
-        <w:keepLines/>
-        <w:spacing w:after="60"/>
-      </w:pPr>
-      <w:r>
-        <w:rPr>
-          <w:b/>
-        </w:rPr>
-        <w:t xml:space="preserve">배운 내용 · </w:t>
-      </w:r>
-      <w:r>
-        <w:t>구체적인 교육 내용은 확인 필요입니다.</w:t>
-        <w:br/>
-      </w:r>
-      <w:r>
-        <w:rPr>
-          <w:b/>
-        </w:rPr>
-        <w:t xml:space="preserve">도구와 방법 · </w:t>
-      </w:r>
-      <w:r>
-        <w:t>사용 도구·방법은 확인 필요입니다.</w:t>
-      </w:r>
-    </w:p>
-    <w:p>
-      <w:pPr>
-        <w:keepLines/>
-        <w:spacing w:after="60"/>
-      </w:pPr>
-      <w:r>
-        <w:rPr>
-          <w:b/>
-        </w:rPr>
-        <w:t xml:space="preserve">직접 실습 · </w:t>
-      </w:r>
-      <w:r>
-        <w:t>직접 작성한 BM·실습 결과물은 확인 필요입니다.</w:t>
-        <w:br/>
-      </w:r>
-      <w:r>
-        <w:rPr>
-          <w:b/>
-        </w:rPr>
-        <w:t xml:space="preserve">확인한 결과 · </w:t>
-      </w:r>
-      <w:r>
-        <w:t>수료 기록. 실습 결과는 미확정입니다.</w:t>
-      </w:r>
-    </w:p>
-    <w:p>
-      <w:pPr>
-        <w:pStyle w:val="Heading2"/>
-        <w:spacing w:before="140"/>
-      </w:pPr>
-      <w:r>
-        <w:t>서울 ICT 이노베이션스퀘어 데이터 엔지니어링 중급 과정</w:t>
-      </w:r>
-    </w:p>
-    <w:p>
-      <w:pPr>
-        <w:keepNext/>
-        <w:keepLines/>
-        <w:spacing w:after="60"/>
-      </w:pPr>
-      <w:r>
-        <w:rPr>
-          <w:sz w:val="20"/>
-        </w:rPr>
-        <w:t>2023 · 이수 월 확인 필요</w:t>
-      </w:r>
-    </w:p>
-    <w:p>
-      <w:pPr>
-        <w:keepNext/>
-        <w:keepLines/>
-        <w:spacing w:after="60"/>
-      </w:pPr>
-      <w:r>
-        <w:rPr>
-          <w:b/>
-        </w:rPr>
-        <w:t xml:space="preserve">배운 내용 · </w:t>
-      </w:r>
-      <w:r>
-        <w:t>SQL·Spark 데이터 처리, Kafka·Flink 스트리밍, Airflow 파이프라인</w:t>
-        <w:br/>
-      </w:r>
-      <w:r>
-        <w:rPr>
-          <w:b/>
-        </w:rPr>
-        <w:t xml:space="preserve">도구와 방법 · </w:t>
-      </w:r>
-      <w:r>
-        <w:t>SQL · Spark · Kafka · Flink · Airflow</w:t>
-      </w:r>
-    </w:p>
-    <w:p>
-      <w:pPr>
-        <w:keepLines/>
-        <w:spacing w:after="60"/>
-      </w:pPr>
-      <w:r>
-        <w:rPr>
-          <w:b/>
-        </w:rPr>
-        <w:t xml:space="preserve">직접 실습 · </w:t>
-      </w:r>
-      <w:r>
-        <w:t>직접 수행한 파이프라인 실습·코드 원문은 확인 필요입니다.</w:t>
-        <w:br/>
-      </w:r>
-      <w:r>
-        <w:rPr>
-          <w:b/>
-        </w:rPr>
-        <w:t xml:space="preserve">확인한 결과 · </w:t>
-      </w:r>
-      <w:r>
-        <w:t>수료 기록. 개별 실습 결과는 미확정입니다.</w:t>
-      </w:r>
-    </w:p>
-    <w:p>
-      <w:pPr>
-        <w:pStyle w:val="Heading2"/>
-        <w:spacing w:before="140"/>
-      </w:pPr>
-      <w:r>
-        <w:t>D&amp;A 학회 딥러닝 세션</w:t>
-      </w:r>
-    </w:p>
-    <w:p>
-      <w:pPr>
-        <w:keepNext/>
-        <w:keepLines/>
-        <w:spacing w:after="60"/>
-      </w:pPr>
-      <w:r>
-        <w:rPr>
-          <w:sz w:val="20"/>
-        </w:rPr>
-        <w:t>2023 · 이수 월 확인 필요</w:t>
-      </w:r>
-    </w:p>
-    <w:p>
-      <w:pPr>
-        <w:keepNext/>
-        <w:keepLines/>
-        <w:spacing w:after="60"/>
-      </w:pPr>
-      <w:r>
-        <w:rPr>
-          <w:b/>
-        </w:rPr>
-        <w:t xml:space="preserve">배운 내용 · </w:t>
-      </w:r>
-      <w:r>
-        <w:t>PyTorch MLP/CNN, 자연어 토큰화·TF-IDF·Word2Vec</w:t>
-        <w:br/>
-      </w:r>
-      <w:r>
-        <w:rPr>
-          <w:b/>
-        </w:rPr>
-        <w:t xml:space="preserve">도구와 방법 · </w:t>
-      </w:r>
-      <w:r>
-        <w:t>PyTorch와 자연어 처리 방법</w:t>
-      </w:r>
-    </w:p>
-    <w:p>
-      <w:pPr>
-        <w:keepLines/>
-        <w:spacing w:after="60"/>
-      </w:pPr>
-      <w:r>
-        <w:rPr>
-          <w:b/>
-        </w:rPr>
-        <w:t xml:space="preserve">직접 실습 · </w:t>
-      </w:r>
-      <w:r>
-        <w:t>직접 작성한 모델·실습 코드와 평가 결과는 확인 필요입니다.</w:t>
-        <w:br/>
-      </w:r>
-      <w:r>
-        <w:rPr>
-          <w:b/>
-        </w:rPr>
-        <w:t xml:space="preserve">확인한 결과 · </w:t>
-      </w:r>
-      <w:r>
-        <w:t>수료 기록. 개인 실습 결과는 미확정입니다.</w:t>
-      </w:r>
-    </w:p>
-    <w:p>
-      <w:pPr>
-        <w:pStyle w:val="Heading2"/>
-        <w:spacing w:before="140"/>
-      </w:pPr>
-      <w:r>
-        <w:t>D&amp;A 학회 베이직 세션</w:t>
-      </w:r>
-    </w:p>
-    <w:p>
-      <w:pPr>
-        <w:keepNext/>
-        <w:keepLines/>
-        <w:spacing w:after="60"/>
-      </w:pPr>
-      <w:r>
-        <w:rPr>
-          <w:sz w:val="20"/>
-        </w:rPr>
-        <w:t>2020</w:t>
-      </w:r>
-    </w:p>
-    <w:p>
-      <w:pPr>
-        <w:keepNext/>
-        <w:keepLines/>
-        <w:spacing w:after="60"/>
-      </w:pPr>
-      <w:r>
-        <w:rPr>
-          <w:b/>
-        </w:rPr>
-        <w:t xml:space="preserve">배운 내용 · </w:t>
-      </w:r>
-      <w:r>
-        <w:t>구체적인 교육 내용은 확인 필요입니다.</w:t>
-        <w:br/>
-      </w:r>
-      <w:r>
-        <w:rPr>
-          <w:b/>
-        </w:rPr>
-        <w:t xml:space="preserve">도구와 방법 · </w:t>
-      </w:r>
-      <w:r>
-        <w:t>사용 도구·방법은 확인 필요입니다.</w:t>
-      </w:r>
-    </w:p>
-    <w:p>
-      <w:pPr>
-        <w:keepLines/>
-        <w:spacing w:after="60"/>
-      </w:pPr>
-      <w:r>
-        <w:rPr>
-          <w:b/>
-        </w:rPr>
-        <w:t xml:space="preserve">직접 실습 · </w:t>
-      </w:r>
-      <w:r>
-        <w:t>직접 수행한 실습 내용·결과물은 확인 필요입니다.</w:t>
-        <w:br/>
-      </w:r>
-      <w:r>
-        <w:rPr>
-          <w:b/>
-        </w:rPr>
-        <w:t xml:space="preserve">확인한 결과 · </w:t>
-      </w:r>
-      <w:r>
-        <w:t>수료 기록. 실습 결과는 미확정입니다.</w:t>
-      </w:r>
-    </w:p>
-    <w:p>
-      <w:r>
-        <w:br w:type="page"/>
-      </w:r>
-    </w:p>
-    <w:p>
-      <w:pPr>
-        <w:pStyle w:val="Heading1"/>
-      </w:pPr>
-      <w:r>
-        <w:t>경험사항</w:t>
-      </w:r>
-    </w:p>
-    <w:p>
-      <w:pPr>
-        <w:pStyle w:val="Heading2"/>
-      </w:pPr>
-      <w:r>
-        <w:t>경력</w:t>
-      </w:r>
-    </w:p>
-    <w:p>
-      <w:pPr>
-        <w:pStyle w:val="Heading3"/>
-        <w:keepNext/>
-      </w:pPr>
-      <w:r>
-        <w:t>셀렉트스타 프로젝트3팀</w:t>
-      </w:r>
-    </w:p>
-    <w:p>
-      <w:pPr>
-        <w:keepNext/>
-        <w:keepLines/>
-      </w:pPr>
-      <w:r>
-        <w:rPr>
-          <w:sz w:val="20"/>
-        </w:rPr>
-        <w:t>2025.09-12</w:t>
-      </w:r>
-    </w:p>
-    <w:p>
-      <w:pPr>
-        <w:keepNext/>
-        <w:keepLines/>
-      </w:pPr>
-      <w:r>
-        <w:rPr>
-          <w:b/>
-        </w:rPr>
-        <w:t xml:space="preserve">목표 · </w:t>
-      </w:r>
-      <w:r>
-        <w:t>AI 학습데이터 수집·가공 프로젝트 진행 지원</w:t>
-        <w:br/>
-      </w:r>
-      <w:r>
-        <w:rPr>
-          <w:b/>
-        </w:rPr>
-        <w:t xml:space="preserve">내 역할 · </w:t>
-      </w:r>
-      <w:r>
-        <w:t>Data Assistant</w:t>
-      </w:r>
-    </w:p>
-    <w:p>
-      <w:pPr>
-        <w:keepNext/>
-        <w:keepLines/>
-      </w:pPr>
-      <w:r>
-        <w:rPr>
-          <w:b/>
-        </w:rPr>
-        <w:t xml:space="preserve">구체 행동 · </w:t>
-      </w:r>
-      <w:r>
-        <w:t>추론 오류를 점검하는 LLM 검수 프롬프트 초안을 작성하고 모델별 검수 결과를 비교했습니다. 질문·답변 구조를 어노테이션하고 답변가능성·유창성·관련성을 검수했습니다. 근거 부족·질문 미응답·표기 오류를 작업시트 비고에 남겼습니다.</w:t>
-      </w:r>
-    </w:p>
-    <w:p>
-      <w:pPr>
-        <w:keepNext/>
-        <w:keepLines/>
-      </w:pPr>
-      <w:r>
-        <w:rPr>
-          <w:b/>
-        </w:rPr>
-        <w:t xml:space="preserve">도구와 협업 · </w:t>
-      </w:r>
-      <w:r>
-        <w:rPr>
-          <w:sz w:val="21"/>
-        </w:rPr>
-        <w:t>LLM 검수 프롬프트·어노테이션·작업시트. 구체 제품명과 문서 공유 범위는 확인 필요입니다.</w:t>
-      </w:r>
-    </w:p>
-    <w:p>
-      <w:pPr>
-        <w:keepNext w:val="0"/>
-        <w:keepLines/>
-      </w:pPr>
-      <w:r>
-        <w:rPr>
-          <w:b/>
-        </w:rPr>
-        <w:t xml:space="preserve">결과 · </w:t>
-      </w:r>
-      <w:r>
-        <w:t>검수 프롬프트 초안과 오류 비고를 남겼습니다. 검수 물량·정확도 개선 수치는 확인되지 않았습니다.</w:t>
-      </w:r>
-    </w:p>
-    <w:p>
-      <w:pPr>
-        <w:pStyle w:val="Heading3"/>
-        <w:keepNext/>
-      </w:pPr>
-      <w:r>
-        <w:t>한국금융연수원 출판미디어사업부</w:t>
-      </w:r>
-    </w:p>
-    <w:p>
-      <w:pPr>
-        <w:keepNext/>
-        <w:keepLines/>
-      </w:pPr>
-      <w:r>
-        <w:rPr>
-          <w:sz w:val="20"/>
-        </w:rPr>
-        <w:t>2024.01-12</w:t>
-      </w:r>
-    </w:p>
-    <w:p>
-      <w:pPr>
-        <w:keepNext/>
-        <w:keepLines/>
-      </w:pPr>
-      <w:r>
-        <w:rPr>
-          <w:b/>
-        </w:rPr>
-        <w:t xml:space="preserve">목표 · </w:t>
-      </w:r>
-      <w:r>
-        <w:t>사무보조 업무 지원</w:t>
-        <w:br/>
-      </w:r>
-      <w:r>
-        <w:rPr>
-          <w:b/>
-        </w:rPr>
-        <w:t xml:space="preserve">내 역할 · </w:t>
-      </w:r>
-      <w:r>
-        <w:t>아르바이트</w:t>
-      </w:r>
-    </w:p>
-    <w:p>
-      <w:pPr>
-        <w:keepNext/>
-        <w:keepLines/>
-      </w:pPr>
-      <w:r>
-        <w:rPr>
-          <w:b/>
-        </w:rPr>
-        <w:t xml:space="preserve">구체 행동 · </w:t>
-      </w:r>
-      <w:r>
-        <w:t>사무보조를 맡았습니다. 세부 업무·사용 도구·검토·협업 기록은 확인 필요입니다.</w:t>
-      </w:r>
-    </w:p>
-    <w:p>
-      <w:pPr>
-        <w:keepNext/>
-        <w:keepLines/>
-      </w:pPr>
-      <w:r>
-        <w:rPr>
-          <w:b/>
-        </w:rPr>
-        <w:t xml:space="preserve">도구와 협업 · </w:t>
-      </w:r>
-      <w:r>
-        <w:rPr>
-          <w:sz w:val="21"/>
-        </w:rPr>
-        <w:t>구체 도구와 산출물은 확인 필요입니다.</w:t>
-      </w:r>
-    </w:p>
-    <w:p>
-      <w:pPr>
-        <w:keepNext w:val="0"/>
-        <w:keepLines/>
-      </w:pPr>
-      <w:r>
-        <w:rPr>
-          <w:b/>
-        </w:rPr>
-        <w:t xml:space="preserve">결과 · </w:t>
-      </w:r>
-      <w:r>
-        <w:t>수행 결과물과 결과 기록은 확인 필요입니다.</w:t>
-      </w:r>
-    </w:p>
-    <w:p>
-      <w:pPr>
-        <w:pStyle w:val="Heading2"/>
-      </w:pPr>
-      <w:r>
-        <w:t>프로젝트</w:t>
-      </w:r>
-    </w:p>
-    <w:p>
-      <w:pPr>
-        <w:pStyle w:val="Heading3"/>
-        <w:keepNext/>
-      </w:pPr>
-      <w:r>
         <w:t>Finsight ICT 한이음 드림업</w:t>
       </w:r>
     </w:p>
@@ -974,281 +604,194 @@
       <w:pPr>
         <w:keepNext/>
         <w:keepLines/>
+        <w:spacing w:line="270" w:lineRule="exact" w:before="0" w:after="40"/>
       </w:pPr>
       <w:r>
         <w:rPr>
-          <w:sz w:val="20"/>
+          <w:color w:val="000000"/>
+          <w:sz w:val="21"/>
         </w:rPr>
-        <w:t>2025 · 5인 팀</w:t>
+        <w:t>2025 · 5인 팀 · 팀장·PM · 기본 수집 코드 작성</w:t>
       </w:r>
     </w:p>
     <w:p>
       <w:pPr>
         <w:keepNext/>
         <w:keepLines/>
+        <w:spacing w:line="270" w:lineRule="exact" w:before="0" w:after="40"/>
+      </w:pPr>
+      <w:r>
+        <w:rPr>
+          <w:color w:val="000000"/>
+          <w:sz w:val="22"/>
+        </w:rPr>
+        <w:t>일정·업무를 조율하고 FnGuide·WiseReport 기본 수집 코드를 작성했습니다. PDF 문제를 본문·표·이미지로 나눠 팀원·멘토와 대안을 검토했습니다.</w:t>
+      </w:r>
+    </w:p>
+    <w:p>
+      <w:pPr>
+        <w:keepNext w:val="0"/>
+        <w:keepLines/>
+        <w:spacing w:line="270" w:lineRule="exact" w:before="0" w:after="40"/>
       </w:pPr>
       <w:r>
         <w:rPr>
           <w:b/>
+          <w:sz w:val="22"/>
         </w:rPr>
-        <w:t xml:space="preserve">목표 · </w:t>
-      </w:r>
-      <w:r>
-        <w:t>증권사 리포트와 컨센서스를 한곳에서 확인하는 웹서비스</w:t>
-        <w:br/>
+        <w:t xml:space="preserve">결과 · </w:t>
       </w:r>
       <w:r>
         <w:rPr>
+          <w:color w:val="000000"/>
+          <w:sz w:val="22"/>
+        </w:rPr>
+        <w:t>팀 웹서비스 배포 · 본인 수집 코드 기록. 사용자 테스트·이용 효과는 미측정입니다.</w:t>
+      </w:r>
+    </w:p>
+    <w:p>
+      <w:pPr>
+        <w:pStyle w:val="Heading2"/>
+        <w:keepNext/>
+        <w:keepLines/>
+        <w:spacing w:line="270" w:lineRule="exact" w:before="80" w:after="20"/>
+      </w:pPr>
+      <w:r>
+        <w:rPr>
           <w:b/>
+          <w:color w:val="000000"/>
+          <w:sz w:val="22"/>
         </w:rPr>
-        <w:t xml:space="preserve">내 역할 · </w:t>
-      </w:r>
-      <w:r>
-        <w:t>팀장·PM, 기본 수집 코드 작성</w:t>
+        <w:t>NCA 공약과 공식자료 대조</w:t>
       </w:r>
     </w:p>
     <w:p>
       <w:pPr>
         <w:keepNext/>
         <w:keepLines/>
+        <w:spacing w:line="270" w:lineRule="exact" w:before="0" w:after="40"/>
       </w:pPr>
       <w:r>
         <w:rPr>
-          <w:b/>
+          <w:color w:val="000000"/>
+          <w:sz w:val="21"/>
         </w:rPr>
-        <w:t xml:space="preserve">구체 행동 · </w:t>
-      </w:r>
-      <w:r>
-        <w:t>일정과 업무를 조율하고 멘토에게 진행 상황을 공유했습니다. FnGuide 전일 수집·날짜 범위 백필과 WiseReport 날짜 필터·Excel 내려받기 코드를 작성했습니다. PDF 처리 문제를 본문·표·이미지로 나눠 담당 팀원·멘토와 대안을 검토했습니다.</w:t>
+        <w:t>2025-2026 · 2025 데이터 엔지니어링 · 2026 AI 결과 검토·승인</w:t>
       </w:r>
     </w:p>
     <w:p>
       <w:pPr>
         <w:keepNext/>
         <w:keepLines/>
+        <w:spacing w:line="270" w:lineRule="exact" w:before="0" w:after="40"/>
       </w:pPr>
       <w:r>
         <w:rPr>
-          <w:b/>
+          <w:color w:val="000000"/>
+          <w:sz w:val="22"/>
         </w:rPr>
-        <w:t xml:space="preserve">도구와 협업 · </w:t>
-      </w:r>
-      <w:r>
-        <w:rPr>
-          <w:sz w:val="21"/>
-        </w:rPr>
-        <w:t>Python 수집 코드·Excel 내려받기. Docling 시도의 작성자·최종 채택은 미확인입니다.</w:t>
+        <w:t>뉴스 크롤러와 Gemini API 공약 PDF 파서를 작성해 원문과 대조했습니다. 후속 AI 변경안을 검토하고 평가 수치 공개 중단·자료 대조 전환을 승인했습니다.</w:t>
       </w:r>
     </w:p>
     <w:p>
       <w:pPr>
         <w:keepNext w:val="0"/>
         <w:keepLines/>
+        <w:spacing w:line="270" w:lineRule="exact" w:before="0" w:after="40"/>
       </w:pPr>
       <w:r>
         <w:rPr>
           <w:b/>
+          <w:sz w:val="22"/>
         </w:rPr>
         <w:t xml:space="preserve">결과 · </w:t>
       </w:r>
       <w:r>
-        <w:t>팀이 웹서비스를 배포했고 본인이 작성한 기본 수집 코드 이력이 남아 있습니다. 실사용 테스트·이용자 수·투자 효과는 측정하지 못했습니다.</w:t>
+        <w:rPr>
+          <w:color w:val="000000"/>
+          <w:sz w:val="22"/>
+        </w:rPr>
+        <w:t>철수 안내를 담은 홈·공약 목록 화면. 후속 코드·테스트는 AI 보조이며 모델·사용자 효과는 미확정입니다.</w:t>
       </w:r>
     </w:p>
     <w:p>
       <w:pPr>
-        <w:pStyle w:val="Heading3"/>
+        <w:pStyle w:val="Heading2"/>
         <w:keepNext/>
+        <w:keepLines/>
+        <w:spacing w:line="270" w:lineRule="exact" w:before="80" w:after="20"/>
       </w:pPr>
       <w:r>
-        <w:t>NCA 공약·공식자료 대조 경기청년 갭이어</w:t>
+        <w:rPr>
+          <w:b/>
+          <w:color w:val="000000"/>
+          <w:sz w:val="22"/>
+        </w:rPr>
+        <w:t>양주 광역버스 좌석 정보</w:t>
       </w:r>
     </w:p>
     <w:p>
       <w:pPr>
         <w:keepNext/>
         <w:keepLines/>
+        <w:spacing w:line="270" w:lineRule="exact" w:before="0" w:after="40"/>
       </w:pPr>
       <w:r>
         <w:rPr>
-          <w:sz w:val="20"/>
+          <w:color w:val="000000"/>
+          <w:sz w:val="21"/>
         </w:rPr>
-        <w:t>2025-2026</w:t>
+        <w:t>2026 · 진행 중 · 응답 명세 작성 · 원천 대조 · AI 구현 검토</w:t>
       </w:r>
     </w:p>
     <w:p>
       <w:pPr>
         <w:keepNext/>
         <w:keepLines/>
+        <w:spacing w:line="270" w:lineRule="exact" w:before="0" w:after="40"/>
       </w:pPr>
       <w:r>
         <w:rPr>
-          <w:b/>
+          <w:color w:val="000000"/>
+          <w:sz w:val="22"/>
         </w:rPr>
-        <w:t xml:space="preserve">목표 · </w:t>
-      </w:r>
-      <w:r>
-        <w:t>공약과 연결 자료의 원문 근거를 확인하는 흐름</w:t>
-        <w:br/>
-      </w:r>
-      <w:r>
-        <w:rPr>
-          <w:b/>
-        </w:rPr>
-        <w:t xml:space="preserve">내 역할 · </w:t>
-      </w:r>
-      <w:r>
-        <w:t>2025 데이터 엔지니어링, 2026 AI 결과·공개 기준 검토·승인</w:t>
-      </w:r>
-    </w:p>
-    <w:p>
-      <w:pPr>
-        <w:keepNext/>
-        <w:keepLines/>
-      </w:pPr>
-      <w:r>
-        <w:rPr>
-          <w:b/>
-        </w:rPr>
-        <w:t xml:space="preserve">구체 행동 · </w:t>
-      </w:r>
-      <w:r>
-        <w:t>2025년 수집·전처리·파이프라인·인프라를 맡고 뉴스 크롤러와 Gemini API 공약 PDF 파서를 작성했습니다. 저장 내용과 기사·PDF 원문을 비교했습니다. 2026년에는 AI 작업 결과를 검토해 평가 수치 공개 중단과 자료 대조 전환을 승인했습니다.</w:t>
-      </w:r>
-    </w:p>
-    <w:p>
-      <w:pPr>
-        <w:keepNext/>
-        <w:keepLines/>
-      </w:pPr>
-      <w:r>
-        <w:rPr>
-          <w:b/>
-        </w:rPr>
-        <w:t xml:space="preserve">도구와 협업 · </w:t>
-      </w:r>
-      <w:r>
-        <w:rPr>
-          <w:sz w:val="21"/>
-        </w:rPr>
-        <w:t>Python · Gemini API · 원문 대조. 후속 코드·테스트는 AI 협업입니다.</w:t>
+        <w:t>좌석 0·정보 미제공·수집 실패와 관측 시각을 구분하는 응답 기준을 작성했습니다. 저장 관측·HTTP 응답을 원천 데이터와 대조했습니다.</w:t>
       </w:r>
     </w:p>
     <w:p>
       <w:pPr>
         <w:keepNext w:val="0"/>
         <w:keepLines/>
+        <w:spacing w:line="270" w:lineRule="exact" w:before="0" w:after="40"/>
       </w:pPr>
       <w:r>
         <w:rPr>
           <w:b/>
+          <w:sz w:val="22"/>
         </w:rPr>
         <w:t xml:space="preserve">결과 · </w:t>
       </w:r>
       <w:r>
-        <w:t>평가 수치 공개 중단 기록과 철수 사유를 안내하는 홈·공약 목록 화면이 남아 있습니다. 자료 대조 화면·공개 응답 변경의 코드·테스트는 AI 보조입니다. 모델·사용자 효과는 미확정입니다.</w:t>
+        <w:rPr>
+          <w:color w:val="000000"/>
+          <w:sz w:val="22"/>
+        </w:rPr>
+        <w:t>정류장 4곳·노선/방향 매핑 6건의 검증 기록과 로컬 API. 팀 통합·공개 배포는 진행 전입니다.</w:t>
       </w:r>
     </w:p>
     <w:p>
       <w:pPr>
-        <w:pStyle w:val="Heading3"/>
-        <w:keepNext/>
-      </w:pPr>
-      <w:r>
-        <w:t>양주 광역버스 좌석 정보 양주시 미래인재 AI 공모전</w:t>
-      </w:r>
-    </w:p>
-    <w:p>
-      <w:pPr>
+        <w:pStyle w:val="Heading2"/>
         <w:keepNext/>
         <w:keepLines/>
-      </w:pPr>
-      <w:r>
-        <w:rPr>
-          <w:sz w:val="20"/>
-        </w:rPr>
-        <w:t>2026 · 진행 중</w:t>
-      </w:r>
-    </w:p>
-    <w:p>
-      <w:pPr>
-        <w:keepNext/>
-        <w:keepLines/>
+        <w:spacing w:line="270" w:lineRule="exact" w:before="80" w:after="20"/>
       </w:pPr>
       <w:r>
         <w:rPr>
           <w:b/>
+          <w:color w:val="000000"/>
+          <w:sz w:val="22"/>
         </w:rPr>
-        <w:t xml:space="preserve">목표 · </w:t>
-      </w:r>
-      <w:r>
-        <w:t>현재 좌석·도착 예정 정보를 관측 근거와 함께 전달</w:t>
-        <w:br/>
-      </w:r>
-      <w:r>
-        <w:rPr>
-          <w:b/>
-        </w:rPr>
-        <w:t xml:space="preserve">내 역할 · </w:t>
-      </w:r>
-      <w:r>
-        <w:t>데이터·API 기준 작성, 원천·응답 대조와 AI 구현 검토</w:t>
-      </w:r>
-    </w:p>
-    <w:p>
-      <w:pPr>
-        <w:keepNext/>
-        <w:keepLines/>
-      </w:pPr>
-      <w:r>
-        <w:rPr>
-          <w:b/>
-        </w:rPr>
-        <w:t xml:space="preserve">구체 행동 · </w:t>
-      </w:r>
-      <w:r>
-        <w:t>좌석 0·정보 미제공·수집 실패를 구분하고 값·수집 시각·최신성 기준을 명세에 담았습니다. 근거가 없는 예측값은 null로 남겼습니다. 정류장 4곳의 노선·방향 매핑 6건과 저장 관측·과거 HTTP 응답을 대조했습니다.</w:t>
-      </w:r>
-    </w:p>
-    <w:p>
-      <w:pPr>
-        <w:keepNext/>
-        <w:keepLines/>
-      </w:pPr>
-      <w:r>
-        <w:rPr>
-          <w:b/>
-        </w:rPr>
-        <w:t xml:space="preserve">도구와 협업 · </w:t>
-      </w:r>
-      <w:r>
-        <w:rPr>
-          <w:sz w:val="21"/>
-        </w:rPr>
-        <w:t>SQLite 로컬 API·요청/응답 명세·DB 설계 검토. 코드·테스트는 AI 협업입니다.</w:t>
-      </w:r>
-    </w:p>
-    <w:p>
-      <w:pPr>
-        <w:keepNext w:val="0"/>
-        <w:keepLines/>
-      </w:pPr>
-      <w:r>
-        <w:rPr>
-          <w:b/>
-        </w:rPr>
-        <w:t xml:space="preserve">결과 · </w:t>
-      </w:r>
-      <w:r>
-        <w:t>응답 명세·매핑 6건·저장 관측을 읽는 로컬 API와 과거 검증 기록이 남아 있습니다. 팀 통합·예측 성능 평가·공개 배포는 진행 전입니다.</w:t>
-      </w:r>
-    </w:p>
-    <w:p>
-      <w:pPr>
-        <w:pStyle w:val="Heading3"/>
-        <w:keepNext/>
-      </w:pPr>
-      <w:r>
         <w:t>Dear Log 캡스톤 디자인</w:t>
       </w:r>
     </w:p>
@@ -1256,101 +799,64 @@
       <w:pPr>
         <w:keepNext/>
         <w:keepLines/>
+        <w:spacing w:line="270" w:lineRule="exact" w:before="0" w:after="40"/>
       </w:pPr>
       <w:r>
         <w:rPr>
-          <w:sz w:val="20"/>
+          <w:color w:val="000000"/>
+          <w:sz w:val="21"/>
         </w:rPr>
-        <w:t>2026 · 7~9월은 별도 후속 활동</w:t>
+        <w:t>2026 · 학기 6인 팀 · 학기 자료의 백엔드 담당 기록 · 6월 개발 총괄 배정</w:t>
       </w:r>
     </w:p>
     <w:p>
       <w:pPr>
         <w:keepNext/>
         <w:keepLines/>
+        <w:spacing w:line="270" w:lineRule="exact" w:before="0" w:after="40"/>
       </w:pPr>
       <w:r>
         <w:rPr>
-          <w:b/>
+          <w:color w:val="000000"/>
+          <w:sz w:val="22"/>
         </w:rPr>
-        <w:t xml:space="preserve">목표 · </w:t>
-      </w:r>
-      <w:r>
-        <w:t>가족 기억을 인터뷰하고 자서전 PDF로 만드는 서비스</w:t>
-        <w:br/>
-      </w:r>
-      <w:r>
-        <w:rPr>
-          <w:b/>
-        </w:rPr>
-        <w:t xml:space="preserve">내 역할 · </w:t>
-      </w:r>
-      <w:r>
-        <w:t>학기 자료에 백엔드·AI 에이전트 담당으로 기록, 6월 개발 총괄 배정</w:t>
-      </w:r>
-    </w:p>
-    <w:p>
-      <w:pPr>
-        <w:keepNext/>
-        <w:keepLines/>
-      </w:pPr>
-      <w:r>
-        <w:rPr>
-          <w:b/>
-        </w:rPr>
-        <w:t xml:space="preserve">구체 행동 · </w:t>
-      </w:r>
-      <w:r>
-        <w:t>학기 회의 자료에 백엔드 연결·에이전트 흐름 담당으로 기록됐습니다. 데모의 글자 잘림·줄바꿈·동의 설정·모바일 문제를 위치와 수정 방향이 담긴 요청 10건으로 전달했습니다. PM·UI/UX·에이전트 개발은 팀원이 분담했습니다. 목적별 동의 5종은 현재 팀 설계 자료입니다.</w:t>
-      </w:r>
-    </w:p>
-    <w:p>
-      <w:pPr>
-        <w:keepNext/>
-        <w:keepLines/>
-      </w:pPr>
-      <w:r>
-        <w:rPr>
-          <w:b/>
-        </w:rPr>
-        <w:t xml:space="preserve">도구와 협업 · </w:t>
-      </w:r>
-      <w:r>
-        <w:rPr>
-          <w:sz w:val="21"/>
-        </w:rPr>
-        <w:t>데모 검토·변경 요청 문서·팀 설계 자료. 7~9월 구현·검토는 AI 협업으로 구분합니다.</w:t>
+        <w:t>데모의 글자 잘림·동의 설정·모바일 문제를 위치와 수정 방향이 담긴 요청 10건으로 전달했습니다.</w:t>
       </w:r>
     </w:p>
     <w:p>
       <w:pPr>
         <w:keepNext w:val="0"/>
         <w:keepLines/>
+        <w:spacing w:line="270" w:lineRule="exact" w:before="0" w:after="40"/>
       </w:pPr>
       <w:r>
         <w:rPr>
           <w:b/>
+          <w:sz w:val="22"/>
         </w:rPr>
         <w:t xml:space="preserve">결과 · </w:t>
       </w:r>
       <w:r>
-        <w:t>본인 명의 데모 검토 요청 10건에 팀의 완료 표시가 남아 있습니다. 개인 수정 건수와 항목별 재검증은 확인되지 않았습니다.</w:t>
+        <w:rPr>
+          <w:color w:val="000000"/>
+          <w:sz w:val="22"/>
+        </w:rPr>
+        <w:t>본인 명의 요청 10건에 팀 완료 표시. 개인 수정 건수·개선 효과로 합산하지 않습니다.</w:t>
       </w:r>
     </w:p>
     <w:p>
       <w:pPr>
         <w:pStyle w:val="Heading2"/>
+        <w:keepNext/>
+        <w:keepLines/>
+        <w:spacing w:line="270" w:lineRule="exact" w:before="80" w:after="20"/>
       </w:pPr>
       <w:r>
-        <w:t>프로젝트·연구</w:t>
-      </w:r>
-    </w:p>
-    <w:p>
-      <w:pPr>
-        <w:pStyle w:val="Heading3"/>
-        <w:keepNext/>
-      </w:pPr>
-      <w:r>
+        <w:rPr>
+          <w:b/>
+          <w:color w:val="000000"/>
+          <w:sz w:val="22"/>
+        </w:rPr>
         <w:t>온통청년 경기청년 연구 랩업</w:t>
       </w:r>
     </w:p>
@@ -1358,101 +864,64 @@
       <w:pPr>
         <w:keepNext/>
         <w:keepLines/>
+        <w:spacing w:line="270" w:lineRule="exact" w:before="0" w:after="40"/>
       </w:pPr>
       <w:r>
         <w:rPr>
-          <w:sz w:val="20"/>
+          <w:color w:val="000000"/>
+          <w:sz w:val="21"/>
         </w:rPr>
-        <w:t>2025 · 전체 시작·종료일 확인 필요</w:t>
+        <w:t>2025 · 3인 팀 · 팀장 · 서버·교통 데이터 · 보고서 초안</w:t>
       </w:r>
     </w:p>
     <w:p>
       <w:pPr>
         <w:keepNext/>
         <w:keepLines/>
+        <w:spacing w:line="270" w:lineRule="exact" w:before="0" w:after="40"/>
       </w:pPr>
       <w:r>
         <w:rPr>
-          <w:b/>
+          <w:color w:val="000000"/>
+          <w:sz w:val="22"/>
         </w:rPr>
-        <w:t xml:space="preserve">목표 · </w:t>
-      </w:r>
-      <w:r>
-        <w:t>청년 문화·여가 시설 접근성 격차와 투자 방향 분석</w:t>
-        <w:br/>
-      </w:r>
-      <w:r>
-        <w:rPr>
-          <w:b/>
-        </w:rPr>
-        <w:t xml:space="preserve">내 역할 · </w:t>
-      </w:r>
-      <w:r>
-        <w:t>3인 팀 팀장·서버·교통 데이터 담당, 보고서·제언 초안 작성</w:t>
-      </w:r>
-    </w:p>
-    <w:p>
-      <w:pPr>
-        <w:keepNext/>
-        <w:keepLines/>
-      </w:pPr>
-      <w:r>
-        <w:rPr>
-          <w:b/>
-        </w:rPr>
-        <w:t xml:space="preserve">구체 행동 · </w:t>
-      </w:r>
-      <w:r>
-        <w:t>버스·지하철 데이터와 서버 구성을 맡고 팀과 전처리·통합 현황을 논의했습니다. 청소년·민간 시설 포함을 제안하고 일정에 맞춰 의정부·과천을 우선 검토하도록 조정했습니다. 공동 분석으로 보고서·제언 초안을 쓰고 Claude로 문장을 다듬었습니다. 시설 정제는 팀원이 맡았습니다.</w:t>
-      </w:r>
-    </w:p>
-    <w:p>
-      <w:pPr>
-        <w:keepNext/>
-        <w:keepLines/>
-      </w:pPr>
-      <w:r>
-        <w:rPr>
-          <w:b/>
-        </w:rPr>
-        <w:t xml:space="preserve">도구와 협업 · </w:t>
-      </w:r>
-      <w:r>
-        <w:rPr>
-          <w:sz w:val="21"/>
-        </w:rPr>
-        <w:t>교통·공공데이터·공동 보고서·Claude 문장 보조. 최종 보고서는 3인 공동 결과입니다.</w:t>
+        <w:t>시설 포함 범위를 제안하고 일정 지연 때 의정부·과천 우선 검토로 좁혔습니다. 팀 분석으로 보고서 초안을 쓰고 Claude로 문장을 다듬었습니다.</w:t>
       </w:r>
     </w:p>
     <w:p>
       <w:pPr>
         <w:keepNext w:val="0"/>
         <w:keepLines/>
+        <w:spacing w:line="270" w:lineRule="exact" w:before="0" w:after="40"/>
       </w:pPr>
       <w:r>
         <w:rPr>
           <w:b/>
+          <w:sz w:val="22"/>
         </w:rPr>
         <w:t xml:space="preserve">결과 · </w:t>
       </w:r>
       <w:r>
-        <w:t>팀은 2025년 경기청년 연구 랩업(Lab Up!) 대상을 수상했습니다. 정책 채택과 실제 접근성 개선 효과는 확인되지 않았습니다.</w:t>
+        <w:rPr>
+          <w:color w:val="000000"/>
+          <w:sz w:val="22"/>
+        </w:rPr>
+        <w:t>팀 대상 수상. 시설 정제는 팀원 담당, 최종 보고서는 3인 공동 결과입니다.</w:t>
       </w:r>
     </w:p>
     <w:p>
       <w:pPr>
         <w:pStyle w:val="Heading2"/>
+        <w:keepNext/>
+        <w:keepLines/>
+        <w:spacing w:line="270" w:lineRule="exact" w:before="80" w:after="20"/>
       </w:pPr>
       <w:r>
-        <w:t>콘텐츠 제작·공모전</w:t>
-      </w:r>
-    </w:p>
-    <w:p>
-      <w:pPr>
-        <w:pStyle w:val="Heading3"/>
-        <w:keepNext/>
-      </w:pPr>
-      <w:r>
+        <w:rPr>
+          <w:b/>
+          <w:color w:val="000000"/>
+          <w:sz w:val="22"/>
+        </w:rPr>
         <w:t>KBI 금융 AI 리터러시 카드뉴스</w:t>
       </w:r>
     </w:p>
@@ -1460,199 +929,64 @@
       <w:pPr>
         <w:keepNext/>
         <w:keepLines/>
+        <w:spacing w:line="270" w:lineRule="exact" w:before="0" w:after="40"/>
       </w:pPr>
       <w:r>
         <w:rPr>
-          <w:sz w:val="20"/>
+          <w:color w:val="000000"/>
+          <w:sz w:val="21"/>
         </w:rPr>
-        <w:t>2026 수상 · 제작 시작·종료일 확인 필요</w:t>
+        <w:t>2026 · RPG 카드뉴스 5장 기획 · 생성형 AI 활용</w:t>
       </w:r>
     </w:p>
     <w:p>
       <w:pPr>
         <w:keepNext/>
         <w:keepLines/>
+        <w:spacing w:line="270" w:lineRule="exact" w:before="0" w:after="40"/>
       </w:pPr>
       <w:r>
         <w:rPr>
-          <w:b/>
+          <w:color w:val="000000"/>
+          <w:sz w:val="22"/>
         </w:rPr>
-        <w:t xml:space="preserve">목표 · </w:t>
-      </w:r>
-      <w:r>
-        <w:t>금융 AI 리터러시를 5장 안에서 설명하고 시험 참여 안내</w:t>
-        <w:br/>
-      </w:r>
-      <w:r>
-        <w:rPr>
-          <w:b/>
-        </w:rPr>
-        <w:t xml:space="preserve">내 역할 · </w:t>
-      </w:r>
-      <w:r>
-        <w:t>RPG 카드뉴스 5장 기획·AI 활용</w:t>
-      </w:r>
-    </w:p>
-    <w:p>
-      <w:pPr>
-        <w:keepNext/>
-        <w:keepLines/>
-      </w:pPr>
-      <w:r>
-        <w:rPr>
-          <w:b/>
-        </w:rPr>
-        <w:t xml:space="preserve">구체 행동 · </w:t>
-      </w:r>
-      <w:r>
-        <w:t>NotebookLM에 공모전 정보 소스를 모으고 장별 헤드라인·텍스트·비주얼 컨셉을 기획했습니다. Gemini Gems로 나노바나나용 프롬프트를 만들고 이미지를 생성하는 흐름을 사용했습니다. 직접 편집·비교·최종 선정 범위는 확인 중입니다.</w:t>
-      </w:r>
-    </w:p>
-    <w:p>
-      <w:pPr>
-        <w:keepNext/>
-        <w:keepLines/>
-      </w:pPr>
-      <w:r>
-        <w:rPr>
-          <w:b/>
-        </w:rPr>
-        <w:t xml:space="preserve">도구와 협업 · </w:t>
-      </w:r>
-      <w:r>
-        <w:rPr>
-          <w:sz w:val="21"/>
-        </w:rPr>
-        <w:t>NotebookLM · Gemini Gems · 나노바나나. 프롬프트·이미지는 AI 산출물입니다.</w:t>
+        <w:t>NotebookLM 정보 정리→Gemini Gems 프롬프트→나노바나나 이미지 생성 흐름을 사용했습니다. 프롬프트·이미지는 AI 산출물입니다.</w:t>
       </w:r>
     </w:p>
     <w:p>
       <w:pPr>
         <w:keepNext w:val="0"/>
         <w:keepLines/>
+        <w:spacing w:line="270" w:lineRule="exact" w:before="0" w:after="40"/>
       </w:pPr>
       <w:r>
         <w:rPr>
           <w:b/>
+          <w:sz w:val="22"/>
         </w:rPr>
         <w:t xml:space="preserve">결과 · </w:t>
       </w:r>
       <w:r>
-        <w:t>2026년 KBI 금융 AI 리터러시 자격 홍보 콘텐츠 공모전 카드뉴스 인기상을 수상했습니다. 투표수·조회수·독자 이해도 개선은 확인하지 않았습니다. 최종 카드뉴스 5장 파일은 보완이 필요합니다.</w:t>
-      </w:r>
-    </w:p>
-    <w:p>
-      <w:pPr>
-        <w:pStyle w:val="Heading2"/>
-      </w:pPr>
-      <w:r>
-        <w:t>조직활동</w:t>
-      </w:r>
-    </w:p>
-    <w:p>
-      <w:pPr>
-        <w:pStyle w:val="Heading3"/>
-        <w:keepNext/>
-      </w:pPr>
-      <w:r>
-        <w:t>BAS 학과 축구 소모임</w:t>
-      </w:r>
-    </w:p>
-    <w:p>
-      <w:pPr>
-        <w:keepNext/>
-        <w:keepLines/>
-      </w:pPr>
-      <w:r>
         <w:rPr>
-          <w:sz w:val="20"/>
+          <w:color w:val="000000"/>
+          <w:sz w:val="22"/>
         </w:rPr>
-        <w:t>2020</w:t>
-      </w:r>
-    </w:p>
-    <w:p>
-      <w:pPr>
-        <w:keepNext/>
-        <w:keepLines/>
-      </w:pPr>
-      <w:r>
-        <w:rPr>
-          <w:b/>
-        </w:rPr>
-        <w:t xml:space="preserve">목표 · </w:t>
-      </w:r>
-      <w:r>
-        <w:t>활동 목표 원문 확인 필요</w:t>
-        <w:br/>
-      </w:r>
-      <w:r>
-        <w:rPr>
-          <w:b/>
-        </w:rPr>
-        <w:t xml:space="preserve">내 역할 · </w:t>
-      </w:r>
-      <w:r>
-        <w:t>소모임장</w:t>
-      </w:r>
-    </w:p>
-    <w:p>
-      <w:pPr>
-        <w:keepNext/>
-        <w:keepLines/>
-      </w:pPr>
-      <w:r>
-        <w:rPr>
-          <w:b/>
-        </w:rPr>
-        <w:t xml:space="preserve">구체 행동 · </w:t>
-      </w:r>
-      <w:r>
-        <w:t>소모임장 역할 기록이 있습니다. 직접 운영한 업무·도구·일정·협업 내역은 확인 필요입니다.</w:t>
-      </w:r>
-    </w:p>
-    <w:p>
-      <w:pPr>
-        <w:keepNext/>
-        <w:keepLines/>
-      </w:pPr>
-      <w:r>
-        <w:rPr>
-          <w:b/>
-        </w:rPr>
-        <w:t xml:space="preserve">도구와 협업 · </w:t>
-      </w:r>
-      <w:r>
-        <w:rPr>
-          <w:sz w:val="21"/>
-        </w:rPr>
-        <w:t>사용 도구·기록은 확인 필요입니다.</w:t>
-      </w:r>
-    </w:p>
-    <w:p>
-      <w:pPr>
-        <w:keepNext w:val="0"/>
-        <w:keepLines/>
-      </w:pPr>
-      <w:r>
-        <w:rPr>
-          <w:b/>
-        </w:rPr>
-        <w:t xml:space="preserve">결과 · </w:t>
-      </w:r>
-      <w:r>
-        <w:t>운영 결과와 결과물은 확인 필요입니다.</w:t>
-      </w:r>
-    </w:p>
-    <w:p>
-      <w:r>
-        <w:br w:type="page"/>
+        <w:t>2026 KBI 자격 홍보 콘텐츠 공모전 카드뉴스 인기상. 직접 편집·최종 선정 범위는 확인 중입니다.</w:t>
       </w:r>
     </w:p>
     <w:p>
       <w:pPr>
         <w:pStyle w:val="Heading1"/>
+        <w:keepNext/>
+        <w:keepLines/>
+        <w:spacing w:line="320" w:lineRule="exact" w:before="140" w:after="60"/>
       </w:pPr>
       <w:r>
+        <w:rPr>
+          <w:b/>
+          <w:color w:val="000000"/>
+          <w:sz w:val="26"/>
+        </w:rPr>
         <w:t>도구 활용 능력</w:t>
       </w:r>
     </w:p>
@@ -1660,1190 +994,107 @@
       <w:pPr>
         <w:keepNext w:val="0"/>
         <w:keepLines/>
+        <w:spacing w:line="270" w:lineRule="exact" w:before="0" w:after="40"/>
       </w:pPr>
       <w:r>
-        <w:t>수준은 기본 활용·실무 활용 가능·능숙 중 자기평가와 수행 근거를 대조한 뒤 확정할 항목입니다. 현재 기록만으로 등급을 정하지 않았습니다.</w:t>
+        <w:rPr>
+          <w:b/>
+          <w:sz w:val="22"/>
+        </w:rPr>
+        <w:t xml:space="preserve">Python · </w:t>
+      </w:r>
+      <w:r>
+        <w:rPr>
+          <w:color w:val="000000"/>
+          <w:sz w:val="22"/>
+        </w:rPr>
+        <w:t>Finsight 기본 수집 코드 · NCA 크롤러·PDF 파서 작성</w:t>
       </w:r>
     </w:p>
-    <w:tbl>
-      <w:tblPr>
-        <w:tblW w:type="auto" w:w="0"/>
-        <w:jc w:val="center"/>
-        <w:tblLayout w:type="fixed"/>
-        <w:tblLook w:firstColumn="1" w:firstRow="1" w:lastColumn="0" w:lastRow="0" w:noHBand="0" w:noVBand="1" w:val="04A0"/>
-      </w:tblPr>
-      <w:tblGrid>
-        <w:gridCol w:w="1644"/>
-        <w:gridCol w:w="1276"/>
-        <w:gridCol w:w="2976"/>
-        <w:gridCol w:w="3912"/>
-      </w:tblGrid>
-      <w:tr>
-        <w:trPr>
-          <w:tblHeader w:val="true"/>
-        </w:trPr>
-        <w:tc>
-          <w:tcPr>
-            <w:tcW w:type="dxa" w:w="1644"/>
-            <w:vAlign w:val="center"/>
-            <w:tcBorders>
-              <w:top w:val="single" w:sz="4" w:color="D9D9D9"/>
-              <w:left w:val="single" w:sz="4" w:color="D9D9D9"/>
-              <w:bottom w:val="single" w:sz="4" w:color="D9D9D9"/>
-              <w:right w:val="single" w:sz="4" w:color="D9D9D9"/>
-            </w:tcBorders>
-            <w:tcMar>
-              <w:top w:w="90" w:type="dxa"/>
-              <w:bottom w:w="90" w:type="dxa"/>
-              <w:left w:w="90" w:type="dxa"/>
-              <w:right w:w="90" w:type="dxa"/>
-            </w:tcMar>
-            <w:shd w:fill="EDF2FC"/>
-          </w:tcPr>
-          <w:p>
-            <w:pPr>
-              <w:spacing w:after="0" w:line="280" w:lineRule="exact"/>
-            </w:pPr>
-            <w:r>
-              <w:rPr>
-                <w:b/>
-                <w:color w:val="000000"/>
-                <w:sz w:val="21"/>
-              </w:rPr>
-              <w:t>도구명</w:t>
-            </w:r>
-          </w:p>
-        </w:tc>
-        <w:tc>
-          <w:tcPr>
-            <w:tcW w:type="dxa" w:w="1276"/>
-            <w:vAlign w:val="center"/>
-            <w:tcBorders>
-              <w:top w:val="single" w:sz="4" w:color="D9D9D9"/>
-              <w:left w:val="single" w:sz="4" w:color="D9D9D9"/>
-              <w:bottom w:val="single" w:sz="4" w:color="D9D9D9"/>
-              <w:right w:val="single" w:sz="4" w:color="D9D9D9"/>
-            </w:tcBorders>
-            <w:tcMar>
-              <w:top w:w="90" w:type="dxa"/>
-              <w:bottom w:w="90" w:type="dxa"/>
-              <w:left w:w="90" w:type="dxa"/>
-              <w:right w:w="90" w:type="dxa"/>
-            </w:tcMar>
-            <w:shd w:fill="EDF2FC"/>
-          </w:tcPr>
-          <w:p>
-            <w:pPr>
-              <w:spacing w:after="0" w:line="280" w:lineRule="exact"/>
-            </w:pPr>
-            <w:r>
-              <w:rPr>
-                <w:b/>
-                <w:color w:val="000000"/>
-                <w:sz w:val="21"/>
-              </w:rPr>
-              <w:t>수준</w:t>
-            </w:r>
-          </w:p>
-        </w:tc>
-        <w:tc>
-          <w:tcPr>
-            <w:tcW w:type="dxa" w:w="2976"/>
-            <w:vAlign w:val="center"/>
-            <w:tcBorders>
-              <w:top w:val="single" w:sz="4" w:color="D9D9D9"/>
-              <w:left w:val="single" w:sz="4" w:color="D9D9D9"/>
-              <w:bottom w:val="single" w:sz="4" w:color="D9D9D9"/>
-              <w:right w:val="single" w:sz="4" w:color="D9D9D9"/>
-            </w:tcBorders>
-            <w:tcMar>
-              <w:top w:w="90" w:type="dxa"/>
-              <w:bottom w:w="90" w:type="dxa"/>
-              <w:left w:w="90" w:type="dxa"/>
-              <w:right w:w="90" w:type="dxa"/>
-            </w:tcMar>
-            <w:shd w:fill="EDF2FC"/>
-          </w:tcPr>
-          <w:p>
-            <w:pPr>
-              <w:spacing w:after="0" w:line="280" w:lineRule="exact"/>
-            </w:pPr>
-            <w:r>
-              <w:rPr>
-                <w:b/>
-                <w:color w:val="000000"/>
-                <w:sz w:val="21"/>
-              </w:rPr>
-              <w:t>활용 내용</w:t>
-            </w:r>
-          </w:p>
-        </w:tc>
-        <w:tc>
-          <w:tcPr>
-            <w:tcW w:type="dxa" w:w="3912"/>
-            <w:vAlign w:val="center"/>
-            <w:tcBorders>
-              <w:top w:val="single" w:sz="4" w:color="D9D9D9"/>
-              <w:left w:val="single" w:sz="4" w:color="D9D9D9"/>
-              <w:bottom w:val="single" w:sz="4" w:color="D9D9D9"/>
-              <w:right w:val="single" w:sz="4" w:color="D9D9D9"/>
-            </w:tcBorders>
-            <w:tcMar>
-              <w:top w:w="90" w:type="dxa"/>
-              <w:bottom w:w="90" w:type="dxa"/>
-              <w:left w:w="90" w:type="dxa"/>
-              <w:right w:w="90" w:type="dxa"/>
-            </w:tcMar>
-            <w:shd w:fill="EDF2FC"/>
-          </w:tcPr>
-          <w:p>
-            <w:pPr>
-              <w:spacing w:after="0" w:line="280" w:lineRule="exact"/>
-            </w:pPr>
-            <w:r>
-              <w:rPr>
-                <w:b/>
-                <w:color w:val="000000"/>
-                <w:sz w:val="21"/>
-              </w:rPr>
-              <w:t>근거 경험과 결과물</w:t>
-            </w:r>
-          </w:p>
-        </w:tc>
-      </w:tr>
-      <w:tr>
-        <w:trPr>
-          <w:cantSplit/>
-        </w:trPr>
-        <w:tc>
-          <w:tcPr>
-            <w:tcW w:type="dxa" w:w="1644"/>
-            <w:vAlign w:val="center"/>
-            <w:tcBorders>
-              <w:top w:val="single" w:sz="4" w:color="D9D9D9"/>
-              <w:left w:val="single" w:sz="4" w:color="D9D9D9"/>
-              <w:bottom w:val="single" w:sz="4" w:color="D9D9D9"/>
-              <w:right w:val="single" w:sz="4" w:color="D9D9D9"/>
-            </w:tcBorders>
-            <w:tcMar>
-              <w:top w:w="90" w:type="dxa"/>
-              <w:bottom w:w="90" w:type="dxa"/>
-              <w:left w:w="90" w:type="dxa"/>
-              <w:right w:w="90" w:type="dxa"/>
-            </w:tcMar>
-          </w:tcPr>
-          <w:p>
-            <w:pPr>
-              <w:spacing w:after="0" w:line="280" w:lineRule="exact"/>
-            </w:pPr>
-            <w:r>
-              <w:rPr>
-                <w:b w:val="0"/>
-                <w:color w:val="000000"/>
-                <w:sz w:val="21"/>
-              </w:rPr>
-              <w:t>Python</w:t>
-            </w:r>
-          </w:p>
-        </w:tc>
-        <w:tc>
-          <w:tcPr>
-            <w:tcW w:type="dxa" w:w="1276"/>
-            <w:vAlign w:val="center"/>
-            <w:tcBorders>
-              <w:top w:val="single" w:sz="4" w:color="D9D9D9"/>
-              <w:left w:val="single" w:sz="4" w:color="D9D9D9"/>
-              <w:bottom w:val="single" w:sz="4" w:color="D9D9D9"/>
-              <w:right w:val="single" w:sz="4" w:color="D9D9D9"/>
-            </w:tcBorders>
-            <w:tcMar>
-              <w:top w:w="90" w:type="dxa"/>
-              <w:bottom w:w="90" w:type="dxa"/>
-              <w:left w:w="90" w:type="dxa"/>
-              <w:right w:w="90" w:type="dxa"/>
-            </w:tcMar>
-          </w:tcPr>
-          <w:p>
-            <w:pPr>
-              <w:spacing w:after="0" w:line="280" w:lineRule="exact"/>
-            </w:pPr>
-            <w:r>
-              <w:rPr>
-                <w:b w:val="0"/>
-                <w:color w:val="000000"/>
-                <w:sz w:val="21"/>
-              </w:rPr>
-              <w:t>수준 확인 필요</w:t>
-            </w:r>
-          </w:p>
-        </w:tc>
-        <w:tc>
-          <w:tcPr>
-            <w:tcW w:type="dxa" w:w="2976"/>
-            <w:vAlign w:val="center"/>
-            <w:tcBorders>
-              <w:top w:val="single" w:sz="4" w:color="D9D9D9"/>
-              <w:left w:val="single" w:sz="4" w:color="D9D9D9"/>
-              <w:bottom w:val="single" w:sz="4" w:color="D9D9D9"/>
-              <w:right w:val="single" w:sz="4" w:color="D9D9D9"/>
-            </w:tcBorders>
-            <w:tcMar>
-              <w:top w:w="90" w:type="dxa"/>
-              <w:bottom w:w="90" w:type="dxa"/>
-              <w:left w:w="90" w:type="dxa"/>
-              <w:right w:w="90" w:type="dxa"/>
-            </w:tcMar>
-          </w:tcPr>
-          <w:p>
-            <w:pPr>
-              <w:spacing w:after="0" w:line="280" w:lineRule="exact"/>
-            </w:pPr>
-            <w:r>
-              <w:rPr>
-                <w:b w:val="0"/>
-                <w:color w:val="000000"/>
-                <w:sz w:val="21"/>
-              </w:rPr>
-              <w:t>FnGuide·WiseReport 기본 수집, 뉴스 크롤러·Gemini API PDF 파서 작성</w:t>
-            </w:r>
-          </w:p>
-        </w:tc>
-        <w:tc>
-          <w:tcPr>
-            <w:tcW w:type="dxa" w:w="3912"/>
-            <w:vAlign w:val="center"/>
-            <w:tcBorders>
-              <w:top w:val="single" w:sz="4" w:color="D9D9D9"/>
-              <w:left w:val="single" w:sz="4" w:color="D9D9D9"/>
-              <w:bottom w:val="single" w:sz="4" w:color="D9D9D9"/>
-              <w:right w:val="single" w:sz="4" w:color="D9D9D9"/>
-            </w:tcBorders>
-            <w:tcMar>
-              <w:top w:w="90" w:type="dxa"/>
-              <w:bottom w:w="90" w:type="dxa"/>
-              <w:left w:w="90" w:type="dxa"/>
-              <w:right w:w="90" w:type="dxa"/>
-            </w:tcMar>
-          </w:tcPr>
-          <w:p>
-            <w:pPr>
-              <w:spacing w:after="0" w:line="280" w:lineRule="exact"/>
-            </w:pPr>
-            <w:r>
-              <w:rPr>
-                <w:b w:val="0"/>
-                <w:color w:val="000000"/>
-                <w:sz w:val="21"/>
-              </w:rPr>
-              <w:t>Finsight 2025 본인 코드 이력, NCA 2025 수집·파서 기록</w:t>
-            </w:r>
-          </w:p>
-        </w:tc>
-      </w:tr>
-      <w:tr>
-        <w:trPr>
-          <w:cantSplit/>
-        </w:trPr>
-        <w:tc>
-          <w:tcPr>
-            <w:tcW w:type="dxa" w:w="1644"/>
-            <w:vAlign w:val="center"/>
-            <w:tcBorders>
-              <w:top w:val="single" w:sz="4" w:color="D9D9D9"/>
-              <w:left w:val="single" w:sz="4" w:color="D9D9D9"/>
-              <w:bottom w:val="single" w:sz="4" w:color="D9D9D9"/>
-              <w:right w:val="single" w:sz="4" w:color="D9D9D9"/>
-            </w:tcBorders>
-            <w:tcMar>
-              <w:top w:w="90" w:type="dxa"/>
-              <w:bottom w:w="90" w:type="dxa"/>
-              <w:left w:w="90" w:type="dxa"/>
-              <w:right w:w="90" w:type="dxa"/>
-            </w:tcMar>
-          </w:tcPr>
-          <w:p>
-            <w:pPr>
-              <w:spacing w:after="0" w:line="280" w:lineRule="exact"/>
-            </w:pPr>
-            <w:r>
-              <w:rPr>
-                <w:b w:val="0"/>
-                <w:color w:val="000000"/>
-                <w:sz w:val="21"/>
-              </w:rPr>
-              <w:t>SQL · SQLite</w:t>
-            </w:r>
-          </w:p>
-        </w:tc>
-        <w:tc>
-          <w:tcPr>
-            <w:tcW w:type="dxa" w:w="1276"/>
-            <w:vAlign w:val="center"/>
-            <w:tcBorders>
-              <w:top w:val="single" w:sz="4" w:color="D9D9D9"/>
-              <w:left w:val="single" w:sz="4" w:color="D9D9D9"/>
-              <w:bottom w:val="single" w:sz="4" w:color="D9D9D9"/>
-              <w:right w:val="single" w:sz="4" w:color="D9D9D9"/>
-            </w:tcBorders>
-            <w:tcMar>
-              <w:top w:w="90" w:type="dxa"/>
-              <w:bottom w:w="90" w:type="dxa"/>
-              <w:left w:w="90" w:type="dxa"/>
-              <w:right w:w="90" w:type="dxa"/>
-            </w:tcMar>
-          </w:tcPr>
-          <w:p>
-            <w:pPr>
-              <w:spacing w:after="0" w:line="280" w:lineRule="exact"/>
-            </w:pPr>
-            <w:r>
-              <w:rPr>
-                <w:b w:val="0"/>
-                <w:color w:val="000000"/>
-                <w:sz w:val="21"/>
-              </w:rPr>
-              <w:t>수준 확인 필요</w:t>
-            </w:r>
-          </w:p>
-        </w:tc>
-        <w:tc>
-          <w:tcPr>
-            <w:tcW w:type="dxa" w:w="2976"/>
-            <w:vAlign w:val="center"/>
-            <w:tcBorders>
-              <w:top w:val="single" w:sz="4" w:color="D9D9D9"/>
-              <w:left w:val="single" w:sz="4" w:color="D9D9D9"/>
-              <w:bottom w:val="single" w:sz="4" w:color="D9D9D9"/>
-              <w:right w:val="single" w:sz="4" w:color="D9D9D9"/>
-            </w:tcBorders>
-            <w:tcMar>
-              <w:top w:w="90" w:type="dxa"/>
-              <w:bottom w:w="90" w:type="dxa"/>
-              <w:left w:w="90" w:type="dxa"/>
-              <w:right w:w="90" w:type="dxa"/>
-            </w:tcMar>
-          </w:tcPr>
-          <w:p>
-            <w:pPr>
-              <w:spacing w:after="0" w:line="280" w:lineRule="exact"/>
-            </w:pPr>
-            <w:r>
-              <w:rPr>
-                <w:b w:val="0"/>
-                <w:color w:val="000000"/>
-                <w:sz w:val="21"/>
-              </w:rPr>
-              <w:t>SQL 교육 내용, API·DB 설계 검토와 원천·응답 대조</w:t>
-            </w:r>
-          </w:p>
-        </w:tc>
-        <w:tc>
-          <w:tcPr>
-            <w:tcW w:type="dxa" w:w="3912"/>
-            <w:vAlign w:val="center"/>
-            <w:tcBorders>
-              <w:top w:val="single" w:sz="4" w:color="D9D9D9"/>
-              <w:left w:val="single" w:sz="4" w:color="D9D9D9"/>
-              <w:bottom w:val="single" w:sz="4" w:color="D9D9D9"/>
-              <w:right w:val="single" w:sz="4" w:color="D9D9D9"/>
-            </w:tcBorders>
-            <w:tcMar>
-              <w:top w:w="90" w:type="dxa"/>
-              <w:bottom w:w="90" w:type="dxa"/>
-              <w:left w:w="90" w:type="dxa"/>
-              <w:right w:w="90" w:type="dxa"/>
-            </w:tcMar>
-          </w:tcPr>
-          <w:p>
-            <w:pPr>
-              <w:spacing w:after="0" w:line="280" w:lineRule="exact"/>
-            </w:pPr>
-            <w:r>
-              <w:rPr>
-                <w:b w:val="0"/>
-                <w:color w:val="000000"/>
-                <w:sz w:val="21"/>
-              </w:rPr>
-              <w:t>데이터 엔지니어링 교육 기록, 양주 로컬 API 검토. SQL 직접 구현 범위는 미확정</w:t>
-            </w:r>
-          </w:p>
-        </w:tc>
-      </w:tr>
-      <w:tr>
-        <w:trPr>
-          <w:cantSplit/>
-        </w:trPr>
-        <w:tc>
-          <w:tcPr>
-            <w:tcW w:type="dxa" w:w="1644"/>
-            <w:vAlign w:val="center"/>
-            <w:tcBorders>
-              <w:top w:val="single" w:sz="4" w:color="D9D9D9"/>
-              <w:left w:val="single" w:sz="4" w:color="D9D9D9"/>
-              <w:bottom w:val="single" w:sz="4" w:color="D9D9D9"/>
-              <w:right w:val="single" w:sz="4" w:color="D9D9D9"/>
-            </w:tcBorders>
-            <w:tcMar>
-              <w:top w:w="90" w:type="dxa"/>
-              <w:bottom w:w="90" w:type="dxa"/>
-              <w:left w:w="90" w:type="dxa"/>
-              <w:right w:w="90" w:type="dxa"/>
-            </w:tcMar>
-          </w:tcPr>
-          <w:p>
-            <w:pPr>
-              <w:spacing w:after="0" w:line="280" w:lineRule="exact"/>
-            </w:pPr>
-            <w:r>
-              <w:rPr>
-                <w:b w:val="0"/>
-                <w:color w:val="000000"/>
-                <w:sz w:val="21"/>
-              </w:rPr>
-              <w:t>Figma</w:t>
-            </w:r>
-          </w:p>
-        </w:tc>
-        <w:tc>
-          <w:tcPr>
-            <w:tcW w:type="dxa" w:w="1276"/>
-            <w:vAlign w:val="center"/>
-            <w:tcBorders>
-              <w:top w:val="single" w:sz="4" w:color="D9D9D9"/>
-              <w:left w:val="single" w:sz="4" w:color="D9D9D9"/>
-              <w:bottom w:val="single" w:sz="4" w:color="D9D9D9"/>
-              <w:right w:val="single" w:sz="4" w:color="D9D9D9"/>
-            </w:tcBorders>
-            <w:tcMar>
-              <w:top w:w="90" w:type="dxa"/>
-              <w:bottom w:w="90" w:type="dxa"/>
-              <w:left w:w="90" w:type="dxa"/>
-              <w:right w:w="90" w:type="dxa"/>
-            </w:tcMar>
-          </w:tcPr>
-          <w:p>
-            <w:pPr>
-              <w:spacing w:after="0" w:line="280" w:lineRule="exact"/>
-            </w:pPr>
-            <w:r>
-              <w:rPr>
-                <w:b w:val="0"/>
-                <w:color w:val="000000"/>
-                <w:sz w:val="21"/>
-              </w:rPr>
-              <w:t>수준 확인 필요</w:t>
-            </w:r>
-          </w:p>
-        </w:tc>
-        <w:tc>
-          <w:tcPr>
-            <w:tcW w:type="dxa" w:w="2976"/>
-            <w:vAlign w:val="center"/>
-            <w:tcBorders>
-              <w:top w:val="single" w:sz="4" w:color="D9D9D9"/>
-              <w:left w:val="single" w:sz="4" w:color="D9D9D9"/>
-              <w:bottom w:val="single" w:sz="4" w:color="D9D9D9"/>
-              <w:right w:val="single" w:sz="4" w:color="D9D9D9"/>
-            </w:tcBorders>
-            <w:tcMar>
-              <w:top w:w="90" w:type="dxa"/>
-              <w:bottom w:w="90" w:type="dxa"/>
-              <w:left w:w="90" w:type="dxa"/>
-              <w:right w:w="90" w:type="dxa"/>
-            </w:tcMar>
-          </w:tcPr>
-          <w:p>
-            <w:pPr>
-              <w:spacing w:after="0" w:line="280" w:lineRule="exact"/>
-            </w:pPr>
-            <w:r>
-              <w:rPr>
-                <w:b w:val="0"/>
-                <w:color w:val="000000"/>
-                <w:sz w:val="21"/>
-              </w:rPr>
-              <w:t>기존 이력서의 사용 도구 기록. 직접 작업 범위는 확인 필요</w:t>
-            </w:r>
-          </w:p>
-        </w:tc>
-        <w:tc>
-          <w:tcPr>
-            <w:tcW w:type="dxa" w:w="3912"/>
-            <w:vAlign w:val="center"/>
-            <w:tcBorders>
-              <w:top w:val="single" w:sz="4" w:color="D9D9D9"/>
-              <w:left w:val="single" w:sz="4" w:color="D9D9D9"/>
-              <w:bottom w:val="single" w:sz="4" w:color="D9D9D9"/>
-              <w:right w:val="single" w:sz="4" w:color="D9D9D9"/>
-            </w:tcBorders>
-            <w:tcMar>
-              <w:top w:w="90" w:type="dxa"/>
-              <w:bottom w:w="90" w:type="dxa"/>
-              <w:left w:w="90" w:type="dxa"/>
-              <w:right w:w="90" w:type="dxa"/>
-            </w:tcMar>
-          </w:tcPr>
-          <w:p>
-            <w:pPr>
-              <w:spacing w:after="0" w:line="280" w:lineRule="exact"/>
-            </w:pPr>
-            <w:r>
-              <w:rPr>
-                <w:b w:val="0"/>
-                <w:color w:val="000000"/>
-                <w:sz w:val="21"/>
-              </w:rPr>
-              <w:t>본인이 작성한 파일·화면 원본 확인 필요</w:t>
-            </w:r>
-          </w:p>
-        </w:tc>
-      </w:tr>
-      <w:tr>
-        <w:trPr>
-          <w:cantSplit/>
-        </w:trPr>
-        <w:tc>
-          <w:tcPr>
-            <w:tcW w:type="dxa" w:w="1644"/>
-            <w:vAlign w:val="center"/>
-            <w:tcBorders>
-              <w:top w:val="single" w:sz="4" w:color="D9D9D9"/>
-              <w:left w:val="single" w:sz="4" w:color="D9D9D9"/>
-              <w:bottom w:val="single" w:sz="4" w:color="D9D9D9"/>
-              <w:right w:val="single" w:sz="4" w:color="D9D9D9"/>
-            </w:tcBorders>
-            <w:tcMar>
-              <w:top w:w="90" w:type="dxa"/>
-              <w:bottom w:w="90" w:type="dxa"/>
-              <w:left w:w="90" w:type="dxa"/>
-              <w:right w:w="90" w:type="dxa"/>
-            </w:tcMar>
-          </w:tcPr>
-          <w:p>
-            <w:pPr>
-              <w:spacing w:after="0" w:line="280" w:lineRule="exact"/>
-            </w:pPr>
-            <w:r>
-              <w:rPr>
-                <w:b w:val="0"/>
-                <w:color w:val="000000"/>
-                <w:sz w:val="21"/>
-              </w:rPr>
-              <w:t>한글 · Word</w:t>
-            </w:r>
-          </w:p>
-        </w:tc>
-        <w:tc>
-          <w:tcPr>
-            <w:tcW w:type="dxa" w:w="1276"/>
-            <w:vAlign w:val="center"/>
-            <w:tcBorders>
-              <w:top w:val="single" w:sz="4" w:color="D9D9D9"/>
-              <w:left w:val="single" w:sz="4" w:color="D9D9D9"/>
-              <w:bottom w:val="single" w:sz="4" w:color="D9D9D9"/>
-              <w:right w:val="single" w:sz="4" w:color="D9D9D9"/>
-            </w:tcBorders>
-            <w:tcMar>
-              <w:top w:w="90" w:type="dxa"/>
-              <w:bottom w:w="90" w:type="dxa"/>
-              <w:left w:w="90" w:type="dxa"/>
-              <w:right w:w="90" w:type="dxa"/>
-            </w:tcMar>
-          </w:tcPr>
-          <w:p>
-            <w:pPr>
-              <w:spacing w:after="0" w:line="280" w:lineRule="exact"/>
-            </w:pPr>
-            <w:r>
-              <w:rPr>
-                <w:b w:val="0"/>
-                <w:color w:val="000000"/>
-                <w:sz w:val="21"/>
-              </w:rPr>
-              <w:t>수준 확인 필요</w:t>
-            </w:r>
-          </w:p>
-        </w:tc>
-        <w:tc>
-          <w:tcPr>
-            <w:tcW w:type="dxa" w:w="2976"/>
-            <w:vAlign w:val="center"/>
-            <w:tcBorders>
-              <w:top w:val="single" w:sz="4" w:color="D9D9D9"/>
-              <w:left w:val="single" w:sz="4" w:color="D9D9D9"/>
-              <w:bottom w:val="single" w:sz="4" w:color="D9D9D9"/>
-              <w:right w:val="single" w:sz="4" w:color="D9D9D9"/>
-            </w:tcBorders>
-            <w:tcMar>
-              <w:top w:w="90" w:type="dxa"/>
-              <w:bottom w:w="90" w:type="dxa"/>
-              <w:left w:w="90" w:type="dxa"/>
-              <w:right w:w="90" w:type="dxa"/>
-            </w:tcMar>
-          </w:tcPr>
-          <w:p>
-            <w:pPr>
-              <w:spacing w:after="0" w:line="280" w:lineRule="exact"/>
-            </w:pPr>
-            <w:r>
-              <w:rPr>
-                <w:b w:val="0"/>
-                <w:color w:val="000000"/>
-                <w:sz w:val="21"/>
-              </w:rPr>
-              <w:t>기존 이력서의 사용 도구 기록. 문서별 도구 사용 내역은 확인 필요</w:t>
-            </w:r>
-          </w:p>
-        </w:tc>
-        <w:tc>
-          <w:tcPr>
-            <w:tcW w:type="dxa" w:w="3912"/>
-            <w:vAlign w:val="center"/>
-            <w:tcBorders>
-              <w:top w:val="single" w:sz="4" w:color="D9D9D9"/>
-              <w:left w:val="single" w:sz="4" w:color="D9D9D9"/>
-              <w:bottom w:val="single" w:sz="4" w:color="D9D9D9"/>
-              <w:right w:val="single" w:sz="4" w:color="D9D9D9"/>
-            </w:tcBorders>
-            <w:tcMar>
-              <w:top w:w="90" w:type="dxa"/>
-              <w:bottom w:w="90" w:type="dxa"/>
-              <w:left w:w="90" w:type="dxa"/>
-              <w:right w:w="90" w:type="dxa"/>
-            </w:tcMar>
-          </w:tcPr>
-          <w:p>
-            <w:pPr>
-              <w:spacing w:after="0" w:line="280" w:lineRule="exact"/>
-            </w:pPr>
-            <w:r>
-              <w:rPr>
-                <w:b w:val="0"/>
-                <w:color w:val="000000"/>
-                <w:sz w:val="21"/>
-              </w:rPr>
-              <w:t>온통청년 보고서 초안·BMW 보고서 작성 경험. 해당 도구별 원본은 확인 필요</w:t>
-            </w:r>
-          </w:p>
-        </w:tc>
-      </w:tr>
-      <w:tr>
-        <w:trPr>
-          <w:cantSplit/>
-        </w:trPr>
-        <w:tc>
-          <w:tcPr>
-            <w:tcW w:type="dxa" w:w="1644"/>
-            <w:vAlign w:val="center"/>
-            <w:tcBorders>
-              <w:top w:val="single" w:sz="4" w:color="D9D9D9"/>
-              <w:left w:val="single" w:sz="4" w:color="D9D9D9"/>
-              <w:bottom w:val="single" w:sz="4" w:color="D9D9D9"/>
-              <w:right w:val="single" w:sz="4" w:color="D9D9D9"/>
-            </w:tcBorders>
-            <w:tcMar>
-              <w:top w:w="90" w:type="dxa"/>
-              <w:bottom w:w="90" w:type="dxa"/>
-              <w:left w:w="90" w:type="dxa"/>
-              <w:right w:w="90" w:type="dxa"/>
-            </w:tcMar>
-          </w:tcPr>
-          <w:p>
-            <w:pPr>
-              <w:spacing w:after="0" w:line="280" w:lineRule="exact"/>
-            </w:pPr>
-            <w:r>
-              <w:rPr>
-                <w:b w:val="0"/>
-                <w:color w:val="000000"/>
-                <w:sz w:val="21"/>
-              </w:rPr>
-              <w:t>Excel · PowerPoint</w:t>
-            </w:r>
-          </w:p>
-        </w:tc>
-        <w:tc>
-          <w:tcPr>
-            <w:tcW w:type="dxa" w:w="1276"/>
-            <w:vAlign w:val="center"/>
-            <w:tcBorders>
-              <w:top w:val="single" w:sz="4" w:color="D9D9D9"/>
-              <w:left w:val="single" w:sz="4" w:color="D9D9D9"/>
-              <w:bottom w:val="single" w:sz="4" w:color="D9D9D9"/>
-              <w:right w:val="single" w:sz="4" w:color="D9D9D9"/>
-            </w:tcBorders>
-            <w:tcMar>
-              <w:top w:w="90" w:type="dxa"/>
-              <w:bottom w:w="90" w:type="dxa"/>
-              <w:left w:w="90" w:type="dxa"/>
-              <w:right w:w="90" w:type="dxa"/>
-            </w:tcMar>
-          </w:tcPr>
-          <w:p>
-            <w:pPr>
-              <w:spacing w:after="0" w:line="280" w:lineRule="exact"/>
-            </w:pPr>
-            <w:r>
-              <w:rPr>
-                <w:b w:val="0"/>
-                <w:color w:val="000000"/>
-                <w:sz w:val="21"/>
-              </w:rPr>
-              <w:t>수준 확인 필요</w:t>
-            </w:r>
-          </w:p>
-        </w:tc>
-        <w:tc>
-          <w:tcPr>
-            <w:tcW w:type="dxa" w:w="2976"/>
-            <w:vAlign w:val="center"/>
-            <w:tcBorders>
-              <w:top w:val="single" w:sz="4" w:color="D9D9D9"/>
-              <w:left w:val="single" w:sz="4" w:color="D9D9D9"/>
-              <w:bottom w:val="single" w:sz="4" w:color="D9D9D9"/>
-              <w:right w:val="single" w:sz="4" w:color="D9D9D9"/>
-            </w:tcBorders>
-            <w:tcMar>
-              <w:top w:w="90" w:type="dxa"/>
-              <w:bottom w:w="90" w:type="dxa"/>
-              <w:left w:w="90" w:type="dxa"/>
-              <w:right w:w="90" w:type="dxa"/>
-            </w:tcMar>
-          </w:tcPr>
-          <w:p>
-            <w:pPr>
-              <w:spacing w:after="0" w:line="280" w:lineRule="exact"/>
-            </w:pPr>
-            <w:r>
-              <w:rPr>
-                <w:b w:val="0"/>
-                <w:color w:val="000000"/>
-                <w:sz w:val="21"/>
-              </w:rPr>
-              <w:t>기존 이력서의 사용 도구 기록. 직접 편집·분석·발표 작업 범위는 확인 필요</w:t>
-            </w:r>
-          </w:p>
-        </w:tc>
-        <w:tc>
-          <w:tcPr>
-            <w:tcW w:type="dxa" w:w="3912"/>
-            <w:vAlign w:val="center"/>
-            <w:tcBorders>
-              <w:top w:val="single" w:sz="4" w:color="D9D9D9"/>
-              <w:left w:val="single" w:sz="4" w:color="D9D9D9"/>
-              <w:bottom w:val="single" w:sz="4" w:color="D9D9D9"/>
-              <w:right w:val="single" w:sz="4" w:color="D9D9D9"/>
-            </w:tcBorders>
-            <w:tcMar>
-              <w:top w:w="90" w:type="dxa"/>
-              <w:bottom w:w="90" w:type="dxa"/>
-              <w:left w:w="90" w:type="dxa"/>
-              <w:right w:w="90" w:type="dxa"/>
-            </w:tcMar>
-          </w:tcPr>
-          <w:p>
-            <w:pPr>
-              <w:spacing w:after="0" w:line="280" w:lineRule="exact"/>
-            </w:pPr>
-            <w:r>
-              <w:rPr>
-                <w:b w:val="0"/>
-                <w:color w:val="000000"/>
-                <w:sz w:val="21"/>
-              </w:rPr>
-              <w:t>Finsight Excel 내려받기 코드와 도구 조작 능력은 구분. 직접 파일 원본 확인 필요</w:t>
-            </w:r>
-          </w:p>
-        </w:tc>
-      </w:tr>
-      <w:tr>
-        <w:trPr>
-          <w:cantSplit/>
-        </w:trPr>
-        <w:tc>
-          <w:tcPr>
-            <w:tcW w:type="dxa" w:w="1644"/>
-            <w:vAlign w:val="center"/>
-            <w:tcBorders>
-              <w:top w:val="single" w:sz="4" w:color="D9D9D9"/>
-              <w:left w:val="single" w:sz="4" w:color="D9D9D9"/>
-              <w:bottom w:val="single" w:sz="4" w:color="D9D9D9"/>
-              <w:right w:val="single" w:sz="4" w:color="D9D9D9"/>
-            </w:tcBorders>
-            <w:tcMar>
-              <w:top w:w="90" w:type="dxa"/>
-              <w:bottom w:w="90" w:type="dxa"/>
-              <w:left w:w="90" w:type="dxa"/>
-              <w:right w:w="90" w:type="dxa"/>
-            </w:tcMar>
-          </w:tcPr>
-          <w:p>
-            <w:pPr>
-              <w:spacing w:after="0" w:line="280" w:lineRule="exact"/>
-            </w:pPr>
-            <w:r>
-              <w:rPr>
-                <w:b w:val="0"/>
-                <w:color w:val="000000"/>
-                <w:sz w:val="21"/>
-              </w:rPr>
-              <w:t>Gemini API</w:t>
-            </w:r>
-          </w:p>
-        </w:tc>
-        <w:tc>
-          <w:tcPr>
-            <w:tcW w:type="dxa" w:w="1276"/>
-            <w:vAlign w:val="center"/>
-            <w:tcBorders>
-              <w:top w:val="single" w:sz="4" w:color="D9D9D9"/>
-              <w:left w:val="single" w:sz="4" w:color="D9D9D9"/>
-              <w:bottom w:val="single" w:sz="4" w:color="D9D9D9"/>
-              <w:right w:val="single" w:sz="4" w:color="D9D9D9"/>
-            </w:tcBorders>
-            <w:tcMar>
-              <w:top w:w="90" w:type="dxa"/>
-              <w:bottom w:w="90" w:type="dxa"/>
-              <w:left w:w="90" w:type="dxa"/>
-              <w:right w:w="90" w:type="dxa"/>
-            </w:tcMar>
-          </w:tcPr>
-          <w:p>
-            <w:pPr>
-              <w:spacing w:after="0" w:line="280" w:lineRule="exact"/>
-            </w:pPr>
-            <w:r>
-              <w:rPr>
-                <w:b w:val="0"/>
-                <w:color w:val="000000"/>
-                <w:sz w:val="21"/>
-              </w:rPr>
-              <w:t>수준 확인 필요</w:t>
-            </w:r>
-          </w:p>
-        </w:tc>
-        <w:tc>
-          <w:tcPr>
-            <w:tcW w:type="dxa" w:w="2976"/>
-            <w:vAlign w:val="center"/>
-            <w:tcBorders>
-              <w:top w:val="single" w:sz="4" w:color="D9D9D9"/>
-              <w:left w:val="single" w:sz="4" w:color="D9D9D9"/>
-              <w:bottom w:val="single" w:sz="4" w:color="D9D9D9"/>
-              <w:right w:val="single" w:sz="4" w:color="D9D9D9"/>
-            </w:tcBorders>
-            <w:tcMar>
-              <w:top w:w="90" w:type="dxa"/>
-              <w:bottom w:w="90" w:type="dxa"/>
-              <w:left w:w="90" w:type="dxa"/>
-              <w:right w:w="90" w:type="dxa"/>
-            </w:tcMar>
-          </w:tcPr>
-          <w:p>
-            <w:pPr>
-              <w:spacing w:after="0" w:line="280" w:lineRule="exact"/>
-            </w:pPr>
-            <w:r>
-              <w:rPr>
-                <w:b w:val="0"/>
-                <w:color w:val="000000"/>
-                <w:sz w:val="21"/>
-              </w:rPr>
-              <w:t>공약 PDF 파서 작성과 추출 내용·원문 비교</w:t>
-            </w:r>
-          </w:p>
-        </w:tc>
-        <w:tc>
-          <w:tcPr>
-            <w:tcW w:type="dxa" w:w="3912"/>
-            <w:vAlign w:val="center"/>
-            <w:tcBorders>
-              <w:top w:val="single" w:sz="4" w:color="D9D9D9"/>
-              <w:left w:val="single" w:sz="4" w:color="D9D9D9"/>
-              <w:bottom w:val="single" w:sz="4" w:color="D9D9D9"/>
-              <w:right w:val="single" w:sz="4" w:color="D9D9D9"/>
-            </w:tcBorders>
-            <w:tcMar>
-              <w:top w:w="90" w:type="dxa"/>
-              <w:bottom w:w="90" w:type="dxa"/>
-              <w:left w:w="90" w:type="dxa"/>
-              <w:right w:w="90" w:type="dxa"/>
-            </w:tcMar>
-          </w:tcPr>
-          <w:p>
-            <w:pPr>
-              <w:spacing w:after="0" w:line="280" w:lineRule="exact"/>
-            </w:pPr>
-            <w:r>
-              <w:rPr>
-                <w:b w:val="0"/>
-                <w:color w:val="000000"/>
-                <w:sz w:val="21"/>
-              </w:rPr>
-              <w:t>NCA 2025 공약 PDF 파서 기록. 모델 정확도와 검수 규모는 미확정</w:t>
-            </w:r>
-          </w:p>
-        </w:tc>
-      </w:tr>
-      <w:tr>
-        <w:trPr>
-          <w:cantSplit/>
-        </w:trPr>
-        <w:tc>
-          <w:tcPr>
-            <w:tcW w:type="dxa" w:w="1644"/>
-            <w:vAlign w:val="center"/>
-            <w:tcBorders>
-              <w:top w:val="single" w:sz="4" w:color="D9D9D9"/>
-              <w:left w:val="single" w:sz="4" w:color="D9D9D9"/>
-              <w:bottom w:val="single" w:sz="4" w:color="D9D9D9"/>
-              <w:right w:val="single" w:sz="4" w:color="D9D9D9"/>
-            </w:tcBorders>
-            <w:tcMar>
-              <w:top w:w="90" w:type="dxa"/>
-              <w:bottom w:w="90" w:type="dxa"/>
-              <w:left w:w="90" w:type="dxa"/>
-              <w:right w:w="90" w:type="dxa"/>
-            </w:tcMar>
-          </w:tcPr>
-          <w:p>
-            <w:pPr>
-              <w:spacing w:after="0" w:line="280" w:lineRule="exact"/>
-            </w:pPr>
-            <w:r>
-              <w:rPr>
-                <w:b w:val="0"/>
-                <w:color w:val="000000"/>
-                <w:sz w:val="21"/>
-              </w:rPr>
-              <w:t>NotebookLM · Gemini Gems · 나노바나나</w:t>
-            </w:r>
-          </w:p>
-        </w:tc>
-        <w:tc>
-          <w:tcPr>
-            <w:tcW w:type="dxa" w:w="1276"/>
-            <w:vAlign w:val="center"/>
-            <w:tcBorders>
-              <w:top w:val="single" w:sz="4" w:color="D9D9D9"/>
-              <w:left w:val="single" w:sz="4" w:color="D9D9D9"/>
-              <w:bottom w:val="single" w:sz="4" w:color="D9D9D9"/>
-              <w:right w:val="single" w:sz="4" w:color="D9D9D9"/>
-            </w:tcBorders>
-            <w:tcMar>
-              <w:top w:w="90" w:type="dxa"/>
-              <w:bottom w:w="90" w:type="dxa"/>
-              <w:left w:w="90" w:type="dxa"/>
-              <w:right w:w="90" w:type="dxa"/>
-            </w:tcMar>
-          </w:tcPr>
-          <w:p>
-            <w:pPr>
-              <w:spacing w:after="0" w:line="280" w:lineRule="exact"/>
-            </w:pPr>
-            <w:r>
-              <w:rPr>
-                <w:b w:val="0"/>
-                <w:color w:val="000000"/>
-                <w:sz w:val="21"/>
-              </w:rPr>
-              <w:t>수준 확인 필요</w:t>
-            </w:r>
-          </w:p>
-        </w:tc>
-        <w:tc>
-          <w:tcPr>
-            <w:tcW w:type="dxa" w:w="2976"/>
-            <w:vAlign w:val="center"/>
-            <w:tcBorders>
-              <w:top w:val="single" w:sz="4" w:color="D9D9D9"/>
-              <w:left w:val="single" w:sz="4" w:color="D9D9D9"/>
-              <w:bottom w:val="single" w:sz="4" w:color="D9D9D9"/>
-              <w:right w:val="single" w:sz="4" w:color="D9D9D9"/>
-            </w:tcBorders>
-            <w:tcMar>
-              <w:top w:w="90" w:type="dxa"/>
-              <w:bottom w:w="90" w:type="dxa"/>
-              <w:left w:w="90" w:type="dxa"/>
-              <w:right w:w="90" w:type="dxa"/>
-            </w:tcMar>
-          </w:tcPr>
-          <w:p>
-            <w:pPr>
-              <w:spacing w:after="0" w:line="280" w:lineRule="exact"/>
-            </w:pPr>
-            <w:r>
-              <w:rPr>
-                <w:b w:val="0"/>
-                <w:color w:val="000000"/>
-                <w:sz w:val="21"/>
-              </w:rPr>
-              <w:t>정보 소스 정리·이미지 프롬프트·이미지 생성 흐름</w:t>
-            </w:r>
-          </w:p>
-        </w:tc>
-        <w:tc>
-          <w:tcPr>
-            <w:tcW w:type="dxa" w:w="3912"/>
-            <w:vAlign w:val="center"/>
-            <w:tcBorders>
-              <w:top w:val="single" w:sz="4" w:color="D9D9D9"/>
-              <w:left w:val="single" w:sz="4" w:color="D9D9D9"/>
-              <w:bottom w:val="single" w:sz="4" w:color="D9D9D9"/>
-              <w:right w:val="single" w:sz="4" w:color="D9D9D9"/>
-            </w:tcBorders>
-            <w:tcMar>
-              <w:top w:w="90" w:type="dxa"/>
-              <w:bottom w:w="90" w:type="dxa"/>
-              <w:left w:w="90" w:type="dxa"/>
-              <w:right w:w="90" w:type="dxa"/>
-            </w:tcMar>
-          </w:tcPr>
-          <w:p>
-            <w:pPr>
-              <w:spacing w:after="0" w:line="280" w:lineRule="exact"/>
-            </w:pPr>
-            <w:r>
-              <w:rPr>
-                <w:b w:val="0"/>
-                <w:color w:val="000000"/>
-                <w:sz w:val="21"/>
-              </w:rPr>
-              <w:t>KBI 5장 기획·제작 프롬프트 문서. 직접 편집·최종 선정 범위는 미확정</w:t>
-            </w:r>
-          </w:p>
-        </w:tc>
-      </w:tr>
-      <w:tr>
-        <w:trPr>
-          <w:cantSplit/>
-        </w:trPr>
-        <w:tc>
-          <w:tcPr>
-            <w:tcW w:type="dxa" w:w="1644"/>
-            <w:vAlign w:val="center"/>
-            <w:tcBorders>
-              <w:top w:val="single" w:sz="4" w:color="D9D9D9"/>
-              <w:left w:val="single" w:sz="4" w:color="D9D9D9"/>
-              <w:bottom w:val="single" w:sz="4" w:color="D9D9D9"/>
-              <w:right w:val="single" w:sz="4" w:color="D9D9D9"/>
-            </w:tcBorders>
-            <w:tcMar>
-              <w:top w:w="90" w:type="dxa"/>
-              <w:bottom w:w="90" w:type="dxa"/>
-              <w:left w:w="90" w:type="dxa"/>
-              <w:right w:w="90" w:type="dxa"/>
-            </w:tcMar>
-          </w:tcPr>
-          <w:p>
-            <w:pPr>
-              <w:spacing w:after="0" w:line="280" w:lineRule="exact"/>
-            </w:pPr>
-            <w:r>
-              <w:rPr>
-                <w:b w:val="0"/>
-                <w:color w:val="000000"/>
-                <w:sz w:val="21"/>
-              </w:rPr>
-              <w:t>Claude</w:t>
-            </w:r>
-          </w:p>
-        </w:tc>
-        <w:tc>
-          <w:tcPr>
-            <w:tcW w:type="dxa" w:w="1276"/>
-            <w:vAlign w:val="center"/>
-            <w:tcBorders>
-              <w:top w:val="single" w:sz="4" w:color="D9D9D9"/>
-              <w:left w:val="single" w:sz="4" w:color="D9D9D9"/>
-              <w:bottom w:val="single" w:sz="4" w:color="D9D9D9"/>
-              <w:right w:val="single" w:sz="4" w:color="D9D9D9"/>
-            </w:tcBorders>
-            <w:tcMar>
-              <w:top w:w="90" w:type="dxa"/>
-              <w:bottom w:w="90" w:type="dxa"/>
-              <w:left w:w="90" w:type="dxa"/>
-              <w:right w:w="90" w:type="dxa"/>
-            </w:tcMar>
-          </w:tcPr>
-          <w:p>
-            <w:pPr>
-              <w:spacing w:after="0" w:line="280" w:lineRule="exact"/>
-            </w:pPr>
-            <w:r>
-              <w:rPr>
-                <w:b w:val="0"/>
-                <w:color w:val="000000"/>
-                <w:sz w:val="21"/>
-              </w:rPr>
-              <w:t>수준 확인 필요</w:t>
-            </w:r>
-          </w:p>
-        </w:tc>
-        <w:tc>
-          <w:tcPr>
-            <w:tcW w:type="dxa" w:w="2976"/>
-            <w:vAlign w:val="center"/>
-            <w:tcBorders>
-              <w:top w:val="single" w:sz="4" w:color="D9D9D9"/>
-              <w:left w:val="single" w:sz="4" w:color="D9D9D9"/>
-              <w:bottom w:val="single" w:sz="4" w:color="D9D9D9"/>
-              <w:right w:val="single" w:sz="4" w:color="D9D9D9"/>
-            </w:tcBorders>
-            <w:tcMar>
-              <w:top w:w="90" w:type="dxa"/>
-              <w:bottom w:w="90" w:type="dxa"/>
-              <w:left w:w="90" w:type="dxa"/>
-              <w:right w:w="90" w:type="dxa"/>
-            </w:tcMar>
-          </w:tcPr>
-          <w:p>
-            <w:pPr>
-              <w:spacing w:after="0" w:line="280" w:lineRule="exact"/>
-            </w:pPr>
-            <w:r>
-              <w:rPr>
-                <w:b w:val="0"/>
-                <w:color w:val="000000"/>
-                <w:sz w:val="21"/>
-              </w:rPr>
-              <w:t>공동 연구 보고서의 문장 다듬기</w:t>
-            </w:r>
-          </w:p>
-        </w:tc>
-        <w:tc>
-          <w:tcPr>
-            <w:tcW w:type="dxa" w:w="3912"/>
-            <w:vAlign w:val="center"/>
-            <w:tcBorders>
-              <w:top w:val="single" w:sz="4" w:color="D9D9D9"/>
-              <w:left w:val="single" w:sz="4" w:color="D9D9D9"/>
-              <w:bottom w:val="single" w:sz="4" w:color="D9D9D9"/>
-              <w:right w:val="single" w:sz="4" w:color="D9D9D9"/>
-            </w:tcBorders>
-            <w:tcMar>
-              <w:top w:w="90" w:type="dxa"/>
-              <w:bottom w:w="90" w:type="dxa"/>
-              <w:left w:w="90" w:type="dxa"/>
-              <w:right w:w="90" w:type="dxa"/>
-            </w:tcMar>
-          </w:tcPr>
-          <w:p>
-            <w:pPr>
-              <w:spacing w:after="0" w:line="280" w:lineRule="exact"/>
-            </w:pPr>
-            <w:r>
-              <w:rPr>
-                <w:b w:val="0"/>
-                <w:color w:val="000000"/>
-                <w:sz w:val="21"/>
-              </w:rPr>
-              <w:t>온통청년 초안·공동 보고서. 팀 분석과 AI 문장 보조를 구분</w:t>
-            </w:r>
-          </w:p>
-        </w:tc>
-      </w:tr>
-    </w:tbl>
+    <w:p>
+      <w:pPr>
+        <w:keepNext w:val="0"/>
+        <w:keepLines/>
+        <w:spacing w:line="270" w:lineRule="exact" w:before="0" w:after="40"/>
+      </w:pPr>
+      <w:r>
+        <w:rPr>
+          <w:b/>
+          <w:sz w:val="22"/>
+        </w:rPr>
+        <w:t xml:space="preserve">SQL · </w:t>
+      </w:r>
+      <w:r>
+        <w:rPr>
+          <w:color w:val="000000"/>
+          <w:sz w:val="22"/>
+        </w:rPr>
+        <w:t>데이터 엔지니어링 교육 · API·DB 설계 검토</w:t>
+      </w:r>
+    </w:p>
+    <w:p>
+      <w:pPr>
+        <w:keepNext w:val="0"/>
+        <w:keepLines/>
+        <w:spacing w:line="270" w:lineRule="exact" w:before="0" w:after="40"/>
+      </w:pPr>
+      <w:r>
+        <w:rPr>
+          <w:b/>
+          <w:sz w:val="22"/>
+        </w:rPr>
+        <w:t xml:space="preserve">Gemini API · </w:t>
+      </w:r>
+      <w:r>
+        <w:rPr>
+          <w:color w:val="000000"/>
+          <w:sz w:val="22"/>
+        </w:rPr>
+        <w:t>NCA 공약 PDF 파서와 원문 대조</w:t>
+      </w:r>
+    </w:p>
+    <w:p>
+      <w:pPr>
+        <w:keepNext w:val="0"/>
+        <w:keepLines/>
+        <w:spacing w:line="270" w:lineRule="exact" w:before="0" w:after="40"/>
+      </w:pPr>
+      <w:r>
+        <w:rPr>
+          <w:b/>
+          <w:sz w:val="22"/>
+        </w:rPr>
+        <w:t xml:space="preserve">NotebookLM · Gemini Gems · 나노바나나 · </w:t>
+      </w:r>
+      <w:r>
+        <w:rPr>
+          <w:color w:val="000000"/>
+          <w:sz w:val="22"/>
+        </w:rPr>
+        <w:t>KBI 정보 정리·프롬프트·이미지 생성 흐름</w:t>
+      </w:r>
+    </w:p>
+    <w:p>
+      <w:pPr>
+        <w:keepNext w:val="0"/>
+        <w:keepLines/>
+        <w:spacing w:line="270" w:lineRule="exact" w:before="0" w:after="40"/>
+      </w:pPr>
+      <w:r>
+        <w:rPr>
+          <w:b/>
+          <w:sz w:val="22"/>
+        </w:rPr>
+        <w:t xml:space="preserve">Claude · </w:t>
+      </w:r>
+      <w:r>
+        <w:rPr>
+          <w:color w:val="000000"/>
+          <w:sz w:val="22"/>
+        </w:rPr>
+        <w:t>온통청년 공동 보고서 문장 다듬기</w:t>
+      </w:r>
+    </w:p>
     <w:sectPr>
       <w:footerReference w:type="default" r:id="rId13"/>
       <w:pgSz w:w="11906" w:h="16838"/>

</xml_diff>

<commit_message>
Update resume DOCX and PDF to match refocused portfolio
- New headline and two core strengths backed by Yangju, NCA, Finsight
- Projects reordered: Yangju, Finsight, Ontong, NCA, Dear Log, KBI
- Remove unverified-status phrasing; add sourced results
- PDF regenerated from DOCX with LibreOffice (tagged, 2 pages)

Co-Authored-By: Claude Opus 5.5 <noreply@anthropic.com>
</commit_message>
<xml_diff>
--- a/resume.docx
+++ b/resume.docx
@@ -78,7 +78,7 @@
           <w:color w:val="000000"/>
           <w:sz w:val="22"/>
         </w:rPr>
-        <w:t>화면과 데이터의 표시 기준을 정리하고, 팀의 일정과 범위를 조율합니다.</w:t>
+        <w:t>데이터가 말할 수 있는 것만 보여 주도록 서비스 범위를 정합니다.</w:t>
       </w:r>
     </w:p>
     <w:p>
@@ -197,7 +197,7 @@
           <w:color w:val="000000"/>
           <w:sz w:val="22"/>
         </w:rPr>
-        <w:t>화면과 응답 기준 작성</w:t>
+        <w:t>데이터 상태와 응답 기준 설계</w:t>
       </w:r>
     </w:p>
     <w:p>
@@ -211,7 +211,7 @@
           <w:color w:val="000000"/>
           <w:sz w:val="22"/>
         </w:rPr>
-        <w:t>사용자 역할과 값·상태·시각을 구분해 화면 정책·개발 명세로 정리합니다.</w:t>
+        <w:t>값·상태·시각을 구분해 응답 기준과 화면 정책으로 정리합니다.</w:t>
       </w:r>
     </w:p>
     <w:p>
@@ -232,7 +232,7 @@
           <w:color w:val="000000"/>
           <w:sz w:val="22"/>
         </w:rPr>
-        <w:t>Dear Log 데모 수정 요청 10건, 양주 관측·결측 명세와 매핑 6건 대조</w:t>
+        <w:t>양주 0석·정보 없음·빈 슬롯 구분과 오래된 정보(stale) 기준, Dear Log 데모 수정 요청 10건</w:t>
       </w:r>
     </w:p>
     <w:p>
@@ -248,7 +248,7 @@
           <w:color w:val="000000"/>
           <w:sz w:val="22"/>
         </w:rPr>
-        <w:t>팀 일정과 구현 문제 조율</w:t>
+        <w:t>공개 범위와 팀 역할 조율</w:t>
       </w:r>
     </w:p>
     <w:p>
@@ -262,7 +262,7 @@
           <w:color w:val="000000"/>
           <w:sz w:val="22"/>
         </w:rPr>
-        <w:t>일정·업무를 나누고 처리 문제를 유형별로 정리해 팀원·멘토와 대안을 검토합니다.</w:t>
+        <w:t>검수할 수 없는 수치는 공개하지 않도록 범위를 정하고, 팀원 강점에 맞춰 역할을 나눕니다.</w:t>
       </w:r>
     </w:p>
     <w:p>
@@ -283,7 +283,7 @@
           <w:color w:val="000000"/>
           <w:sz w:val="22"/>
         </w:rPr>
-        <w:t>Finsight 5인 팀 조율·PDF 문제 검토·팀 웹 배포, 온통청년 범위·우선순위 조정</w:t>
+        <w:t>NCA 평가 수치 공개 중단·자료 대조 전환 제안과 조건부 승인, Finsight 5인 팀 수집·파싱 역할 조정</w:t>
       </w:r>
     </w:p>
     <w:p>
@@ -597,6 +597,71 @@
           <w:color w:val="000000"/>
           <w:sz w:val="22"/>
         </w:rPr>
+        <w:t>양주 광역버스 좌석 정보</w:t>
+      </w:r>
+    </w:p>
+    <w:p>
+      <w:pPr>
+        <w:keepNext/>
+        <w:keepLines/>
+        <w:spacing w:line="270" w:lineRule="exact" w:before="0" w:after="40"/>
+      </w:pPr>
+      <w:r>
+        <w:rPr>
+          <w:color w:val="000000"/>
+          <w:sz w:val="21"/>
+        </w:rPr>
+        <w:t>2026 · 양주시 미래인재 AI 공모전 5인 팀 · 응답 기준 설계 · 원천 대조 · AI 구현 검토</w:t>
+      </w:r>
+    </w:p>
+    <w:p>
+      <w:pPr>
+        <w:keepNext/>
+        <w:keepLines/>
+        <w:spacing w:line="270" w:lineRule="exact" w:before="0" w:after="40"/>
+      </w:pPr>
+      <w:r>
+        <w:rPr>
+          <w:color w:val="000000"/>
+          <w:sz w:val="22"/>
+        </w:rPr>
+        <w:t>좌석 0·정보 없음·빈 슬롯을 나누고 수집 시각과 오래된 정보(stale) 기준을 정했습니다. 근거 없는 예측 확률은 null로 두었습니다.</w:t>
+      </w:r>
+    </w:p>
+    <w:p>
+      <w:pPr>
+        <w:keepNext w:val="0"/>
+        <w:keepLines/>
+        <w:spacing w:line="270" w:lineRule="exact" w:before="0" w:after="40"/>
+      </w:pPr>
+      <w:r>
+        <w:rPr>
+          <w:b/>
+          <w:sz w:val="22"/>
+        </w:rPr>
+        <w:t xml:space="preserve">결과 · </w:t>
+      </w:r>
+      <w:r>
+        <w:rPr>
+          <w:color w:val="000000"/>
+          <w:sz w:val="22"/>
+        </w:rPr>
+        <w:t>정류장 4곳·노선/방향 매핑 6건 대조와 로컬 API(코드·테스트는 AI 작성, 183건 통과). 팀 통합·배포 전.</w:t>
+      </w:r>
+    </w:p>
+    <w:p>
+      <w:pPr>
+        <w:pStyle w:val="Heading2"/>
+        <w:keepNext/>
+        <w:keepLines/>
+        <w:spacing w:line="270" w:lineRule="exact" w:before="80" w:after="20"/>
+      </w:pPr>
+      <w:r>
+        <w:rPr>
+          <w:b/>
+          <w:color w:val="000000"/>
+          <w:sz w:val="22"/>
+        </w:rPr>
         <w:t>Finsight ICT 한이음 드림업</w:t>
       </w:r>
     </w:p>
@@ -646,7 +711,72 @@
           <w:color w:val="000000"/>
           <w:sz w:val="22"/>
         </w:rPr>
-        <w:t>팀 웹서비스 배포 · 본인 수집 코드 기록. 사용자 테스트·이용 효과는 미측정입니다.</w:t>
+        <w:t>팀 웹서비스 배포 · 본인 수집 코드 기록. 2026 개인 재구축(AI 협업)에서 파서 선택·데이터 신뢰 규칙을 결정해 리포트 2,536건·종목 591개 수집.</w:t>
+      </w:r>
+    </w:p>
+    <w:p>
+      <w:pPr>
+        <w:pStyle w:val="Heading2"/>
+        <w:keepNext/>
+        <w:keepLines/>
+        <w:spacing w:line="270" w:lineRule="exact" w:before="80" w:after="20"/>
+      </w:pPr>
+      <w:r>
+        <w:rPr>
+          <w:b/>
+          <w:color w:val="000000"/>
+          <w:sz w:val="22"/>
+        </w:rPr>
+        <w:t>온통청년 경기청년 연구 랩업</w:t>
+      </w:r>
+    </w:p>
+    <w:p>
+      <w:pPr>
+        <w:keepNext/>
+        <w:keepLines/>
+        <w:spacing w:line="270" w:lineRule="exact" w:before="0" w:after="40"/>
+      </w:pPr>
+      <w:r>
+        <w:rPr>
+          <w:color w:val="000000"/>
+          <w:sz w:val="21"/>
+        </w:rPr>
+        <w:t>2025 · 3인 팀 · 팀장 · 서버·교통 데이터 · 보고서 초안</w:t>
+      </w:r>
+    </w:p>
+    <w:p>
+      <w:pPr>
+        <w:keepNext/>
+        <w:keepLines/>
+        <w:spacing w:line="270" w:lineRule="exact" w:before="0" w:after="40"/>
+      </w:pPr>
+      <w:r>
+        <w:rPr>
+          <w:color w:val="000000"/>
+          <w:sz w:val="22"/>
+        </w:rPr>
+        <w:t>시설 포함 범위를 제안하고 일정 지연 때 의정부·과천 우선 검토로 좁혔습니다. 팀 분석으로 보고서 초안을 쓰고 Claude로 문장을 다듬었습니다.</w:t>
+      </w:r>
+    </w:p>
+    <w:p>
+      <w:pPr>
+        <w:keepNext w:val="0"/>
+        <w:keepLines/>
+        <w:spacing w:line="270" w:lineRule="exact" w:before="0" w:after="40"/>
+      </w:pPr>
+      <w:r>
+        <w:rPr>
+          <w:b/>
+          <w:sz w:val="22"/>
+        </w:rPr>
+        <w:t xml:space="preserve">결과 · </w:t>
+      </w:r>
+      <w:r>
+        <w:rPr>
+          <w:color w:val="000000"/>
+          <w:sz w:val="22"/>
+        </w:rPr>
+        <w:t>2025 경기청년 연구 랩업 대상(팀). 시설 정제는 팀원, 최종 보고서는 3인 공동.</w:t>
       </w:r>
     </w:p>
     <w:p>
@@ -676,7 +806,7 @@
           <w:color w:val="000000"/>
           <w:sz w:val="21"/>
         </w:rPr>
-        <w:t>2025-2026 · 2025 데이터 엔지니어링 · 2026 AI 결과 검토·승인</w:t>
+        <w:t>2025-2026 · 2025 데이터 엔지니어링 · 2026 전환 제안·검토·승인(AI 협업 구현)</w:t>
       </w:r>
     </w:p>
     <w:p>
@@ -690,7 +820,7 @@
           <w:color w:val="000000"/>
           <w:sz w:val="22"/>
         </w:rPr>
-        <w:t>뉴스 크롤러와 Gemini API 공약 PDF 파서를 작성해 원문과 대조했습니다. 후속 AI 변경안을 검토하고 평가 수치 공개 중단·자료 대조 전환을 승인했습니다.</w:t>
+        <w:t>뉴스 크롤러와 Gemini API 공약 PDF 파서를 작성해 원문과 대조했습니다. 2026년에는 검수 병목을 근거로 평가 수치 공개 중단·자료 대조 전환을 제안하고 4개 조건을 붙여 승인했습니다.</w:t>
       </w:r>
     </w:p>
     <w:p>
@@ -711,72 +841,7 @@
           <w:color w:val="000000"/>
           <w:sz w:val="22"/>
         </w:rPr>
-        <w:t>철수 안내를 담은 홈·공약 목록 화면. 후속 코드·테스트는 AI 보조이며 모델·사용자 효과는 미확정입니다.</w:t>
-      </w:r>
-    </w:p>
-    <w:p>
-      <w:pPr>
-        <w:pStyle w:val="Heading2"/>
-        <w:keepNext/>
-        <w:keepLines/>
-        <w:spacing w:line="270" w:lineRule="exact" w:before="80" w:after="20"/>
-      </w:pPr>
-      <w:r>
-        <w:rPr>
-          <w:b/>
-          <w:color w:val="000000"/>
-          <w:sz w:val="22"/>
-        </w:rPr>
-        <w:t>양주 광역버스 좌석 정보</w:t>
-      </w:r>
-    </w:p>
-    <w:p>
-      <w:pPr>
-        <w:keepNext/>
-        <w:keepLines/>
-        <w:spacing w:line="270" w:lineRule="exact" w:before="0" w:after="40"/>
-      </w:pPr>
-      <w:r>
-        <w:rPr>
-          <w:color w:val="000000"/>
-          <w:sz w:val="21"/>
-        </w:rPr>
-        <w:t>2026 · 진행 중 · 응답 명세 작성 · 원천 대조 · AI 구현 검토</w:t>
-      </w:r>
-    </w:p>
-    <w:p>
-      <w:pPr>
-        <w:keepNext/>
-        <w:keepLines/>
-        <w:spacing w:line="270" w:lineRule="exact" w:before="0" w:after="40"/>
-      </w:pPr>
-      <w:r>
-        <w:rPr>
-          <w:color w:val="000000"/>
-          <w:sz w:val="22"/>
-        </w:rPr>
-        <w:t>좌석 0·정보 미제공·수집 실패와 관측 시각을 구분하는 응답 기준을 작성했습니다. 저장 관측·HTTP 응답을 원천 데이터와 대조했습니다.</w:t>
-      </w:r>
-    </w:p>
-    <w:p>
-      <w:pPr>
-        <w:keepNext w:val="0"/>
-        <w:keepLines/>
-        <w:spacing w:line="270" w:lineRule="exact" w:before="0" w:after="40"/>
-      </w:pPr>
-      <w:r>
-        <w:rPr>
-          <w:b/>
-          <w:sz w:val="22"/>
-        </w:rPr>
-        <w:t xml:space="preserve">결과 · </w:t>
-      </w:r>
-      <w:r>
-        <w:rPr>
-          <w:color w:val="000000"/>
-          <w:sz w:val="22"/>
-        </w:rPr>
-        <w:t>정류장 4곳·노선/방향 매핑 6건의 검증 기록과 로컬 API. 팀 통합·공개 배포는 진행 전입니다.</w:t>
+        <w:t>평가 수치 공개 중단·자료 대조 화면 전환. 공약·예산 매칭 정밀도 33%→89%(검증 표본 18건).</w:t>
       </w:r>
     </w:p>
     <w:p>
@@ -841,72 +906,7 @@
           <w:color w:val="000000"/>
           <w:sz w:val="22"/>
         </w:rPr>
-        <w:t>본인 명의 요청 10건에 팀 완료 표시. 개인 수정 건수·개선 효과로 합산하지 않습니다.</w:t>
-      </w:r>
-    </w:p>
-    <w:p>
-      <w:pPr>
-        <w:pStyle w:val="Heading2"/>
-        <w:keepNext/>
-        <w:keepLines/>
-        <w:spacing w:line="270" w:lineRule="exact" w:before="80" w:after="20"/>
-      </w:pPr>
-      <w:r>
-        <w:rPr>
-          <w:b/>
-          <w:color w:val="000000"/>
-          <w:sz w:val="22"/>
-        </w:rPr>
-        <w:t>온통청년 경기청년 연구 랩업</w:t>
-      </w:r>
-    </w:p>
-    <w:p>
-      <w:pPr>
-        <w:keepNext/>
-        <w:keepLines/>
-        <w:spacing w:line="270" w:lineRule="exact" w:before="0" w:after="40"/>
-      </w:pPr>
-      <w:r>
-        <w:rPr>
-          <w:color w:val="000000"/>
-          <w:sz w:val="21"/>
-        </w:rPr>
-        <w:t>2025 · 3인 팀 · 팀장 · 서버·교통 데이터 · 보고서 초안</w:t>
-      </w:r>
-    </w:p>
-    <w:p>
-      <w:pPr>
-        <w:keepNext/>
-        <w:keepLines/>
-        <w:spacing w:line="270" w:lineRule="exact" w:before="0" w:after="40"/>
-      </w:pPr>
-      <w:r>
-        <w:rPr>
-          <w:color w:val="000000"/>
-          <w:sz w:val="22"/>
-        </w:rPr>
-        <w:t>시설 포함 범위를 제안하고 일정 지연 때 의정부·과천 우선 검토로 좁혔습니다. 팀 분석으로 보고서 초안을 쓰고 Claude로 문장을 다듬었습니다.</w:t>
-      </w:r>
-    </w:p>
-    <w:p>
-      <w:pPr>
-        <w:keepNext w:val="0"/>
-        <w:keepLines/>
-        <w:spacing w:line="270" w:lineRule="exact" w:before="0" w:after="40"/>
-      </w:pPr>
-      <w:r>
-        <w:rPr>
-          <w:b/>
-          <w:sz w:val="22"/>
-        </w:rPr>
-        <w:t xml:space="preserve">결과 · </w:t>
-      </w:r>
-      <w:r>
-        <w:rPr>
-          <w:color w:val="000000"/>
-          <w:sz w:val="22"/>
-        </w:rPr>
-        <w:t>팀 대상 수상. 시설 정제는 팀원 담당, 최종 보고서는 3인 공동 결과입니다.</w:t>
+        <w:t>수정 요청 10건 모두 팀 완료 표시.</w:t>
       </w:r>
     </w:p>
     <w:p>
@@ -971,7 +971,7 @@
           <w:color w:val="000000"/>
           <w:sz w:val="22"/>
         </w:rPr>
-        <w:t>2026 KBI 자격 홍보 콘텐츠 공모전 카드뉴스 인기상. 직접 편집·최종 선정 범위는 확인 중입니다.</w:t>
+        <w:t>2026 KBI 자격 홍보 콘텐츠 공모전 카드뉴스 인기상.</w:t>
       </w:r>
     </w:p>
     <w:p>

</xml_diff>

<commit_message>
Align resume with featured cases: Ontong, NCA, Dear Log first; new headline
Co-Authored-By: Claude Opus 5.5 <noreply@anthropic.com>
</commit_message>
<xml_diff>
--- a/resume.docx
+++ b/resume.docx
@@ -78,7 +78,7 @@
           <w:color w:val="000000"/>
           <w:sz w:val="22"/>
         </w:rPr>
-        <w:t>데이터가 말할 수 있는 것만 보여 주도록 서비스 범위를 정합니다.</w:t>
+        <w:t>데이터가 말할 수 있는 것만, 사용자가 이해할 수 있게 보여 줍니다.</w:t>
       </w:r>
     </w:p>
     <w:p>
@@ -597,6 +597,201 @@
           <w:color w:val="000000"/>
           <w:sz w:val="22"/>
         </w:rPr>
+        <w:t>온통청년 경기청년 연구 랩업</w:t>
+      </w:r>
+    </w:p>
+    <w:p>
+      <w:pPr>
+        <w:keepNext/>
+        <w:keepLines/>
+        <w:spacing w:line="270" w:lineRule="exact" w:before="0" w:after="40"/>
+      </w:pPr>
+      <w:r>
+        <w:rPr>
+          <w:color w:val="000000"/>
+          <w:sz w:val="21"/>
+        </w:rPr>
+        <w:t>2025.06-10 · 3인 팀 · 팀장 · 시설 범위 제안 · 교통 데이터 · 보고서·제언 초안</w:t>
+      </w:r>
+    </w:p>
+    <w:p>
+      <w:pPr>
+        <w:keepNext/>
+        <w:keepLines/>
+        <w:spacing w:line="270" w:lineRule="exact" w:before="0" w:after="40"/>
+      </w:pPr>
+      <w:r>
+        <w:rPr>
+          <w:color w:val="000000"/>
+          <w:sz w:val="22"/>
+        </w:rPr>
+        <w:t>청년 시설을 어디까지 셀지 세 안 중 청소년·민간 문화시설 포함을 제안해 보고서 기준으로 확정했습니다. 일정 지연 때 의정부·과천 우선 검토로 좁혔고, 보고서·정책 제언 초안을 쓰고 Claude로 문장을 다듬었습니다.</w:t>
+      </w:r>
+    </w:p>
+    <w:p>
+      <w:pPr>
+        <w:keepNext w:val="0"/>
+        <w:keepLines/>
+        <w:spacing w:line="270" w:lineRule="exact" w:before="0" w:after="40"/>
+      </w:pPr>
+      <w:r>
+        <w:rPr>
+          <w:b/>
+          <w:sz w:val="22"/>
+        </w:rPr>
+        <w:t xml:space="preserve">결과 · </w:t>
+      </w:r>
+      <w:r>
+        <w:rPr>
+          <w:color w:val="000000"/>
+          <w:sz w:val="22"/>
+        </w:rPr>
+        <w:t>57쪽 공동 보고서. 2025 경기청년 연구 랩업 대상(23팀 발표·6팀 수상, 팀 수상). 시설 정제는 팀원.</w:t>
+      </w:r>
+    </w:p>
+    <w:p>
+      <w:pPr>
+        <w:pStyle w:val="Heading2"/>
+        <w:keepNext/>
+        <w:keepLines/>
+        <w:spacing w:line="270" w:lineRule="exact" w:before="80" w:after="20"/>
+      </w:pPr>
+      <w:r>
+        <w:rPr>
+          <w:b/>
+          <w:color w:val="000000"/>
+          <w:sz w:val="22"/>
+        </w:rPr>
+        <w:t>NCA 공약과 공식자료 대조</w:t>
+      </w:r>
+    </w:p>
+    <w:p>
+      <w:pPr>
+        <w:keepNext/>
+        <w:keepLines/>
+        <w:spacing w:line="270" w:lineRule="exact" w:before="0" w:after="40"/>
+      </w:pPr>
+      <w:r>
+        <w:rPr>
+          <w:color w:val="000000"/>
+          <w:sz w:val="21"/>
+        </w:rPr>
+        <w:t>2025-2026 · 2025 데이터 엔지니어링 · 2026 전환 제안·검토·승인(AI 협업 구현)</w:t>
+      </w:r>
+    </w:p>
+    <w:p>
+      <w:pPr>
+        <w:keepNext/>
+        <w:keepLines/>
+        <w:spacing w:line="270" w:lineRule="exact" w:before="0" w:after="40"/>
+      </w:pPr>
+      <w:r>
+        <w:rPr>
+          <w:color w:val="000000"/>
+          <w:sz w:val="22"/>
+        </w:rPr>
+        <w:t>뉴스 크롤러와 Gemini API 공약 PDF 파서를 작성해 원문과 대조했습니다. 2026년에는 검수 병목을 근거로 평가 수치 공개 중단·자료 대조 전환을 제안하고 4개 조건을 붙여 승인했습니다.</w:t>
+      </w:r>
+    </w:p>
+    <w:p>
+      <w:pPr>
+        <w:keepNext w:val="0"/>
+        <w:keepLines/>
+        <w:spacing w:line="270" w:lineRule="exact" w:before="0" w:after="40"/>
+      </w:pPr>
+      <w:r>
+        <w:rPr>
+          <w:b/>
+          <w:sz w:val="22"/>
+        </w:rPr>
+        <w:t xml:space="preserve">결과 · </w:t>
+      </w:r>
+      <w:r>
+        <w:rPr>
+          <w:color w:val="000000"/>
+          <w:sz w:val="22"/>
+        </w:rPr>
+        <w:t>평가 수치 공개 중단·자료 대조 화면 전환. 공약·예산 매칭 정밀도 33%→89%(검증 표본 18건 중 16건), AI 매처 오탐률 2.1%(상한 4.1%). 공개 배포 전.</w:t>
+      </w:r>
+    </w:p>
+    <w:p>
+      <w:pPr>
+        <w:pStyle w:val="Heading2"/>
+        <w:keepNext/>
+        <w:keepLines/>
+        <w:spacing w:line="270" w:lineRule="exact" w:before="80" w:after="20"/>
+      </w:pPr>
+      <w:r>
+        <w:rPr>
+          <w:b/>
+          <w:color w:val="000000"/>
+          <w:sz w:val="22"/>
+        </w:rPr>
+        <w:t>Dear Log 캡스톤 디자인</w:t>
+      </w:r>
+    </w:p>
+    <w:p>
+      <w:pPr>
+        <w:keepNext/>
+        <w:keepLines/>
+        <w:spacing w:line="270" w:lineRule="exact" w:before="0" w:after="40"/>
+      </w:pPr>
+      <w:r>
+        <w:rPr>
+          <w:color w:val="000000"/>
+          <w:sz w:val="21"/>
+        </w:rPr>
+        <w:t>2026 1학기 캡스톤 팀 · 백엔드 연결·AI 에이전트 흐름 · 6월 개발 총괄 배정 / 2026.07-10 후속 개인 운영(구현 AI 협업)</w:t>
+      </w:r>
+    </w:p>
+    <w:p>
+      <w:pPr>
+        <w:keepNext/>
+        <w:keepLines/>
+        <w:spacing w:line="270" w:lineRule="exact" w:before="0" w:after="40"/>
+      </w:pPr>
+      <w:r>
+        <w:rPr>
+          <w:color w:val="000000"/>
+          <w:sz w:val="22"/>
+        </w:rPr>
+        <w:t>데모의 글자 잘림·동의 설정·모바일 문제를 위치와 수정 방향이 담긴 요청 10건으로 전달했습니다. 학기 후에는 샘플 보기·문의만 공개, 데모·운영 서버 분리, 동의 5종 실제 적용을 결정했습니다.</w:t>
+      </w:r>
+    </w:p>
+    <w:p>
+      <w:pPr>
+        <w:keepNext w:val="0"/>
+        <w:keepLines/>
+        <w:spacing w:line="270" w:lineRule="exact" w:before="0" w:after="40"/>
+      </w:pPr>
+      <w:r>
+        <w:rPr>
+          <w:b/>
+          <w:sz w:val="22"/>
+        </w:rPr>
+        <w:t xml:space="preserve">결과 · </w:t>
+      </w:r>
+      <w:r>
+        <w:rPr>
+          <w:color w:val="000000"/>
+          <w:sz w:val="22"/>
+        </w:rPr>
+        <w:t>수정 요청 10건 모두 팀 완료 표시. dear-log.com 공개 운영 중.</w:t>
+      </w:r>
+    </w:p>
+    <w:p>
+      <w:pPr>
+        <w:pStyle w:val="Heading2"/>
+        <w:keepNext/>
+        <w:keepLines/>
+        <w:spacing w:line="270" w:lineRule="exact" w:before="80" w:after="20"/>
+      </w:pPr>
+      <w:r>
+        <w:rPr>
+          <w:b/>
+          <w:color w:val="000000"/>
+          <w:sz w:val="22"/>
+        </w:rPr>
         <w:t>양주 광역버스 좌석 정보</w:t>
       </w:r>
     </w:p>
@@ -712,201 +907,6 @@
           <w:sz w:val="22"/>
         </w:rPr>
         <w:t>팀 웹서비스 배포 · 본인 수집 코드 기록. 2026 개인 재구축(AI 협업)에서 파서 선택·데이터 신뢰 규칙을 결정해 리포트 2,536건·종목 591개 수집.</w:t>
-      </w:r>
-    </w:p>
-    <w:p>
-      <w:pPr>
-        <w:pStyle w:val="Heading2"/>
-        <w:keepNext/>
-        <w:keepLines/>
-        <w:spacing w:line="270" w:lineRule="exact" w:before="80" w:after="20"/>
-      </w:pPr>
-      <w:r>
-        <w:rPr>
-          <w:b/>
-          <w:color w:val="000000"/>
-          <w:sz w:val="22"/>
-        </w:rPr>
-        <w:t>온통청년 경기청년 연구 랩업</w:t>
-      </w:r>
-    </w:p>
-    <w:p>
-      <w:pPr>
-        <w:keepNext/>
-        <w:keepLines/>
-        <w:spacing w:line="270" w:lineRule="exact" w:before="0" w:after="40"/>
-      </w:pPr>
-      <w:r>
-        <w:rPr>
-          <w:color w:val="000000"/>
-          <w:sz w:val="21"/>
-        </w:rPr>
-        <w:t>2025 · 3인 팀 · 팀장 · 서버·교통 데이터 · 보고서 초안</w:t>
-      </w:r>
-    </w:p>
-    <w:p>
-      <w:pPr>
-        <w:keepNext/>
-        <w:keepLines/>
-        <w:spacing w:line="270" w:lineRule="exact" w:before="0" w:after="40"/>
-      </w:pPr>
-      <w:r>
-        <w:rPr>
-          <w:color w:val="000000"/>
-          <w:sz w:val="22"/>
-        </w:rPr>
-        <w:t>시설 포함 범위를 제안하고 일정 지연 때 의정부·과천 우선 검토로 좁혔습니다. 팀 분석으로 보고서 초안을 쓰고 Claude로 문장을 다듬었습니다.</w:t>
-      </w:r>
-    </w:p>
-    <w:p>
-      <w:pPr>
-        <w:keepNext w:val="0"/>
-        <w:keepLines/>
-        <w:spacing w:line="270" w:lineRule="exact" w:before="0" w:after="40"/>
-      </w:pPr>
-      <w:r>
-        <w:rPr>
-          <w:b/>
-          <w:sz w:val="22"/>
-        </w:rPr>
-        <w:t xml:space="preserve">결과 · </w:t>
-      </w:r>
-      <w:r>
-        <w:rPr>
-          <w:color w:val="000000"/>
-          <w:sz w:val="22"/>
-        </w:rPr>
-        <w:t>2025 경기청년 연구 랩업 대상(팀). 시설 정제는 팀원, 최종 보고서는 3인 공동.</w:t>
-      </w:r>
-    </w:p>
-    <w:p>
-      <w:pPr>
-        <w:pStyle w:val="Heading2"/>
-        <w:keepNext/>
-        <w:keepLines/>
-        <w:spacing w:line="270" w:lineRule="exact" w:before="80" w:after="20"/>
-      </w:pPr>
-      <w:r>
-        <w:rPr>
-          <w:b/>
-          <w:color w:val="000000"/>
-          <w:sz w:val="22"/>
-        </w:rPr>
-        <w:t>NCA 공약과 공식자료 대조</w:t>
-      </w:r>
-    </w:p>
-    <w:p>
-      <w:pPr>
-        <w:keepNext/>
-        <w:keepLines/>
-        <w:spacing w:line="270" w:lineRule="exact" w:before="0" w:after="40"/>
-      </w:pPr>
-      <w:r>
-        <w:rPr>
-          <w:color w:val="000000"/>
-          <w:sz w:val="21"/>
-        </w:rPr>
-        <w:t>2025-2026 · 2025 데이터 엔지니어링 · 2026 전환 제안·검토·승인(AI 협업 구현)</w:t>
-      </w:r>
-    </w:p>
-    <w:p>
-      <w:pPr>
-        <w:keepNext/>
-        <w:keepLines/>
-        <w:spacing w:line="270" w:lineRule="exact" w:before="0" w:after="40"/>
-      </w:pPr>
-      <w:r>
-        <w:rPr>
-          <w:color w:val="000000"/>
-          <w:sz w:val="22"/>
-        </w:rPr>
-        <w:t>뉴스 크롤러와 Gemini API 공약 PDF 파서를 작성해 원문과 대조했습니다. 2026년에는 검수 병목을 근거로 평가 수치 공개 중단·자료 대조 전환을 제안하고 4개 조건을 붙여 승인했습니다.</w:t>
-      </w:r>
-    </w:p>
-    <w:p>
-      <w:pPr>
-        <w:keepNext w:val="0"/>
-        <w:keepLines/>
-        <w:spacing w:line="270" w:lineRule="exact" w:before="0" w:after="40"/>
-      </w:pPr>
-      <w:r>
-        <w:rPr>
-          <w:b/>
-          <w:sz w:val="22"/>
-        </w:rPr>
-        <w:t xml:space="preserve">결과 · </w:t>
-      </w:r>
-      <w:r>
-        <w:rPr>
-          <w:color w:val="000000"/>
-          <w:sz w:val="22"/>
-        </w:rPr>
-        <w:t>평가 수치 공개 중단·자료 대조 화면 전환. 공약·예산 매칭 정밀도 33%→89%(검증 표본 18건).</w:t>
-      </w:r>
-    </w:p>
-    <w:p>
-      <w:pPr>
-        <w:pStyle w:val="Heading2"/>
-        <w:keepNext/>
-        <w:keepLines/>
-        <w:spacing w:line="270" w:lineRule="exact" w:before="80" w:after="20"/>
-      </w:pPr>
-      <w:r>
-        <w:rPr>
-          <w:b/>
-          <w:color w:val="000000"/>
-          <w:sz w:val="22"/>
-        </w:rPr>
-        <w:t>Dear Log 캡스톤 디자인</w:t>
-      </w:r>
-    </w:p>
-    <w:p>
-      <w:pPr>
-        <w:keepNext/>
-        <w:keepLines/>
-        <w:spacing w:line="270" w:lineRule="exact" w:before="0" w:after="40"/>
-      </w:pPr>
-      <w:r>
-        <w:rPr>
-          <w:color w:val="000000"/>
-          <w:sz w:val="21"/>
-        </w:rPr>
-        <w:t>2026 · 학기 6인 팀 · 학기 자료의 백엔드 담당 기록 · 6월 개발 총괄 배정</w:t>
-      </w:r>
-    </w:p>
-    <w:p>
-      <w:pPr>
-        <w:keepNext/>
-        <w:keepLines/>
-        <w:spacing w:line="270" w:lineRule="exact" w:before="0" w:after="40"/>
-      </w:pPr>
-      <w:r>
-        <w:rPr>
-          <w:color w:val="000000"/>
-          <w:sz w:val="22"/>
-        </w:rPr>
-        <w:t>데모의 글자 잘림·동의 설정·모바일 문제를 위치와 수정 방향이 담긴 요청 10건으로 전달했습니다.</w:t>
-      </w:r>
-    </w:p>
-    <w:p>
-      <w:pPr>
-        <w:keepNext w:val="0"/>
-        <w:keepLines/>
-        <w:spacing w:line="270" w:lineRule="exact" w:before="0" w:after="40"/>
-      </w:pPr>
-      <w:r>
-        <w:rPr>
-          <w:b/>
-          <w:sz w:val="22"/>
-        </w:rPr>
-        <w:t xml:space="preserve">결과 · </w:t>
-      </w:r>
-      <w:r>
-        <w:rPr>
-          <w:color w:val="000000"/>
-          <w:sz w:val="22"/>
-        </w:rPr>
-        <w:t>수정 요청 10건 모두 팀 완료 표시.</w:t>
       </w:r>
     </w:p>
     <w:p>

</xml_diff>

<commit_message>
Rebuild resume as table layout; plain-tone rewrite across PDF, DOCX, web
resume.pdf is printed from .orca/resume-table.html with Chrome;
resume.docx is generated from the same HTML by .orca/build-resume-docx.py.

Co-Authored-By: Claude Opus 5.5 <noreply@anthropic.com>
</commit_message>
<xml_diff>
--- a/resume.docx
+++ b/resume.docx
@@ -4,1124 +4,2548 @@
   <w:body>
     <w:p>
       <w:pPr>
-        <w:pStyle w:val="Title"/>
+        <w:spacing w:after="160"/>
+        <w:jc w:val="center"/>
       </w:pPr>
       <w:r>
-        <w:t>문대한</w:t>
-      </w:r>
-      <w:r>
-        <w:drawing>
-          <wp:anchor distT="0" distB="0" distL="180000" distR="0" simplePos="0" relativeHeight="251658240" behindDoc="0" locked="0" layoutInCell="1" allowOverlap="0">
-            <wp:simplePos x="0" y="0"/>
-            <wp:positionH relativeFrom="margin">
-              <wp:align>right</wp:align>
-            </wp:positionH>
-            <wp:positionV relativeFrom="paragraph">
-              <wp:posOffset>0</wp:posOffset>
-            </wp:positionV>
-            <wp:extent cx="936000" cy="1202760"/>
-            <wp:effectExtent l="0" t="0" r="0" b="0"/>
-            <wp:wrapSquare wrapText="bothSides"/>
-            <wp:docPr id="1" name="Picture 1" descr="문대한 증명사진"/>
-            <wp:cNvGraphicFramePr xmlns:a="http://schemas.openxmlformats.org/drawingml/2006/main">
-              <a:graphicFrameLocks noChangeAspect="1"/>
-            </wp:cNvGraphicFramePr>
-            <a:graphic xmlns:a="http://schemas.openxmlformats.org/drawingml/2006/main" xmlns:pic="http://schemas.openxmlformats.org/drawingml/2006/picture">
-              <a:graphicData uri="http://schemas.openxmlformats.org/drawingml/2006/picture">
-                <pic:pic>
-                  <pic:nvPicPr>
-                    <pic:cNvPr id="0" name="portrait.jpg"/>
-                    <pic:cNvPicPr/>
-                  </pic:nvPicPr>
-                  <pic:blipFill>
-                    <a:blip r:embed="rId9"/>
-                    <a:stretch>
-                      <a:fillRect/>
-                    </a:stretch>
-                  </pic:blipFill>
-                  <pic:spPr>
-                    <a:xfrm>
-                      <a:off x="0" y="0"/>
-                      <a:ext cx="936000" cy="1202760"/>
-                    </a:xfrm>
-                    <a:prstGeom prst="rect"/>
-                  </pic:spPr>
-                </pic:pic>
-              </a:graphicData>
-            </a:graphic>
-          </wp:anchor>
-        </w:drawing>
+        <w:rPr>
+          <w:b/>
+          <w:sz w:val="40"/>
+        </w:rPr>
+        <w:t>이 력 서</w:t>
       </w:r>
     </w:p>
+    <w:tbl>
+      <w:tblPr>
+        <w:tblW w:type="auto" w:w="0"/>
+        <w:tblLayout w:type="fixed"/>
+        <w:tblLook w:firstColumn="1" w:firstRow="1" w:lastColumn="0" w:lastRow="0" w:noHBand="0" w:noVBand="1" w:val="04A0"/>
+        <w:tblBorders>
+          <w:top w:val="single" w:sz="10" w:color="1A1A1A"/>
+          <w:left w:val="single" w:sz="4" w:color="B8B8B8"/>
+          <w:bottom w:val="single" w:sz="4" w:color="B8B8B8"/>
+          <w:right w:val="single" w:sz="4" w:color="B8B8B8"/>
+          <w:insideH w:val="single" w:sz="4" w:color="B8B8B8"/>
+          <w:insideV w:val="single" w:sz="4" w:color="B8B8B8"/>
+        </w:tblBorders>
+        <w:tblLayout w:type="fixed"/>
+      </w:tblPr>
+      <w:tblGrid>
+        <w:gridCol w:w="1701"/>
+        <w:gridCol w:w="1361"/>
+        <w:gridCol w:w="2948"/>
+        <w:gridCol w:w="1361"/>
+        <w:gridCol w:w="2948"/>
+      </w:tblGrid>
+      <w:tr>
+        <w:trPr>
+          <w:cantSplit/>
+        </w:trPr>
+        <w:tc>
+          <w:tcPr>
+            <w:tcW w:type="dxa" w:w="1701"/>
+            <w:vMerge w:val="restart"/>
+            <w:vAlign w:val="center"/>
+          </w:tcPr>
+          <w:p>
+            <w:r/>
+            <w:r>
+              <w:drawing>
+                <wp:inline xmlns:a="http://schemas.openxmlformats.org/drawingml/2006/main" xmlns:pic="http://schemas.openxmlformats.org/drawingml/2006/picture">
+                  <wp:extent cx="1044000" cy="1341540"/>
+                  <wp:docPr id="1" name="Picture 1"/>
+                  <wp:cNvGraphicFramePr>
+                    <a:graphicFrameLocks noChangeAspect="1"/>
+                  </wp:cNvGraphicFramePr>
+                  <a:graphic>
+                    <a:graphicData uri="http://schemas.openxmlformats.org/drawingml/2006/picture">
+                      <pic:pic>
+                        <pic:nvPicPr>
+                          <pic:cNvPr id="0" name="portrait.jpg"/>
+                          <pic:cNvPicPr/>
+                        </pic:nvPicPr>
+                        <pic:blipFill>
+                          <a:blip r:embed="rId9"/>
+                          <a:stretch>
+                            <a:fillRect/>
+                          </a:stretch>
+                        </pic:blipFill>
+                        <pic:spPr>
+                          <a:xfrm>
+                            <a:off x="0" y="0"/>
+                            <a:ext cx="1044000" cy="1341540"/>
+                          </a:xfrm>
+                          <a:prstGeom prst="rect"/>
+                        </pic:spPr>
+                      </pic:pic>
+                    </a:graphicData>
+                  </a:graphic>
+                </wp:inline>
+              </w:drawing>
+            </w:r>
+          </w:p>
+        </w:tc>
+        <w:tc>
+          <w:tcPr>
+            <w:tcW w:type="dxa" w:w="1361"/>
+            <w:shd w:val="clear" w:color="auto" w:fill="F0F0F0"/>
+            <w:vAlign w:val="center"/>
+          </w:tcPr>
+          <w:p>
+            <w:pPr>
+              <w:jc w:val="center"/>
+            </w:pPr>
+            <w:r>
+              <w:rPr>
+                <w:b/>
+              </w:rPr>
+            </w:r>
+            <w:r>
+              <w:rPr>
+                <w:b/>
+              </w:rPr>
+              <w:t>성명</w:t>
+            </w:r>
+          </w:p>
+        </w:tc>
+        <w:tc>
+          <w:tcPr>
+            <w:tcW w:type="dxa" w:w="2948"/>
+            <w:vAlign w:val="center"/>
+          </w:tcPr>
+          <w:p>
+            <w:r/>
+            <w:r>
+              <w:t>문대한</w:t>
+            </w:r>
+          </w:p>
+        </w:tc>
+        <w:tc>
+          <w:tcPr>
+            <w:tcW w:type="dxa" w:w="1361"/>
+            <w:shd w:val="clear" w:color="auto" w:fill="F0F0F0"/>
+            <w:vAlign w:val="center"/>
+          </w:tcPr>
+          <w:p>
+            <w:pPr>
+              <w:jc w:val="center"/>
+            </w:pPr>
+            <w:r>
+              <w:rPr>
+                <w:b/>
+              </w:rPr>
+            </w:r>
+            <w:r>
+              <w:rPr>
+                <w:b/>
+              </w:rPr>
+              <w:t>지원 직무</w:t>
+            </w:r>
+          </w:p>
+        </w:tc>
+        <w:tc>
+          <w:tcPr>
+            <w:tcW w:type="dxa" w:w="2948"/>
+            <w:vAlign w:val="center"/>
+          </w:tcPr>
+          <w:p>
+            <w:r/>
+            <w:r>
+              <w:t>서비스 기획 / PM</w:t>
+            </w:r>
+          </w:p>
+        </w:tc>
+      </w:tr>
+      <w:tr>
+        <w:trPr>
+          <w:cantSplit/>
+        </w:trPr>
+        <w:tc>
+          <w:tcPr>
+            <w:tcW w:type="dxa" w:w="2064"/>
+            <w:vMerge/>
+          </w:tcPr>
+          <w:p/>
+        </w:tc>
+        <w:tc>
+          <w:tcPr>
+            <w:tcW w:type="dxa" w:w="1361"/>
+            <w:shd w:val="clear" w:color="auto" w:fill="F0F0F0"/>
+            <w:vAlign w:val="center"/>
+          </w:tcPr>
+          <w:p>
+            <w:pPr>
+              <w:jc w:val="center"/>
+            </w:pPr>
+            <w:r>
+              <w:rPr>
+                <w:b/>
+              </w:rPr>
+            </w:r>
+            <w:r>
+              <w:rPr>
+                <w:b/>
+              </w:rPr>
+              <w:t>이메일</w:t>
+            </w:r>
+          </w:p>
+        </w:tc>
+        <w:tc>
+          <w:tcPr>
+            <w:tcW w:type="dxa" w:w="2948"/>
+            <w:vAlign w:val="center"/>
+          </w:tcPr>
+          <w:p>
+            <w:r/>
+            <w:r>
+              <w:rPr/>
+              <w:t>mdh0204@naver.com</w:t>
+            </w:r>
+          </w:p>
+        </w:tc>
+        <w:tc>
+          <w:tcPr>
+            <w:tcW w:type="dxa" w:w="1361"/>
+            <w:shd w:val="clear" w:color="auto" w:fill="F0F0F0"/>
+            <w:vAlign w:val="center"/>
+          </w:tcPr>
+          <w:p>
+            <w:pPr>
+              <w:jc w:val="center"/>
+            </w:pPr>
+            <w:r>
+              <w:rPr>
+                <w:b/>
+              </w:rPr>
+            </w:r>
+            <w:r>
+              <w:rPr>
+                <w:b/>
+              </w:rPr>
+              <w:t>GitHub</w:t>
+            </w:r>
+          </w:p>
+        </w:tc>
+        <w:tc>
+          <w:tcPr>
+            <w:tcW w:type="dxa" w:w="2948"/>
+            <w:vAlign w:val="center"/>
+          </w:tcPr>
+          <w:p>
+            <w:r/>
+            <w:r>
+              <w:rPr/>
+              <w:t>github.com/moondh99</w:t>
+            </w:r>
+          </w:p>
+        </w:tc>
+      </w:tr>
+      <w:tr>
+        <w:trPr>
+          <w:cantSplit/>
+        </w:trPr>
+        <w:tc>
+          <w:tcPr>
+            <w:tcW w:type="dxa" w:w="2064"/>
+            <w:vMerge/>
+          </w:tcPr>
+          <w:p/>
+        </w:tc>
+        <w:tc>
+          <w:tcPr>
+            <w:tcW w:type="dxa" w:w="1361"/>
+            <w:shd w:val="clear" w:color="auto" w:fill="F0F0F0"/>
+            <w:vAlign w:val="center"/>
+          </w:tcPr>
+          <w:p>
+            <w:pPr>
+              <w:jc w:val="center"/>
+            </w:pPr>
+            <w:r>
+              <w:rPr>
+                <w:b/>
+              </w:rPr>
+            </w:r>
+            <w:r>
+              <w:rPr>
+                <w:b/>
+              </w:rPr>
+              <w:t>포트폴리오</w:t>
+            </w:r>
+          </w:p>
+        </w:tc>
+        <w:tc>
+          <w:tcPr>
+            <w:tcW w:type="dxa" w:w="2948"/>
+            <w:gridSpan w:val="3"/>
+            <w:vAlign w:val="center"/>
+          </w:tcPr>
+          <w:p>
+            <w:r/>
+            <w:r>
+              <w:rPr/>
+              <w:t>moondh99.github.io</w:t>
+            </w:r>
+          </w:p>
+        </w:tc>
+      </w:tr>
+      <w:tr>
+        <w:trPr>
+          <w:cantSplit/>
+        </w:trPr>
+        <w:tc>
+          <w:tcPr>
+            <w:tcW w:type="dxa" w:w="2064"/>
+            <w:vMerge/>
+          </w:tcPr>
+          <w:p/>
+        </w:tc>
+        <w:tc>
+          <w:tcPr>
+            <w:tcW w:type="dxa" w:w="1361"/>
+            <w:shd w:val="clear" w:color="auto" w:fill="F0F0F0"/>
+            <w:vAlign w:val="center"/>
+          </w:tcPr>
+          <w:p>
+            <w:pPr>
+              <w:jc w:val="center"/>
+            </w:pPr>
+            <w:r>
+              <w:rPr>
+                <w:b/>
+              </w:rPr>
+            </w:r>
+            <w:r>
+              <w:rPr>
+                <w:b/>
+              </w:rPr>
+              <w:t>소개</w:t>
+            </w:r>
+          </w:p>
+        </w:tc>
+        <w:tc>
+          <w:tcPr>
+            <w:tcW w:type="dxa" w:w="2948"/>
+            <w:gridSpan w:val="3"/>
+            <w:vAlign w:val="center"/>
+          </w:tcPr>
+          <w:p>
+            <w:r/>
+            <w:r>
+              <w:t>데이터가 말할 수 있는 것만, 사용자가 이해할 수 있게 보여 줍니다.</w:t>
+            </w:r>
+          </w:p>
+        </w:tc>
+      </w:tr>
+    </w:tbl>
     <w:p>
       <w:pPr>
         <w:keepNext/>
-        <w:keepLines/>
-        <w:spacing w:line="380" w:lineRule="exact" w:before="0" w:after="80"/>
-      </w:pPr>
-      <w:r>
-        <w:rPr>
-          <w:color w:val="000000"/>
-          <w:sz w:val="28"/>
-        </w:rPr>
-        <w:t>서비스 기획 / PM</w:t>
-      </w:r>
-    </w:p>
-    <w:p>
-      <w:pPr>
-        <w:keepNext/>
-        <w:keepLines/>
-        <w:spacing w:line="270" w:lineRule="exact" w:before="0" w:after="80"/>
-      </w:pPr>
-      <w:r>
-        <w:rPr>
-          <w:color w:val="000000"/>
-          <w:sz w:val="22"/>
-        </w:rPr>
-        <w:t>데이터가 말할 수 있는 것만, 사용자가 이해할 수 있게 보여 줍니다.</w:t>
-      </w:r>
-    </w:p>
-    <w:p>
-      <w:pPr>
-        <w:keepNext w:val="0"/>
-        <w:keepLines/>
-        <w:spacing w:line="270" w:lineRule="exact" w:before="0" w:after="40"/>
+        <w:spacing w:before="200" w:after="60"/>
       </w:pPr>
       <w:r>
         <w:rPr>
           <w:b/>
           <w:sz w:val="22"/>
         </w:rPr>
-        <w:t xml:space="preserve">이메일 · </w:t>
+        <w:t>▌학력</w:t>
       </w:r>
-      <w:r>
-        <w:rPr>
-          <w:color w:val="000000"/>
-          <w:sz w:val="22"/>
-        </w:rPr>
-      </w:r>
-      <w:hyperlink r:id="rId10">
-        <w:r>
-          <w:rPr>
-            <w:color w:val="194ACB"/>
-            <w:sz w:val="22"/>
-          </w:rPr>
-          <w:t>mdh0204@naver.com</w:t>
-        </w:r>
-      </w:hyperlink>
     </w:p>
+    <w:tbl>
+      <w:tblPr>
+        <w:tblW w:type="auto" w:w="0"/>
+        <w:tblLayout w:type="fixed"/>
+        <w:tblLook w:firstColumn="1" w:firstRow="1" w:lastColumn="0" w:lastRow="0" w:noHBand="0" w:noVBand="1" w:val="04A0"/>
+        <w:tblBorders>
+          <w:top w:val="single" w:sz="10" w:color="1A1A1A"/>
+          <w:left w:val="single" w:sz="4" w:color="B8B8B8"/>
+          <w:bottom w:val="single" w:sz="4" w:color="B8B8B8"/>
+          <w:right w:val="single" w:sz="4" w:color="B8B8B8"/>
+          <w:insideH w:val="single" w:sz="4" w:color="B8B8B8"/>
+          <w:insideV w:val="single" w:sz="4" w:color="B8B8B8"/>
+        </w:tblBorders>
+        <w:tblLayout w:type="fixed"/>
+      </w:tblPr>
+      <w:tblGrid>
+        <w:gridCol w:w="1701"/>
+        <w:gridCol w:w="2041"/>
+        <w:gridCol w:w="4876"/>
+        <w:gridCol w:w="1701"/>
+      </w:tblGrid>
+      <w:tr>
+        <w:trPr>
+          <w:cantSplit/>
+          <w:tblHeader/>
+        </w:trPr>
+        <w:tc>
+          <w:tcPr>
+            <w:tcW w:type="dxa" w:w="1701"/>
+            <w:shd w:val="clear" w:color="auto" w:fill="F0F0F0"/>
+            <w:vAlign w:val="center"/>
+          </w:tcPr>
+          <w:p>
+            <w:pPr>
+              <w:jc w:val="center"/>
+            </w:pPr>
+            <w:r>
+              <w:rPr>
+                <w:b/>
+              </w:rPr>
+            </w:r>
+            <w:r>
+              <w:rPr>
+                <w:b/>
+              </w:rPr>
+              <w:t>기간</w:t>
+            </w:r>
+          </w:p>
+        </w:tc>
+        <w:tc>
+          <w:tcPr>
+            <w:tcW w:type="dxa" w:w="2041"/>
+            <w:shd w:val="clear" w:color="auto" w:fill="F0F0F0"/>
+            <w:vAlign w:val="center"/>
+          </w:tcPr>
+          <w:p>
+            <w:pPr>
+              <w:jc w:val="center"/>
+            </w:pPr>
+            <w:r>
+              <w:rPr>
+                <w:b/>
+              </w:rPr>
+            </w:r>
+            <w:r>
+              <w:rPr>
+                <w:b/>
+              </w:rPr>
+              <w:t>학교</w:t>
+            </w:r>
+          </w:p>
+        </w:tc>
+        <w:tc>
+          <w:tcPr>
+            <w:tcW w:type="dxa" w:w="4876"/>
+            <w:shd w:val="clear" w:color="auto" w:fill="F0F0F0"/>
+            <w:vAlign w:val="center"/>
+          </w:tcPr>
+          <w:p>
+            <w:pPr>
+              <w:jc w:val="center"/>
+            </w:pPr>
+            <w:r>
+              <w:rPr>
+                <w:b/>
+              </w:rPr>
+            </w:r>
+            <w:r>
+              <w:rPr>
+                <w:b/>
+              </w:rPr>
+              <w:t>전공</w:t>
+            </w:r>
+          </w:p>
+        </w:tc>
+        <w:tc>
+          <w:tcPr>
+            <w:tcW w:type="dxa" w:w="1701"/>
+            <w:shd w:val="clear" w:color="auto" w:fill="F0F0F0"/>
+            <w:vAlign w:val="center"/>
+          </w:tcPr>
+          <w:p>
+            <w:pPr>
+              <w:jc w:val="center"/>
+            </w:pPr>
+            <w:r>
+              <w:rPr>
+                <w:b/>
+              </w:rPr>
+            </w:r>
+            <w:r>
+              <w:rPr>
+                <w:b/>
+              </w:rPr>
+              <w:t>비고</w:t>
+            </w:r>
+          </w:p>
+        </w:tc>
+      </w:tr>
+      <w:tr>
+        <w:trPr>
+          <w:cantSplit/>
+        </w:trPr>
+        <w:tc>
+          <w:tcPr>
+            <w:tcW w:type="dxa" w:w="1701"/>
+            <w:vAlign w:val="center"/>
+          </w:tcPr>
+          <w:p>
+            <w:pPr>
+              <w:jc w:val="center"/>
+            </w:pPr>
+            <w:r/>
+            <w:r>
+              <w:t>2019.03–2026.08</w:t>
+            </w:r>
+          </w:p>
+        </w:tc>
+        <w:tc>
+          <w:tcPr>
+            <w:tcW w:type="dxa" w:w="2041"/>
+            <w:vAlign w:val="center"/>
+          </w:tcPr>
+          <w:p>
+            <w:r/>
+            <w:r>
+              <w:t>국민대학교</w:t>
+            </w:r>
+          </w:p>
+        </w:tc>
+        <w:tc>
+          <w:tcPr>
+            <w:tcW w:type="dxa" w:w="4876"/>
+            <w:vAlign w:val="center"/>
+          </w:tcPr>
+          <w:p>
+            <w:r/>
+            <w:r>
+              <w:t>AI빅데이터융합경영학, 경영정보학 복수전공</w:t>
+            </w:r>
+          </w:p>
+        </w:tc>
+        <w:tc>
+          <w:tcPr>
+            <w:tcW w:type="dxa" w:w="1701"/>
+            <w:vAlign w:val="center"/>
+          </w:tcPr>
+          <w:p>
+            <w:pPr>
+              <w:jc w:val="center"/>
+            </w:pPr>
+            <w:r/>
+            <w:r>
+              <w:t>졸업 (3.24/4.5)</w:t>
+            </w:r>
+          </w:p>
+        </w:tc>
+      </w:tr>
+    </w:tbl>
     <w:p>
       <w:pPr>
-        <w:keepNext w:val="0"/>
-        <w:keepLines/>
-        <w:spacing w:line="270" w:lineRule="exact" w:before="0" w:after="40"/>
+        <w:keepNext/>
+        <w:spacing w:before="200" w:after="60"/>
       </w:pPr>
       <w:r>
         <w:rPr>
           <w:b/>
           <w:sz w:val="22"/>
         </w:rPr>
-        <w:t xml:space="preserve">포트폴리오 · </w:t>
+        <w:t>▌경력</w:t>
       </w:r>
-      <w:r>
-        <w:rPr>
-          <w:color w:val="000000"/>
-          <w:sz w:val="22"/>
-        </w:rPr>
-      </w:r>
-      <w:hyperlink r:id="rId11">
-        <w:r>
-          <w:rPr>
-            <w:color w:val="194ACB"/>
-            <w:sz w:val="22"/>
-          </w:rPr>
-          <w:t>moondh99.github.io</w:t>
-        </w:r>
-      </w:hyperlink>
     </w:p>
+    <w:tbl>
+      <w:tblPr>
+        <w:tblW w:type="auto" w:w="0"/>
+        <w:tblLayout w:type="fixed"/>
+        <w:tblLook w:firstColumn="1" w:firstRow="1" w:lastColumn="0" w:lastRow="0" w:noHBand="0" w:noVBand="1" w:val="04A0"/>
+        <w:tblBorders>
+          <w:top w:val="single" w:sz="10" w:color="1A1A1A"/>
+          <w:left w:val="single" w:sz="4" w:color="B8B8B8"/>
+          <w:bottom w:val="single" w:sz="4" w:color="B8B8B8"/>
+          <w:right w:val="single" w:sz="4" w:color="B8B8B8"/>
+          <w:insideH w:val="single" w:sz="4" w:color="B8B8B8"/>
+          <w:insideV w:val="single" w:sz="4" w:color="B8B8B8"/>
+        </w:tblBorders>
+        <w:tblLayout w:type="fixed"/>
+      </w:tblPr>
+      <w:tblGrid>
+        <w:gridCol w:w="1701"/>
+        <w:gridCol w:w="2041"/>
+        <w:gridCol w:w="1587"/>
+        <w:gridCol w:w="4989"/>
+      </w:tblGrid>
+      <w:tr>
+        <w:trPr>
+          <w:cantSplit/>
+          <w:tblHeader/>
+        </w:trPr>
+        <w:tc>
+          <w:tcPr>
+            <w:tcW w:type="dxa" w:w="1701"/>
+            <w:shd w:val="clear" w:color="auto" w:fill="F0F0F0"/>
+            <w:vAlign w:val="center"/>
+          </w:tcPr>
+          <w:p>
+            <w:pPr>
+              <w:jc w:val="center"/>
+            </w:pPr>
+            <w:r>
+              <w:rPr>
+                <w:b/>
+              </w:rPr>
+            </w:r>
+            <w:r>
+              <w:rPr>
+                <w:b/>
+              </w:rPr>
+              <w:t>기간</w:t>
+            </w:r>
+          </w:p>
+        </w:tc>
+        <w:tc>
+          <w:tcPr>
+            <w:tcW w:type="dxa" w:w="2041"/>
+            <w:shd w:val="clear" w:color="auto" w:fill="F0F0F0"/>
+            <w:vAlign w:val="center"/>
+          </w:tcPr>
+          <w:p>
+            <w:pPr>
+              <w:jc w:val="center"/>
+            </w:pPr>
+            <w:r>
+              <w:rPr>
+                <w:b/>
+              </w:rPr>
+            </w:r>
+            <w:r>
+              <w:rPr>
+                <w:b/>
+              </w:rPr>
+              <w:t>회사</w:t>
+            </w:r>
+          </w:p>
+        </w:tc>
+        <w:tc>
+          <w:tcPr>
+            <w:tcW w:type="dxa" w:w="1587"/>
+            <w:shd w:val="clear" w:color="auto" w:fill="F0F0F0"/>
+            <w:vAlign w:val="center"/>
+          </w:tcPr>
+          <w:p>
+            <w:pPr>
+              <w:jc w:val="center"/>
+            </w:pPr>
+            <w:r>
+              <w:rPr>
+                <w:b/>
+              </w:rPr>
+            </w:r>
+            <w:r>
+              <w:rPr>
+                <w:b/>
+              </w:rPr>
+              <w:t>직무</w:t>
+            </w:r>
+          </w:p>
+        </w:tc>
+        <w:tc>
+          <w:tcPr>
+            <w:tcW w:type="dxa" w:w="4989"/>
+            <w:shd w:val="clear" w:color="auto" w:fill="F0F0F0"/>
+            <w:vAlign w:val="center"/>
+          </w:tcPr>
+          <w:p>
+            <w:pPr>
+              <w:jc w:val="center"/>
+            </w:pPr>
+            <w:r>
+              <w:rPr>
+                <w:b/>
+              </w:rPr>
+            </w:r>
+            <w:r>
+              <w:rPr>
+                <w:b/>
+              </w:rPr>
+              <w:t>주요 업무</w:t>
+            </w:r>
+          </w:p>
+        </w:tc>
+      </w:tr>
+      <w:tr>
+        <w:trPr>
+          <w:cantSplit/>
+        </w:trPr>
+        <w:tc>
+          <w:tcPr>
+            <w:tcW w:type="dxa" w:w="1701"/>
+            <w:vAlign w:val="top"/>
+          </w:tcPr>
+          <w:p>
+            <w:pPr>
+              <w:jc w:val="center"/>
+            </w:pPr>
+            <w:r/>
+            <w:r>
+              <w:t>2025.09–12</w:t>
+            </w:r>
+          </w:p>
+        </w:tc>
+        <w:tc>
+          <w:tcPr>
+            <w:tcW w:type="dxa" w:w="2041"/>
+            <w:vAlign w:val="top"/>
+          </w:tcPr>
+          <w:p>
+            <w:r/>
+            <w:r>
+              <w:t>셀렉트스타</w:t>
+            </w:r>
+          </w:p>
+          <w:p>
+            <w:r>
+              <w:rPr>
+                <w:color w:val="555555"/>
+                <w:sz w:val="17"/>
+              </w:rPr>
+              <w:t>프로젝트3팀</w:t>
+            </w:r>
+          </w:p>
+        </w:tc>
+        <w:tc>
+          <w:tcPr>
+            <w:tcW w:type="dxa" w:w="1587"/>
+            <w:vAlign w:val="top"/>
+          </w:tcPr>
+          <w:p>
+            <w:r/>
+            <w:r>
+              <w:t>Data Assistant</w:t>
+            </w:r>
+          </w:p>
+        </w:tc>
+        <w:tc>
+          <w:tcPr>
+            <w:tcW w:type="dxa" w:w="4989"/>
+            <w:vAlign w:val="top"/>
+          </w:tcPr>
+          <w:p>
+            <w:pPr>
+              <w:ind w:left="170" w:hanging="170"/>
+            </w:pPr>
+            <w:r/>
+            <w:r>
+              <w:t xml:space="preserve">• </w:t>
+            </w:r>
+            <w:r>
+              <w:rPr/>
+              <w:t>LLM 검수 프롬프트 초안을 쓰고 모델별 결과 비교</w:t>
+            </w:r>
+          </w:p>
+          <w:p>
+            <w:pPr>
+              <w:ind w:left="170" w:hanging="170"/>
+            </w:pPr>
+            <w:r>
+              <w:t xml:space="preserve">• </w:t>
+            </w:r>
+            <w:r>
+              <w:rPr/>
+              <w:t>질문과 답변 데이터 어노테이션, 근거 부족이나 표기 오류는 작업시트에 기록</w:t>
+            </w:r>
+          </w:p>
+        </w:tc>
+      </w:tr>
+      <w:tr>
+        <w:trPr>
+          <w:cantSplit/>
+        </w:trPr>
+        <w:tc>
+          <w:tcPr>
+            <w:tcW w:type="dxa" w:w="1701"/>
+            <w:vAlign w:val="top"/>
+          </w:tcPr>
+          <w:p>
+            <w:pPr>
+              <w:jc w:val="center"/>
+            </w:pPr>
+            <w:r/>
+            <w:r>
+              <w:t>2024.01–12</w:t>
+            </w:r>
+          </w:p>
+        </w:tc>
+        <w:tc>
+          <w:tcPr>
+            <w:tcW w:type="dxa" w:w="2041"/>
+            <w:vAlign w:val="top"/>
+          </w:tcPr>
+          <w:p>
+            <w:r/>
+            <w:r>
+              <w:t>한국금융연수원</w:t>
+            </w:r>
+          </w:p>
+          <w:p>
+            <w:r>
+              <w:rPr>
+                <w:color w:val="555555"/>
+                <w:sz w:val="17"/>
+              </w:rPr>
+              <w:t>출판미디어사업부</w:t>
+            </w:r>
+          </w:p>
+        </w:tc>
+        <w:tc>
+          <w:tcPr>
+            <w:tcW w:type="dxa" w:w="1587"/>
+            <w:vAlign w:val="top"/>
+          </w:tcPr>
+          <w:p>
+            <w:r/>
+            <w:r>
+              <w:t>아르바이트</w:t>
+            </w:r>
+          </w:p>
+        </w:tc>
+        <w:tc>
+          <w:tcPr>
+            <w:tcW w:type="dxa" w:w="4989"/>
+            <w:vAlign w:val="top"/>
+          </w:tcPr>
+          <w:p>
+            <w:r/>
+            <w:r>
+              <w:t>사무보조</w:t>
+            </w:r>
+          </w:p>
+        </w:tc>
+      </w:tr>
+    </w:tbl>
     <w:p>
       <w:pPr>
-        <w:keepNext w:val="0"/>
-        <w:keepLines/>
-        <w:spacing w:line="270" w:lineRule="exact" w:before="0" w:after="40"/>
+        <w:keepNext/>
+        <w:spacing w:before="200" w:after="60"/>
       </w:pPr>
       <w:r>
         <w:rPr>
           <w:b/>
           <w:sz w:val="22"/>
         </w:rPr>
-        <w:t xml:space="preserve">GitHub · </w:t>
-      </w:r>
-      <w:r>
-        <w:rPr>
-          <w:color w:val="000000"/>
-          <w:sz w:val="22"/>
-        </w:rPr>
-      </w:r>
-      <w:hyperlink r:id="rId12">
-        <w:r>
-          <w:rPr>
-            <w:color w:val="194ACB"/>
-            <w:sz w:val="22"/>
-          </w:rPr>
-          <w:t>github.com/moondh99</w:t>
-        </w:r>
-      </w:hyperlink>
-    </w:p>
-    <w:p>
-      <w:pPr>
-        <w:pStyle w:val="Heading1"/>
-        <w:keepNext/>
-        <w:keepLines/>
-        <w:spacing w:line="320" w:lineRule="exact" w:before="140" w:after="60"/>
-      </w:pPr>
-      <w:r>
-        <w:rPr>
-          <w:b/>
-          <w:color w:val="000000"/>
-          <w:sz w:val="26"/>
-        </w:rPr>
-        <w:t>핵심 역량</w:t>
+        <w:t>▌프로젝트</w:t>
       </w:r>
     </w:p>
-    <w:p>
-      <w:pPr>
-        <w:pStyle w:val="Heading2"/>
-        <w:keepNext/>
-        <w:keepLines/>
-        <w:spacing w:line="270" w:lineRule="exact" w:before="80" w:after="20"/>
-      </w:pPr>
-      <w:r>
-        <w:rPr>
-          <w:b/>
-          <w:color w:val="000000"/>
-          <w:sz w:val="22"/>
-        </w:rPr>
-        <w:t>데이터 상태와 응답 기준 설계</w:t>
-      </w:r>
-    </w:p>
+    <w:tbl>
+      <w:tblPr>
+        <w:tblW w:type="auto" w:w="0"/>
+        <w:tblLayout w:type="fixed"/>
+        <w:tblLook w:firstColumn="1" w:firstRow="1" w:lastColumn="0" w:lastRow="0" w:noHBand="0" w:noVBand="1" w:val="04A0"/>
+        <w:tblBorders>
+          <w:top w:val="single" w:sz="10" w:color="1A1A1A"/>
+          <w:left w:val="single" w:sz="4" w:color="B8B8B8"/>
+          <w:bottom w:val="single" w:sz="4" w:color="B8B8B8"/>
+          <w:right w:val="single" w:sz="4" w:color="B8B8B8"/>
+          <w:insideH w:val="single" w:sz="4" w:color="B8B8B8"/>
+          <w:insideV w:val="single" w:sz="4" w:color="B8B8B8"/>
+        </w:tblBorders>
+        <w:tblLayout w:type="fixed"/>
+      </w:tblPr>
+      <w:tblGrid>
+        <w:gridCol w:w="1701"/>
+        <w:gridCol w:w="2041"/>
+        <w:gridCol w:w="1587"/>
+        <w:gridCol w:w="4989"/>
+      </w:tblGrid>
+      <w:tr>
+        <w:trPr>
+          <w:cantSplit/>
+          <w:tblHeader/>
+        </w:trPr>
+        <w:tc>
+          <w:tcPr>
+            <w:tcW w:type="dxa" w:w="1701"/>
+            <w:shd w:val="clear" w:color="auto" w:fill="F0F0F0"/>
+            <w:vAlign w:val="center"/>
+          </w:tcPr>
+          <w:p>
+            <w:pPr>
+              <w:jc w:val="center"/>
+            </w:pPr>
+            <w:r>
+              <w:rPr>
+                <w:b/>
+              </w:rPr>
+            </w:r>
+            <w:r>
+              <w:rPr>
+                <w:b/>
+              </w:rPr>
+              <w:t>기간</w:t>
+            </w:r>
+          </w:p>
+        </w:tc>
+        <w:tc>
+          <w:tcPr>
+            <w:tcW w:type="dxa" w:w="2041"/>
+            <w:shd w:val="clear" w:color="auto" w:fill="F0F0F0"/>
+            <w:vAlign w:val="center"/>
+          </w:tcPr>
+          <w:p>
+            <w:pPr>
+              <w:jc w:val="center"/>
+            </w:pPr>
+            <w:r>
+              <w:rPr>
+                <w:b/>
+              </w:rPr>
+            </w:r>
+            <w:r>
+              <w:rPr>
+                <w:b/>
+              </w:rPr>
+              <w:t>프로젝트</w:t>
+            </w:r>
+          </w:p>
+        </w:tc>
+        <w:tc>
+          <w:tcPr>
+            <w:tcW w:type="dxa" w:w="1587"/>
+            <w:shd w:val="clear" w:color="auto" w:fill="F0F0F0"/>
+            <w:vAlign w:val="center"/>
+          </w:tcPr>
+          <w:p>
+            <w:pPr>
+              <w:jc w:val="center"/>
+            </w:pPr>
+            <w:r>
+              <w:rPr>
+                <w:b/>
+              </w:rPr>
+            </w:r>
+            <w:r>
+              <w:rPr>
+                <w:b/>
+              </w:rPr>
+              <w:t>역할</w:t>
+            </w:r>
+          </w:p>
+        </w:tc>
+        <w:tc>
+          <w:tcPr>
+            <w:tcW w:type="dxa" w:w="4989"/>
+            <w:shd w:val="clear" w:color="auto" w:fill="F0F0F0"/>
+            <w:vAlign w:val="center"/>
+          </w:tcPr>
+          <w:p>
+            <w:pPr>
+              <w:jc w:val="center"/>
+            </w:pPr>
+            <w:r>
+              <w:rPr>
+                <w:b/>
+              </w:rPr>
+            </w:r>
+            <w:r>
+              <w:rPr>
+                <w:b/>
+              </w:rPr>
+              <w:t>내용 및 성과</w:t>
+            </w:r>
+          </w:p>
+        </w:tc>
+      </w:tr>
+      <w:tr>
+        <w:trPr>
+          <w:cantSplit/>
+        </w:trPr>
+        <w:tc>
+          <w:tcPr>
+            <w:tcW w:type="dxa" w:w="1701"/>
+            <w:vAlign w:val="top"/>
+          </w:tcPr>
+          <w:p>
+            <w:pPr>
+              <w:jc w:val="center"/>
+            </w:pPr>
+            <w:r/>
+            <w:r>
+              <w:t>2025.06–10</w:t>
+            </w:r>
+          </w:p>
+        </w:tc>
+        <w:tc>
+          <w:tcPr>
+            <w:tcW w:type="dxa" w:w="2041"/>
+            <w:vAlign w:val="top"/>
+          </w:tcPr>
+          <w:p>
+            <w:r/>
+            <w:r>
+              <w:rPr>
+                <w:b/>
+              </w:rPr>
+              <w:t>온통청년</w:t>
+            </w:r>
+          </w:p>
+          <w:p>
+            <w:r>
+              <w:rPr>
+                <w:color w:val="555555"/>
+                <w:sz w:val="17"/>
+              </w:rPr>
+              <w:t>경기청년 연구 랩업</w:t>
+            </w:r>
+            <w:r>
+              <w:br/>
+            </w:r>
+            <w:r>
+              <w:rPr>
+                <w:color w:val="555555"/>
+                <w:sz w:val="17"/>
+              </w:rPr>
+              <w:t>3인 팀</w:t>
+            </w:r>
+          </w:p>
+        </w:tc>
+        <w:tc>
+          <w:tcPr>
+            <w:tcW w:type="dxa" w:w="1587"/>
+            <w:vAlign w:val="top"/>
+          </w:tcPr>
+          <w:p>
+            <w:r/>
+            <w:r>
+              <w:t>팀장</w:t>
+            </w:r>
+          </w:p>
+          <w:p>
+            <w:r>
+              <w:rPr>
+                <w:color w:val="555555"/>
+                <w:sz w:val="17"/>
+              </w:rPr>
+              <w:t>교통 데이터 수집, 보고서 초안</w:t>
+            </w:r>
+          </w:p>
+        </w:tc>
+        <w:tc>
+          <w:tcPr>
+            <w:tcW w:type="dxa" w:w="4989"/>
+            <w:vAlign w:val="top"/>
+          </w:tcPr>
+          <w:p>
+            <w:pPr>
+              <w:ind w:left="170" w:hanging="170"/>
+            </w:pPr>
+            <w:r/>
+            <w:r>
+              <w:t xml:space="preserve">• </w:t>
+            </w:r>
+            <w:r>
+              <w:rPr/>
+              <w:t>청년이 실제로 쓸 수 있는 곳을 기준으로 시설 범위를 제안했고, 청소년시설과 민간 문화시설까지 넣는 안이 보고서 기준이 됨</w:t>
+            </w:r>
+          </w:p>
+          <w:p>
+            <w:pPr>
+              <w:ind w:left="170" w:hanging="170"/>
+            </w:pPr>
+            <w:r>
+              <w:t xml:space="preserve">• </w:t>
+            </w:r>
+            <w:r>
+              <w:rPr/>
+              <w:t>중간공유회 준비가 늦어져 의정부와 과천부터 분석하도록 조정</w:t>
+            </w:r>
+          </w:p>
+          <w:p>
+            <w:pPr>
+              <w:ind w:left="170" w:hanging="170"/>
+            </w:pPr>
+            <w:r>
+              <w:t xml:space="preserve">• </w:t>
+            </w:r>
+            <w:r>
+              <w:rPr>
+                <w:b/>
+              </w:rPr>
+              <w:t>57쪽 공동 보고서로 대상 수상</w:t>
+            </w:r>
+            <w:r>
+              <w:rPr/>
+              <w:t xml:space="preserve"> (발표 23팀 중 6팀 수상)</w:t>
+            </w:r>
+          </w:p>
+        </w:tc>
+      </w:tr>
+      <w:tr>
+        <w:trPr>
+          <w:cantSplit/>
+        </w:trPr>
+        <w:tc>
+          <w:tcPr>
+            <w:tcW w:type="dxa" w:w="1701"/>
+            <w:vAlign w:val="top"/>
+          </w:tcPr>
+          <w:p>
+            <w:pPr>
+              <w:jc w:val="center"/>
+            </w:pPr>
+            <w:r/>
+            <w:r>
+              <w:t>2025–2026</w:t>
+            </w:r>
+          </w:p>
+        </w:tc>
+        <w:tc>
+          <w:tcPr>
+            <w:tcW w:type="dxa" w:w="2041"/>
+            <w:vAlign w:val="top"/>
+          </w:tcPr>
+          <w:p>
+            <w:r/>
+            <w:r>
+              <w:rPr>
+                <w:b/>
+              </w:rPr>
+              <w:t>NCA</w:t>
+            </w:r>
+          </w:p>
+          <w:p>
+            <w:r>
+              <w:rPr>
+                <w:color w:val="555555"/>
+                <w:sz w:val="17"/>
+              </w:rPr>
+              <w:t>공약과 공식자료 대조</w:t>
+            </w:r>
+            <w:r>
+              <w:br/>
+            </w:r>
+            <w:r>
+              <w:rPr>
+                <w:color w:val="555555"/>
+                <w:sz w:val="17"/>
+              </w:rPr>
+              <w:t>경기청년 갭이어</w:t>
+            </w:r>
+          </w:p>
+        </w:tc>
+        <w:tc>
+          <w:tcPr>
+            <w:tcW w:type="dxa" w:w="1587"/>
+            <w:vAlign w:val="top"/>
+          </w:tcPr>
+          <w:p>
+            <w:r/>
+            <w:r>
+              <w:t>데이터 엔지니어</w:t>
+            </w:r>
+          </w:p>
+          <w:p>
+            <w:r>
+              <w:rPr>
+                <w:color w:val="555555"/>
+                <w:sz w:val="17"/>
+              </w:rPr>
+              <w:t>2026년 전환 제안과 승인</w:t>
+            </w:r>
+          </w:p>
+        </w:tc>
+        <w:tc>
+          <w:tcPr>
+            <w:tcW w:type="dxa" w:w="4989"/>
+            <w:vAlign w:val="top"/>
+          </w:tcPr>
+          <w:p>
+            <w:pPr>
+              <w:ind w:left="170" w:hanging="170"/>
+            </w:pPr>
+            <w:r/>
+            <w:r>
+              <w:t xml:space="preserve">• </w:t>
+            </w:r>
+            <w:r>
+              <w:rPr/>
+              <w:t>2025년 뉴스 크롤러와 Gemini API 공약 PDF 파서를 만들고 원문과 대조</w:t>
+            </w:r>
+          </w:p>
+          <w:p>
+            <w:pPr>
+              <w:ind w:left="170" w:hanging="170"/>
+            </w:pPr>
+            <w:r>
+              <w:t xml:space="preserve">• </w:t>
+            </w:r>
+            <w:r>
+              <w:rPr/>
+              <w:t>1인 운영으로 판정 검수가 끊기자 이행 점수 공개를 멈추고, 공약 옆에 공식자료를 보여 주는 방식으로 바꾸자고 제안. 조건 4가지를 붙여 승인 (구현은 AI와 협업)</w:t>
+            </w:r>
+          </w:p>
+          <w:p>
+            <w:pPr>
+              <w:ind w:left="170" w:hanging="170"/>
+            </w:pPr>
+            <w:r>
+              <w:t xml:space="preserve">• </w:t>
+            </w:r>
+            <w:r>
+              <w:rPr>
+                <w:b/>
+              </w:rPr>
+              <w:t>공약–예산 매칭 정밀도 33%에서 89%</w:t>
+            </w:r>
+            <w:r>
+              <w:rPr/>
+              <w:t xml:space="preserve"> (표본 18건 중 16건), AI 매처 오탐률 2.1%</w:t>
+            </w:r>
+          </w:p>
+        </w:tc>
+      </w:tr>
+      <w:tr>
+        <w:trPr>
+          <w:cantSplit/>
+        </w:trPr>
+        <w:tc>
+          <w:tcPr>
+            <w:tcW w:type="dxa" w:w="1701"/>
+            <w:vAlign w:val="top"/>
+          </w:tcPr>
+          <w:p>
+            <w:pPr>
+              <w:jc w:val="center"/>
+            </w:pPr>
+            <w:r/>
+            <w:r>
+              <w:t>2026</w:t>
+            </w:r>
+          </w:p>
+        </w:tc>
+        <w:tc>
+          <w:tcPr>
+            <w:tcW w:type="dxa" w:w="2041"/>
+            <w:vAlign w:val="top"/>
+          </w:tcPr>
+          <w:p>
+            <w:r/>
+            <w:r>
+              <w:rPr>
+                <w:b/>
+              </w:rPr>
+              <w:t>Dear Log</w:t>
+            </w:r>
+          </w:p>
+          <w:p>
+            <w:r>
+              <w:rPr>
+                <w:color w:val="555555"/>
+                <w:sz w:val="17"/>
+              </w:rPr>
+              <w:t>캡스톤 디자인</w:t>
+            </w:r>
+            <w:r>
+              <w:br/>
+            </w:r>
+            <w:r>
+              <w:rPr>
+                <w:color w:val="555555"/>
+                <w:sz w:val="17"/>
+              </w:rPr>
+              <w:t>7–10월 개인 운영</w:t>
+            </w:r>
+          </w:p>
+        </w:tc>
+        <w:tc>
+          <w:tcPr>
+            <w:tcW w:type="dxa" w:w="1587"/>
+            <w:vAlign w:val="top"/>
+          </w:tcPr>
+          <w:p>
+            <w:r/>
+            <w:r>
+              <w:t>백엔드, AI 흐름</w:t>
+            </w:r>
+          </w:p>
+          <w:p>
+            <w:r>
+              <w:rPr>
+                <w:color w:val="555555"/>
+                <w:sz w:val="17"/>
+              </w:rPr>
+              <w:t>6월 개발 총괄</w:t>
+            </w:r>
+          </w:p>
+        </w:tc>
+        <w:tc>
+          <w:tcPr>
+            <w:tcW w:type="dxa" w:w="4989"/>
+            <w:vAlign w:val="top"/>
+          </w:tcPr>
+          <w:p>
+            <w:pPr>
+              <w:ind w:left="170" w:hanging="170"/>
+            </w:pPr>
+            <w:r/>
+            <w:r>
+              <w:t xml:space="preserve">• </w:t>
+            </w:r>
+            <w:r>
+              <w:rPr/>
+              <w:t>데모를 직접 써 보고 글자 잘림, 동의 설정, 모바일 화면 등 수정 요청 10건을 정리했고, 팀이 모두 완료 처리</w:t>
+            </w:r>
+          </w:p>
+          <w:p>
+            <w:pPr>
+              <w:ind w:left="170" w:hanging="170"/>
+            </w:pPr>
+            <w:r>
+              <w:t xml:space="preserve">• </w:t>
+            </w:r>
+            <w:r>
+              <w:rPr/>
+              <w:t>학기 후 혼자 이어 가며 가입을 닫고 샘플 보기와 문의만 공개, 데모 서버와 운영 서버를 분리 (구현은 AI와 협업)</w:t>
+            </w:r>
+          </w:p>
+          <w:p>
+            <w:pPr>
+              <w:ind w:left="170" w:hanging="170"/>
+            </w:pPr>
+            <w:r>
+              <w:t xml:space="preserve">• </w:t>
+            </w:r>
+            <w:r>
+              <w:rPr>
+                <w:b/>
+              </w:rPr>
+              <w:t>dear-log.com 공개 운영 중</w:t>
+            </w:r>
+          </w:p>
+        </w:tc>
+      </w:tr>
+      <w:tr>
+        <w:trPr>
+          <w:cantSplit/>
+        </w:trPr>
+        <w:tc>
+          <w:tcPr>
+            <w:tcW w:type="dxa" w:w="1701"/>
+            <w:vAlign w:val="top"/>
+          </w:tcPr>
+          <w:p>
+            <w:pPr>
+              <w:jc w:val="center"/>
+            </w:pPr>
+            <w:r/>
+            <w:r>
+              <w:t>2026</w:t>
+            </w:r>
+          </w:p>
+        </w:tc>
+        <w:tc>
+          <w:tcPr>
+            <w:tcW w:type="dxa" w:w="2041"/>
+            <w:vAlign w:val="top"/>
+          </w:tcPr>
+          <w:p>
+            <w:r/>
+            <w:r>
+              <w:rPr>
+                <w:b/>
+              </w:rPr>
+              <w:t>양주 광역버스 좌석 정보</w:t>
+            </w:r>
+          </w:p>
+          <w:p>
+            <w:r>
+              <w:rPr>
+                <w:color w:val="555555"/>
+                <w:sz w:val="17"/>
+              </w:rPr>
+              <w:t>양주시 미래인재 AI 공모전</w:t>
+            </w:r>
+            <w:r>
+              <w:br/>
+            </w:r>
+            <w:r>
+              <w:rPr>
+                <w:color w:val="555555"/>
+                <w:sz w:val="17"/>
+              </w:rPr>
+              <w:t>5인 팀</w:t>
+            </w:r>
+          </w:p>
+        </w:tc>
+        <w:tc>
+          <w:tcPr>
+            <w:tcW w:type="dxa" w:w="1587"/>
+            <w:vAlign w:val="top"/>
+          </w:tcPr>
+          <w:p>
+            <w:r/>
+            <w:r>
+              <w:t>응답 기준 설계</w:t>
+            </w:r>
+          </w:p>
+          <w:p>
+            <w:r>
+              <w:rPr>
+                <w:color w:val="555555"/>
+                <w:sz w:val="17"/>
+              </w:rPr>
+              <w:t>원천 데이터 대조</w:t>
+            </w:r>
+          </w:p>
+        </w:tc>
+        <w:tc>
+          <w:tcPr>
+            <w:tcW w:type="dxa" w:w="4989"/>
+            <w:vAlign w:val="top"/>
+          </w:tcPr>
+          <w:p>
+            <w:pPr>
+              <w:ind w:left="170" w:hanging="170"/>
+            </w:pPr>
+            <w:r/>
+            <w:r>
+              <w:t xml:space="preserve">• </w:t>
+            </w:r>
+            <w:r>
+              <w:rPr/>
+              <w:t>좌석 0석, 정보 없음, 빈 슬롯을 구분하고 수집 시각으로 오래된 정보를 가려내는 기준 작성</w:t>
+            </w:r>
+          </w:p>
+          <w:p>
+            <w:pPr>
+              <w:ind w:left="170" w:hanging="170"/>
+            </w:pPr>
+            <w:r>
+              <w:t xml:space="preserve">• </w:t>
+            </w:r>
+            <w:r>
+              <w:rPr/>
+              <w:t>근거 없는 예측 확률은 내보내지 않고 null로 둠</w:t>
+            </w:r>
+          </w:p>
+          <w:p>
+            <w:pPr>
+              <w:ind w:left="170" w:hanging="170"/>
+            </w:pPr>
+            <w:r>
+              <w:t xml:space="preserve">• </w:t>
+            </w:r>
+            <w:r>
+              <w:rPr>
+                <w:b/>
+              </w:rPr>
+              <w:t>정류장 4곳의 노선·방향 매핑 6건 대조</w:t>
+            </w:r>
+            <w:r>
+              <w:rPr/>
+              <w:t>, 로컬 API는 AI가 작성(테스트 183건 통과). 팀 통합 전</w:t>
+            </w:r>
+          </w:p>
+        </w:tc>
+      </w:tr>
+      <w:tr>
+        <w:trPr>
+          <w:cantSplit/>
+        </w:trPr>
+        <w:tc>
+          <w:tcPr>
+            <w:tcW w:type="dxa" w:w="1701"/>
+            <w:vAlign w:val="top"/>
+          </w:tcPr>
+          <w:p>
+            <w:pPr>
+              <w:jc w:val="center"/>
+            </w:pPr>
+            <w:r/>
+            <w:r>
+              <w:t>2025</w:t>
+            </w:r>
+          </w:p>
+        </w:tc>
+        <w:tc>
+          <w:tcPr>
+            <w:tcW w:type="dxa" w:w="2041"/>
+            <w:vAlign w:val="top"/>
+          </w:tcPr>
+          <w:p>
+            <w:r/>
+            <w:r>
+              <w:rPr>
+                <w:b/>
+              </w:rPr>
+              <w:t>Finsight</w:t>
+            </w:r>
+          </w:p>
+          <w:p>
+            <w:r>
+              <w:rPr>
+                <w:color w:val="555555"/>
+                <w:sz w:val="17"/>
+              </w:rPr>
+              <w:t>ICT 한이음 드림업</w:t>
+            </w:r>
+            <w:r>
+              <w:br/>
+            </w:r>
+            <w:r>
+              <w:rPr>
+                <w:color w:val="555555"/>
+                <w:sz w:val="17"/>
+              </w:rPr>
+              <w:t>5인 팀</w:t>
+            </w:r>
+          </w:p>
+        </w:tc>
+        <w:tc>
+          <w:tcPr>
+            <w:tcW w:type="dxa" w:w="1587"/>
+            <w:vAlign w:val="top"/>
+          </w:tcPr>
+          <w:p>
+            <w:r/>
+            <w:r>
+              <w:t>팀장, PM</w:t>
+            </w:r>
+          </w:p>
+          <w:p>
+            <w:r>
+              <w:rPr>
+                <w:color w:val="555555"/>
+                <w:sz w:val="17"/>
+              </w:rPr>
+              <w:t>기본 수집 코드</w:t>
+            </w:r>
+          </w:p>
+        </w:tc>
+        <w:tc>
+          <w:tcPr>
+            <w:tcW w:type="dxa" w:w="4989"/>
+            <w:vAlign w:val="top"/>
+          </w:tcPr>
+          <w:p>
+            <w:pPr>
+              <w:ind w:left="170" w:hanging="170"/>
+            </w:pPr>
+            <w:r/>
+            <w:r>
+              <w:t xml:space="preserve">• </w:t>
+            </w:r>
+            <w:r>
+              <w:rPr/>
+              <w:t>팀 일정과 업무를 조율하고 FnGuide, WiseReport 기본 수집 코드 작성</w:t>
+            </w:r>
+          </w:p>
+          <w:p>
+            <w:pPr>
+              <w:ind w:left="170" w:hanging="170"/>
+            </w:pPr>
+            <w:r>
+              <w:t xml:space="preserve">• </w:t>
+            </w:r>
+            <w:r>
+              <w:rPr/>
+              <w:t>PDF 처리 문제를 본문, 표, 이미지로 나눠 팀원·멘토와 대안 검토</w:t>
+            </w:r>
+          </w:p>
+          <w:p>
+            <w:pPr>
+              <w:ind w:left="170" w:hanging="170"/>
+            </w:pPr>
+            <w:r>
+              <w:t xml:space="preserve">• </w:t>
+            </w:r>
+            <w:r>
+              <w:rPr>
+                <w:b/>
+              </w:rPr>
+              <w:t>팀 웹서비스 배포</w:t>
+            </w:r>
+            <w:r>
+              <w:rPr/>
+              <w:t>. 2026년 개인 재구축(AI 협업)으로 리포트 2,536건 수집</w:t>
+            </w:r>
+          </w:p>
+        </w:tc>
+      </w:tr>
+      <w:tr>
+        <w:trPr>
+          <w:cantSplit/>
+        </w:trPr>
+        <w:tc>
+          <w:tcPr>
+            <w:tcW w:type="dxa" w:w="1701"/>
+            <w:vAlign w:val="top"/>
+          </w:tcPr>
+          <w:p>
+            <w:pPr>
+              <w:jc w:val="center"/>
+            </w:pPr>
+            <w:r/>
+            <w:r>
+              <w:t>2026</w:t>
+            </w:r>
+          </w:p>
+        </w:tc>
+        <w:tc>
+          <w:tcPr>
+            <w:tcW w:type="dxa" w:w="2041"/>
+            <w:vAlign w:val="top"/>
+          </w:tcPr>
+          <w:p>
+            <w:r/>
+            <w:r>
+              <w:rPr>
+                <w:b/>
+              </w:rPr>
+              <w:t>KBI 금융 AI 리터러시 카드뉴스</w:t>
+            </w:r>
+          </w:p>
+          <w:p>
+            <w:r>
+              <w:rPr>
+                <w:color w:val="555555"/>
+                <w:sz w:val="17"/>
+              </w:rPr>
+              <w:t>개인</w:t>
+            </w:r>
+          </w:p>
+        </w:tc>
+        <w:tc>
+          <w:tcPr>
+            <w:tcW w:type="dxa" w:w="1587"/>
+            <w:vAlign w:val="top"/>
+          </w:tcPr>
+          <w:p>
+            <w:r/>
+            <w:r>
+              <w:t>기획, AI 제작</w:t>
+            </w:r>
+          </w:p>
+        </w:tc>
+        <w:tc>
+          <w:tcPr>
+            <w:tcW w:type="dxa" w:w="4989"/>
+            <w:vAlign w:val="top"/>
+          </w:tcPr>
+          <w:p>
+            <w:pPr>
+              <w:ind w:left="170" w:hanging="170"/>
+            </w:pPr>
+            <w:r/>
+            <w:r>
+              <w:t xml:space="preserve">• </w:t>
+            </w:r>
+            <w:r>
+              <w:rPr/>
+              <w:t>NotebookLM으로 공모전 자료를 정리하고, Gemini Gems로 만든 프롬프트로 나노바나나 이미지를 생성해 RPG 형식 카드뉴스 5장 제작</w:t>
+            </w:r>
+          </w:p>
+          <w:p>
+            <w:pPr>
+              <w:ind w:left="170" w:hanging="170"/>
+            </w:pPr>
+            <w:r>
+              <w:t xml:space="preserve">• </w:t>
+            </w:r>
+            <w:r>
+              <w:rPr>
+                <w:b/>
+              </w:rPr>
+              <w:t>카드뉴스 인기상</w:t>
+            </w:r>
+          </w:p>
+        </w:tc>
+      </w:tr>
+    </w:tbl>
     <w:p>
       <w:pPr>
         <w:keepNext/>
-        <w:keepLines/>
-        <w:spacing w:line="270" w:lineRule="exact" w:before="0" w:after="40"/>
-      </w:pPr>
-      <w:r>
-        <w:rPr>
-          <w:color w:val="000000"/>
-          <w:sz w:val="22"/>
-        </w:rPr>
-        <w:t>값·상태·시각을 구분해 응답 기준과 화면 정책으로 정리합니다.</w:t>
-      </w:r>
-    </w:p>
-    <w:p>
-      <w:pPr>
-        <w:keepNext w:val="0"/>
-        <w:keepLines/>
-        <w:spacing w:line="270" w:lineRule="exact" w:before="0" w:after="40"/>
+        <w:spacing w:before="200" w:after="60"/>
       </w:pPr>
       <w:r>
         <w:rPr>
           <w:b/>
           <w:sz w:val="22"/>
         </w:rPr>
-        <w:t xml:space="preserve">근거 · </w:t>
-      </w:r>
-      <w:r>
-        <w:rPr>
-          <w:color w:val="000000"/>
-          <w:sz w:val="22"/>
-        </w:rPr>
-        <w:t>양주 0석·정보 없음·빈 슬롯 구분과 오래된 정보(stale) 기준, Dear Log 데모 수정 요청 10건</w:t>
+        <w:t>▌수상</w:t>
       </w:r>
     </w:p>
-    <w:p>
-      <w:pPr>
-        <w:pStyle w:val="Heading2"/>
-        <w:keepNext/>
-        <w:keepLines/>
-        <w:spacing w:line="270" w:lineRule="exact" w:before="80" w:after="20"/>
-      </w:pPr>
-      <w:r>
-        <w:rPr>
-          <w:b/>
-          <w:color w:val="000000"/>
-          <w:sz w:val="22"/>
-        </w:rPr>
-        <w:t>공개 범위와 팀 역할 조율</w:t>
-      </w:r>
-    </w:p>
+    <w:tbl>
+      <w:tblPr>
+        <w:tblW w:type="auto" w:w="0"/>
+        <w:tblLayout w:type="fixed"/>
+        <w:tblLook w:firstColumn="1" w:firstRow="1" w:lastColumn="0" w:lastRow="0" w:noHBand="0" w:noVBand="1" w:val="04A0"/>
+        <w:tblBorders>
+          <w:top w:val="single" w:sz="10" w:color="1A1A1A"/>
+          <w:left w:val="single" w:sz="4" w:color="B8B8B8"/>
+          <w:bottom w:val="single" w:sz="4" w:color="B8B8B8"/>
+          <w:right w:val="single" w:sz="4" w:color="B8B8B8"/>
+          <w:insideH w:val="single" w:sz="4" w:color="B8B8B8"/>
+          <w:insideV w:val="single" w:sz="4" w:color="B8B8B8"/>
+        </w:tblBorders>
+        <w:tblLayout w:type="fixed"/>
+      </w:tblPr>
+      <w:tblGrid>
+        <w:gridCol w:w="1701"/>
+        <w:gridCol w:w="4989"/>
+        <w:gridCol w:w="2041"/>
+        <w:gridCol w:w="1587"/>
+      </w:tblGrid>
+      <w:tr>
+        <w:trPr>
+          <w:cantSplit/>
+          <w:tblHeader/>
+        </w:trPr>
+        <w:tc>
+          <w:tcPr>
+            <w:tcW w:type="dxa" w:w="1701"/>
+            <w:shd w:val="clear" w:color="auto" w:fill="F0F0F0"/>
+            <w:vAlign w:val="center"/>
+          </w:tcPr>
+          <w:p>
+            <w:pPr>
+              <w:jc w:val="center"/>
+            </w:pPr>
+            <w:r>
+              <w:rPr>
+                <w:b/>
+              </w:rPr>
+            </w:r>
+            <w:r>
+              <w:rPr>
+                <w:b/>
+              </w:rPr>
+              <w:t>연도</w:t>
+            </w:r>
+          </w:p>
+        </w:tc>
+        <w:tc>
+          <w:tcPr>
+            <w:tcW w:type="dxa" w:w="4989"/>
+            <w:shd w:val="clear" w:color="auto" w:fill="F0F0F0"/>
+            <w:vAlign w:val="center"/>
+          </w:tcPr>
+          <w:p>
+            <w:pPr>
+              <w:jc w:val="center"/>
+            </w:pPr>
+            <w:r>
+              <w:rPr>
+                <w:b/>
+              </w:rPr>
+            </w:r>
+            <w:r>
+              <w:rPr>
+                <w:b/>
+              </w:rPr>
+              <w:t>대회</w:t>
+            </w:r>
+          </w:p>
+        </w:tc>
+        <w:tc>
+          <w:tcPr>
+            <w:tcW w:type="dxa" w:w="2041"/>
+            <w:shd w:val="clear" w:color="auto" w:fill="F0F0F0"/>
+            <w:vAlign w:val="center"/>
+          </w:tcPr>
+          <w:p>
+            <w:pPr>
+              <w:jc w:val="center"/>
+            </w:pPr>
+            <w:r>
+              <w:rPr>
+                <w:b/>
+              </w:rPr>
+            </w:r>
+            <w:r>
+              <w:rPr>
+                <w:b/>
+              </w:rPr>
+              <w:t>수상</w:t>
+            </w:r>
+          </w:p>
+        </w:tc>
+        <w:tc>
+          <w:tcPr>
+            <w:tcW w:type="dxa" w:w="1587"/>
+            <w:shd w:val="clear" w:color="auto" w:fill="F0F0F0"/>
+            <w:vAlign w:val="center"/>
+          </w:tcPr>
+          <w:p>
+            <w:pPr>
+              <w:jc w:val="center"/>
+            </w:pPr>
+            <w:r>
+              <w:rPr>
+                <w:b/>
+              </w:rPr>
+            </w:r>
+            <w:r>
+              <w:rPr>
+                <w:b/>
+              </w:rPr>
+              <w:t>구분</w:t>
+            </w:r>
+          </w:p>
+        </w:tc>
+      </w:tr>
+      <w:tr>
+        <w:trPr>
+          <w:cantSplit/>
+        </w:trPr>
+        <w:tc>
+          <w:tcPr>
+            <w:tcW w:type="dxa" w:w="1701"/>
+            <w:vAlign w:val="center"/>
+          </w:tcPr>
+          <w:p>
+            <w:pPr>
+              <w:jc w:val="center"/>
+            </w:pPr>
+            <w:r/>
+            <w:r>
+              <w:t>2025</w:t>
+            </w:r>
+          </w:p>
+        </w:tc>
+        <w:tc>
+          <w:tcPr>
+            <w:tcW w:type="dxa" w:w="4989"/>
+            <w:vAlign w:val="center"/>
+          </w:tcPr>
+          <w:p>
+            <w:r/>
+            <w:r>
+              <w:t>경기청년 연구 랩업(Lab Up!) · 온통청년</w:t>
+            </w:r>
+          </w:p>
+        </w:tc>
+        <w:tc>
+          <w:tcPr>
+            <w:tcW w:type="dxa" w:w="2041"/>
+            <w:vAlign w:val="center"/>
+          </w:tcPr>
+          <w:p>
+            <w:pPr>
+              <w:jc w:val="center"/>
+            </w:pPr>
+            <w:r/>
+            <w:r>
+              <w:t>대상</w:t>
+            </w:r>
+          </w:p>
+        </w:tc>
+        <w:tc>
+          <w:tcPr>
+            <w:tcW w:type="dxa" w:w="1587"/>
+            <w:vAlign w:val="center"/>
+          </w:tcPr>
+          <w:p>
+            <w:pPr>
+              <w:jc w:val="center"/>
+            </w:pPr>
+            <w:r/>
+            <w:r>
+              <w:t>팀</w:t>
+            </w:r>
+          </w:p>
+        </w:tc>
+      </w:tr>
+      <w:tr>
+        <w:trPr>
+          <w:cantSplit/>
+        </w:trPr>
+        <w:tc>
+          <w:tcPr>
+            <w:tcW w:type="dxa" w:w="1701"/>
+            <w:vAlign w:val="center"/>
+          </w:tcPr>
+          <w:p>
+            <w:pPr>
+              <w:jc w:val="center"/>
+            </w:pPr>
+            <w:r/>
+            <w:r>
+              <w:t>2026</w:t>
+            </w:r>
+          </w:p>
+        </w:tc>
+        <w:tc>
+          <w:tcPr>
+            <w:tcW w:type="dxa" w:w="4989"/>
+            <w:vAlign w:val="center"/>
+          </w:tcPr>
+          <w:p>
+            <w:r/>
+            <w:r>
+              <w:t>KBI 금융 AI 리터러시 자격 홍보 콘텐츠 공모전</w:t>
+            </w:r>
+          </w:p>
+        </w:tc>
+        <w:tc>
+          <w:tcPr>
+            <w:tcW w:type="dxa" w:w="2041"/>
+            <w:vAlign w:val="center"/>
+          </w:tcPr>
+          <w:p>
+            <w:pPr>
+              <w:jc w:val="center"/>
+            </w:pPr>
+            <w:r/>
+            <w:r>
+              <w:t>카드뉴스 인기상</w:t>
+            </w:r>
+          </w:p>
+        </w:tc>
+        <w:tc>
+          <w:tcPr>
+            <w:tcW w:type="dxa" w:w="1587"/>
+            <w:vAlign w:val="center"/>
+          </w:tcPr>
+          <w:p>
+            <w:pPr>
+              <w:jc w:val="center"/>
+            </w:pPr>
+            <w:r/>
+            <w:r>
+              <w:t>개인</w:t>
+            </w:r>
+          </w:p>
+        </w:tc>
+      </w:tr>
+    </w:tbl>
     <w:p>
       <w:pPr>
         <w:keepNext/>
-        <w:keepLines/>
-        <w:spacing w:line="270" w:lineRule="exact" w:before="0" w:after="40"/>
-      </w:pPr>
-      <w:r>
-        <w:rPr>
-          <w:color w:val="000000"/>
-          <w:sz w:val="22"/>
-        </w:rPr>
-        <w:t>검수할 수 없는 수치는 공개하지 않도록 범위를 정하고, 팀원 강점에 맞춰 역할을 나눕니다.</w:t>
-      </w:r>
-    </w:p>
-    <w:p>
-      <w:pPr>
-        <w:keepNext w:val="0"/>
-        <w:keepLines/>
-        <w:spacing w:line="270" w:lineRule="exact" w:before="0" w:after="40"/>
+        <w:spacing w:before="200" w:after="60"/>
       </w:pPr>
       <w:r>
         <w:rPr>
           <w:b/>
           <w:sz w:val="22"/>
         </w:rPr>
-        <w:t xml:space="preserve">근거 · </w:t>
-      </w:r>
-      <w:r>
-        <w:rPr>
-          <w:color w:val="000000"/>
-          <w:sz w:val="22"/>
-        </w:rPr>
-        <w:t>NCA 평가 수치 공개 중단·자료 대조 전환 제안과 조건부 승인, Finsight 5인 팀 수집·파싱 역할 조정</w:t>
+        <w:t>▌교육 이수</w:t>
       </w:r>
     </w:p>
-    <w:p>
-      <w:pPr>
-        <w:pStyle w:val="Heading1"/>
-        <w:keepNext/>
-        <w:keepLines/>
-        <w:spacing w:line="320" w:lineRule="exact" w:before="140" w:after="60"/>
-      </w:pPr>
-      <w:r>
-        <w:rPr>
-          <w:b/>
-          <w:color w:val="000000"/>
-          <w:sz w:val="26"/>
-        </w:rPr>
-        <w:t>학력</w:t>
-      </w:r>
-    </w:p>
-    <w:p>
-      <w:pPr>
-        <w:pStyle w:val="Heading2"/>
-        <w:keepNext/>
-        <w:keepLines/>
-        <w:spacing w:line="270" w:lineRule="exact" w:before="80" w:after="20"/>
-      </w:pPr>
-      <w:r>
-        <w:rPr>
-          <w:b/>
-          <w:color w:val="000000"/>
-          <w:sz w:val="22"/>
-        </w:rPr>
-        <w:t>국민대학교</w:t>
-      </w:r>
-    </w:p>
+    <w:tbl>
+      <w:tblPr>
+        <w:tblW w:type="auto" w:w="0"/>
+        <w:tblLayout w:type="fixed"/>
+        <w:tblLook w:firstColumn="1" w:firstRow="1" w:lastColumn="0" w:lastRow="0" w:noHBand="0" w:noVBand="1" w:val="04A0"/>
+        <w:tblBorders>
+          <w:top w:val="single" w:sz="10" w:color="1A1A1A"/>
+          <w:left w:val="single" w:sz="4" w:color="B8B8B8"/>
+          <w:bottom w:val="single" w:sz="4" w:color="B8B8B8"/>
+          <w:right w:val="single" w:sz="4" w:color="B8B8B8"/>
+          <w:insideH w:val="single" w:sz="4" w:color="B8B8B8"/>
+          <w:insideV w:val="single" w:sz="4" w:color="B8B8B8"/>
+        </w:tblBorders>
+        <w:tblLayout w:type="fixed"/>
+      </w:tblPr>
+      <w:tblGrid>
+        <w:gridCol w:w="1701"/>
+        <w:gridCol w:w="4989"/>
+        <w:gridCol w:w="3628"/>
+      </w:tblGrid>
+      <w:tr>
+        <w:trPr>
+          <w:cantSplit/>
+          <w:tblHeader/>
+        </w:trPr>
+        <w:tc>
+          <w:tcPr>
+            <w:tcW w:type="dxa" w:w="1701"/>
+            <w:shd w:val="clear" w:color="auto" w:fill="F0F0F0"/>
+            <w:vAlign w:val="center"/>
+          </w:tcPr>
+          <w:p>
+            <w:pPr>
+              <w:jc w:val="center"/>
+            </w:pPr>
+            <w:r>
+              <w:rPr>
+                <w:b/>
+              </w:rPr>
+            </w:r>
+            <w:r>
+              <w:rPr>
+                <w:b/>
+              </w:rPr>
+              <w:t>기간</w:t>
+            </w:r>
+          </w:p>
+        </w:tc>
+        <w:tc>
+          <w:tcPr>
+            <w:tcW w:type="dxa" w:w="4989"/>
+            <w:shd w:val="clear" w:color="auto" w:fill="F0F0F0"/>
+            <w:vAlign w:val="center"/>
+          </w:tcPr>
+          <w:p>
+            <w:pPr>
+              <w:jc w:val="center"/>
+            </w:pPr>
+            <w:r>
+              <w:rPr>
+                <w:b/>
+              </w:rPr>
+            </w:r>
+            <w:r>
+              <w:rPr>
+                <w:b/>
+              </w:rPr>
+              <w:t>과정</w:t>
+            </w:r>
+          </w:p>
+        </w:tc>
+        <w:tc>
+          <w:tcPr>
+            <w:tcW w:type="dxa" w:w="3628"/>
+            <w:shd w:val="clear" w:color="auto" w:fill="F0F0F0"/>
+            <w:vAlign w:val="center"/>
+          </w:tcPr>
+          <w:p>
+            <w:pPr>
+              <w:jc w:val="center"/>
+            </w:pPr>
+            <w:r>
+              <w:rPr>
+                <w:b/>
+              </w:rPr>
+            </w:r>
+            <w:r>
+              <w:rPr>
+                <w:b/>
+              </w:rPr>
+              <w:t>내용</w:t>
+            </w:r>
+          </w:p>
+        </w:tc>
+      </w:tr>
+      <w:tr>
+        <w:trPr>
+          <w:cantSplit/>
+        </w:trPr>
+        <w:tc>
+          <w:tcPr>
+            <w:tcW w:type="dxa" w:w="1701"/>
+            <w:vAlign w:val="center"/>
+          </w:tcPr>
+          <w:p>
+            <w:pPr>
+              <w:jc w:val="center"/>
+            </w:pPr>
+            <w:r/>
+            <w:r>
+              <w:t>2024.12.02–12.13</w:t>
+            </w:r>
+          </w:p>
+        </w:tc>
+        <w:tc>
+          <w:tcPr>
+            <w:tcW w:type="dxa" w:w="4989"/>
+            <w:vAlign w:val="center"/>
+          </w:tcPr>
+          <w:p>
+            <w:r/>
+            <w:r>
+              <w:t>수도권 ICT 이노베이션스퀘어 서비스 기획 과정</w:t>
+            </w:r>
+          </w:p>
+        </w:tc>
+        <w:tc>
+          <w:tcPr>
+            <w:tcW w:type="dxa" w:w="3628"/>
+            <w:vAlign w:val="center"/>
+          </w:tcPr>
+          <w:p>
+            <w:r/>
+            <w:r>
+              <w:t>40시간 수료</w:t>
+            </w:r>
+          </w:p>
+        </w:tc>
+      </w:tr>
+      <w:tr>
+        <w:trPr>
+          <w:cantSplit/>
+        </w:trPr>
+        <w:tc>
+          <w:tcPr>
+            <w:tcW w:type="dxa" w:w="1701"/>
+            <w:vAlign w:val="center"/>
+          </w:tcPr>
+          <w:p>
+            <w:pPr>
+              <w:jc w:val="center"/>
+            </w:pPr>
+            <w:r/>
+            <w:r>
+              <w:t>2024.04.01–06.19</w:t>
+            </w:r>
+          </w:p>
+        </w:tc>
+        <w:tc>
+          <w:tcPr>
+            <w:tcW w:type="dxa" w:w="4989"/>
+            <w:vAlign w:val="center"/>
+          </w:tcPr>
+          <w:p>
+            <w:r/>
+            <w:r>
+              <w:t>국립한국교통대학교 산업 인공지능 과정</w:t>
+            </w:r>
+          </w:p>
+        </w:tc>
+        <w:tc>
+          <w:tcPr>
+            <w:tcW w:type="dxa" w:w="3628"/>
+            <w:vAlign w:val="center"/>
+          </w:tcPr>
+          <w:p>
+            <w:r/>
+            <w:r>
+              <w:t>Python, Jupyter Notebook 기초</w:t>
+            </w:r>
+          </w:p>
+        </w:tc>
+      </w:tr>
+      <w:tr>
+        <w:trPr>
+          <w:cantSplit/>
+        </w:trPr>
+        <w:tc>
+          <w:tcPr>
+            <w:tcW w:type="dxa" w:w="1701"/>
+            <w:vAlign w:val="center"/>
+          </w:tcPr>
+          <w:p>
+            <w:pPr>
+              <w:jc w:val="center"/>
+            </w:pPr>
+            <w:r/>
+            <w:r>
+              <w:t>2023</w:t>
+            </w:r>
+          </w:p>
+        </w:tc>
+        <w:tc>
+          <w:tcPr>
+            <w:tcW w:type="dxa" w:w="4989"/>
+            <w:vAlign w:val="center"/>
+          </w:tcPr>
+          <w:p>
+            <w:r/>
+            <w:r>
+              <w:t>서울 ICT 이노베이션스퀘어 데이터 엔지니어링 중급 과정</w:t>
+            </w:r>
+          </w:p>
+        </w:tc>
+        <w:tc>
+          <w:tcPr>
+            <w:tcW w:type="dxa" w:w="3628"/>
+            <w:vAlign w:val="center"/>
+          </w:tcPr>
+          <w:p>
+            <w:r/>
+            <w:r>
+              <w:t>SQL, Spark, Kafka, Flink, Airflow</w:t>
+            </w:r>
+          </w:p>
+        </w:tc>
+      </w:tr>
+    </w:tbl>
     <w:p>
       <w:pPr>
         <w:keepNext/>
-        <w:keepLines/>
-        <w:spacing w:line="270" w:lineRule="exact" w:before="0" w:after="40"/>
-      </w:pPr>
-      <w:r>
-        <w:rPr>
-          <w:color w:val="000000"/>
-          <w:sz w:val="22"/>
-        </w:rPr>
-        <w:t>AI빅데이터융합경영학 · 경영정보학 복수전공</w:t>
-      </w:r>
-    </w:p>
-    <w:p>
-      <w:pPr>
-        <w:keepNext w:val="0"/>
-        <w:keepLines/>
-        <w:spacing w:line="270" w:lineRule="exact" w:before="0" w:after="40"/>
-      </w:pPr>
-      <w:r>
-        <w:rPr>
-          <w:color w:val="000000"/>
-          <w:sz w:val="22"/>
-        </w:rPr>
-        <w:t>2019.03-2026.08 · 졸업 · 학점 3.24/4.5</w:t>
-      </w:r>
-    </w:p>
-    <w:p>
-      <w:pPr>
-        <w:pStyle w:val="Heading1"/>
-        <w:keepNext/>
-        <w:keepLines/>
-        <w:spacing w:line="320" w:lineRule="exact" w:before="140" w:after="60"/>
-      </w:pPr>
-      <w:r>
-        <w:rPr>
-          <w:b/>
-          <w:color w:val="000000"/>
-          <w:sz w:val="26"/>
-        </w:rPr>
-        <w:t>교육 이수</w:t>
-      </w:r>
-    </w:p>
-    <w:p>
-      <w:pPr>
-        <w:pStyle w:val="Heading2"/>
-        <w:keepNext/>
-        <w:keepLines/>
-        <w:spacing w:line="270" w:lineRule="exact" w:before="80" w:after="20"/>
-      </w:pPr>
-      <w:r>
-        <w:rPr>
-          <w:b/>
-          <w:color w:val="000000"/>
-          <w:sz w:val="22"/>
-        </w:rPr>
-        <w:t>수도권 ICT 이노베이션스퀘어 서비스 기획 과정</w:t>
-      </w:r>
-    </w:p>
-    <w:p>
-      <w:pPr>
-        <w:keepNext w:val="0"/>
-        <w:keepLines/>
-        <w:spacing w:line="270" w:lineRule="exact" w:before="0" w:after="40"/>
-      </w:pPr>
-      <w:r>
-        <w:rPr>
-          <w:color w:val="000000"/>
-          <w:sz w:val="22"/>
-        </w:rPr>
-        <w:t>2024.12.02-12.13 · 40시간 수료</w:t>
-      </w:r>
-    </w:p>
-    <w:p>
-      <w:pPr>
-        <w:pStyle w:val="Heading2"/>
-        <w:keepNext/>
-        <w:keepLines/>
-        <w:spacing w:line="270" w:lineRule="exact" w:before="80" w:after="20"/>
-      </w:pPr>
-      <w:r>
-        <w:rPr>
-          <w:b/>
-          <w:color w:val="000000"/>
-          <w:sz w:val="22"/>
-        </w:rPr>
-        <w:t>국립한국교통대학교 산업 인공지능 과정</w:t>
-      </w:r>
-    </w:p>
-    <w:p>
-      <w:pPr>
-        <w:keepNext w:val="0"/>
-        <w:keepLines/>
-        <w:spacing w:line="270" w:lineRule="exact" w:before="0" w:after="40"/>
-      </w:pPr>
-      <w:r>
-        <w:rPr>
-          <w:color w:val="000000"/>
-          <w:sz w:val="22"/>
-        </w:rPr>
-        <w:t>2024.04.01-06.19 · Python·Jupyter Notebook의 변수·기본 자료형 교육 수료</w:t>
-      </w:r>
-    </w:p>
-    <w:p>
-      <w:pPr>
-        <w:pStyle w:val="Heading2"/>
-        <w:keepNext/>
-        <w:keepLines/>
-        <w:spacing w:line="270" w:lineRule="exact" w:before="80" w:after="20"/>
-      </w:pPr>
-      <w:r>
-        <w:rPr>
-          <w:b/>
-          <w:color w:val="000000"/>
-          <w:sz w:val="22"/>
-        </w:rPr>
-        <w:t>서울 ICT 이노베이션스퀘어 데이터 엔지니어링 중급 과정</w:t>
-      </w:r>
-    </w:p>
-    <w:p>
-      <w:pPr>
-        <w:keepNext w:val="0"/>
-        <w:keepLines/>
-        <w:spacing w:line="270" w:lineRule="exact" w:before="0" w:after="40"/>
-      </w:pPr>
-      <w:r>
-        <w:rPr>
-          <w:color w:val="000000"/>
-          <w:sz w:val="22"/>
-        </w:rPr>
-        <w:t>2023 · SQL·Spark, Kafka·Flink, Airflow 교육 수료</w:t>
-      </w:r>
-    </w:p>
-    <w:p>
-      <w:pPr>
-        <w:pStyle w:val="Heading1"/>
-        <w:keepNext/>
-        <w:keepLines/>
-        <w:spacing w:line="320" w:lineRule="exact" w:before="140" w:after="60"/>
-      </w:pPr>
-      <w:r>
-        <w:rPr>
-          <w:b/>
-          <w:color w:val="000000"/>
-          <w:sz w:val="26"/>
-        </w:rPr>
-        <w:t>경험사항</w:t>
-      </w:r>
-    </w:p>
-    <w:p>
-      <w:pPr>
-        <w:pStyle w:val="Heading2"/>
-        <w:keepNext/>
-        <w:keepLines/>
-        <w:spacing w:line="270" w:lineRule="exact" w:before="80" w:after="20"/>
-      </w:pPr>
-      <w:r>
-        <w:rPr>
-          <w:b/>
-          <w:color w:val="000000"/>
-          <w:sz w:val="22"/>
-        </w:rPr>
-        <w:t>셀렉트스타 프로젝트3팀</w:t>
-      </w:r>
-    </w:p>
-    <w:p>
-      <w:pPr>
-        <w:keepNext/>
-        <w:keepLines/>
-        <w:spacing w:line="270" w:lineRule="exact" w:before="0" w:after="40"/>
-      </w:pPr>
-      <w:r>
-        <w:rPr>
-          <w:color w:val="000000"/>
-          <w:sz w:val="21"/>
-        </w:rPr>
-        <w:t>2025.09-12 · Data Assistant</w:t>
-      </w:r>
-    </w:p>
-    <w:p>
-      <w:pPr>
-        <w:keepNext/>
-        <w:keepLines/>
-        <w:spacing w:line="270" w:lineRule="exact" w:before="0" w:after="40"/>
-      </w:pPr>
-      <w:r>
-        <w:rPr>
-          <w:color w:val="000000"/>
-          <w:sz w:val="22"/>
-        </w:rPr>
-        <w:t>LLM 검수 프롬프트 초안을 작성하고 모델별 결과를 비교했습니다. 질문·답변을 어노테이션하고 근거 부족·질문 미응답·표기 오류를 작업시트에 남겼습니다.</w:t>
-      </w:r>
-    </w:p>
-    <w:p>
-      <w:pPr>
-        <w:keepNext w:val="0"/>
-        <w:keepLines/>
-        <w:spacing w:line="270" w:lineRule="exact" w:before="0" w:after="40"/>
+        <w:spacing w:before="200" w:after="60"/>
       </w:pPr>
       <w:r>
         <w:rPr>
           <w:b/>
           <w:sz w:val="22"/>
         </w:rPr>
-        <w:t xml:space="preserve">결과 · </w:t>
-      </w:r>
-      <w:r>
-        <w:rPr>
-          <w:color w:val="000000"/>
-          <w:sz w:val="22"/>
-        </w:rPr>
-        <w:t>검수 프롬프트 초안과 오류 비고 기록</w:t>
+        <w:t>▌핵심 역량</w:t>
       </w:r>
     </w:p>
-    <w:p>
-      <w:pPr>
-        <w:pStyle w:val="Heading2"/>
-        <w:keepNext/>
-        <w:keepLines/>
-        <w:spacing w:line="270" w:lineRule="exact" w:before="80" w:after="20"/>
-      </w:pPr>
-      <w:r>
-        <w:rPr>
-          <w:b/>
-          <w:color w:val="000000"/>
-          <w:sz w:val="22"/>
-        </w:rPr>
-        <w:t>한국금융연수원 출판미디어사업부</w:t>
-      </w:r>
-    </w:p>
-    <w:p>
-      <w:pPr>
-        <w:keepNext w:val="0"/>
-        <w:keepLines/>
-        <w:spacing w:line="270" w:lineRule="exact" w:before="0" w:after="40"/>
-      </w:pPr>
-      <w:r>
-        <w:rPr>
-          <w:color w:val="000000"/>
-          <w:sz w:val="21"/>
-        </w:rPr>
-        <w:t>2024.01-12 · 아르바이트 · 사무보조</w:t>
-      </w:r>
-    </w:p>
-    <w:p>
-      <w:r>
-        <w:br w:type="page"/>
-      </w:r>
-    </w:p>
-    <w:p>
-      <w:pPr>
-        <w:pStyle w:val="Heading1"/>
-        <w:keepNext/>
-        <w:keepLines/>
-        <w:spacing w:line="320" w:lineRule="exact" w:before="140" w:after="60"/>
-      </w:pPr>
-      <w:r>
-        <w:rPr>
-          <w:b/>
-          <w:color w:val="000000"/>
-          <w:sz w:val="26"/>
-        </w:rPr>
-        <w:t>대표 프로젝트 경험</w:t>
-      </w:r>
-    </w:p>
-    <w:p>
-      <w:pPr>
-        <w:pStyle w:val="Heading2"/>
-        <w:keepNext/>
-        <w:keepLines/>
-        <w:spacing w:line="270" w:lineRule="exact" w:before="80" w:after="20"/>
-      </w:pPr>
-      <w:r>
-        <w:rPr>
-          <w:b/>
-          <w:color w:val="000000"/>
-          <w:sz w:val="22"/>
-        </w:rPr>
-        <w:t>온통청년 경기청년 연구 랩업</w:t>
-      </w:r>
-    </w:p>
+    <w:tbl>
+      <w:tblPr>
+        <w:tblW w:type="auto" w:w="0"/>
+        <w:tblLayout w:type="fixed"/>
+        <w:tblLook w:firstColumn="1" w:firstRow="1" w:lastColumn="0" w:lastRow="0" w:noHBand="0" w:noVBand="1" w:val="04A0"/>
+        <w:tblBorders>
+          <w:top w:val="single" w:sz="10" w:color="1A1A1A"/>
+          <w:left w:val="single" w:sz="4" w:color="B8B8B8"/>
+          <w:bottom w:val="single" w:sz="4" w:color="B8B8B8"/>
+          <w:right w:val="single" w:sz="4" w:color="B8B8B8"/>
+          <w:insideH w:val="single" w:sz="4" w:color="B8B8B8"/>
+          <w:insideV w:val="single" w:sz="4" w:color="B8B8B8"/>
+        </w:tblBorders>
+        <w:tblLayout w:type="fixed"/>
+      </w:tblPr>
+      <w:tblGrid>
+        <w:gridCol w:w="1701"/>
+        <w:gridCol w:w="4989"/>
+        <w:gridCol w:w="3628"/>
+      </w:tblGrid>
+      <w:tr>
+        <w:trPr>
+          <w:cantSplit/>
+          <w:tblHeader/>
+        </w:trPr>
+        <w:tc>
+          <w:tcPr>
+            <w:tcW w:type="dxa" w:w="1701"/>
+            <w:shd w:val="clear" w:color="auto" w:fill="F0F0F0"/>
+            <w:vAlign w:val="center"/>
+          </w:tcPr>
+          <w:p>
+            <w:pPr>
+              <w:jc w:val="center"/>
+            </w:pPr>
+            <w:r>
+              <w:rPr>
+                <w:b/>
+              </w:rPr>
+            </w:r>
+            <w:r>
+              <w:rPr>
+                <w:b/>
+              </w:rPr>
+              <w:t>역량</w:t>
+            </w:r>
+          </w:p>
+        </w:tc>
+        <w:tc>
+          <w:tcPr>
+            <w:tcW w:type="dxa" w:w="4989"/>
+            <w:shd w:val="clear" w:color="auto" w:fill="F0F0F0"/>
+            <w:vAlign w:val="center"/>
+          </w:tcPr>
+          <w:p>
+            <w:pPr>
+              <w:jc w:val="center"/>
+            </w:pPr>
+            <w:r>
+              <w:rPr>
+                <w:b/>
+              </w:rPr>
+            </w:r>
+            <w:r>
+              <w:rPr>
+                <w:b/>
+              </w:rPr>
+              <w:t>내용</w:t>
+            </w:r>
+          </w:p>
+        </w:tc>
+        <w:tc>
+          <w:tcPr>
+            <w:tcW w:type="dxa" w:w="3628"/>
+            <w:shd w:val="clear" w:color="auto" w:fill="F0F0F0"/>
+            <w:vAlign w:val="center"/>
+          </w:tcPr>
+          <w:p>
+            <w:pPr>
+              <w:jc w:val="center"/>
+            </w:pPr>
+            <w:r>
+              <w:rPr>
+                <w:b/>
+              </w:rPr>
+            </w:r>
+            <w:r>
+              <w:rPr>
+                <w:b/>
+              </w:rPr>
+              <w:t>근거</w:t>
+            </w:r>
+          </w:p>
+        </w:tc>
+      </w:tr>
+      <w:tr>
+        <w:trPr>
+          <w:cantSplit/>
+        </w:trPr>
+        <w:tc>
+          <w:tcPr>
+            <w:tcW w:type="dxa" w:w="1701"/>
+            <w:vAlign w:val="center"/>
+          </w:tcPr>
+          <w:p>
+            <w:r/>
+            <w:r>
+              <w:rPr>
+                <w:b/>
+              </w:rPr>
+              <w:t>응답 기준 작성</w:t>
+            </w:r>
+          </w:p>
+        </w:tc>
+        <w:tc>
+          <w:tcPr>
+            <w:tcW w:type="dxa" w:w="4989"/>
+            <w:vAlign w:val="center"/>
+          </w:tcPr>
+          <w:p>
+            <w:r/>
+            <w:r>
+              <w:t>같은 '없음'도 상황별로 나눠 화면 문구와 API 응답을 정함</w:t>
+            </w:r>
+          </w:p>
+        </w:tc>
+        <w:tc>
+          <w:tcPr>
+            <w:tcW w:type="dxa" w:w="3628"/>
+            <w:vAlign w:val="center"/>
+          </w:tcPr>
+          <w:p>
+            <w:r/>
+            <w:r>
+              <w:t>양주 좌석 상태 구분, Dear Log 수정 요청 10건</w:t>
+            </w:r>
+          </w:p>
+        </w:tc>
+      </w:tr>
+      <w:tr>
+        <w:trPr>
+          <w:cantSplit/>
+        </w:trPr>
+        <w:tc>
+          <w:tcPr>
+            <w:tcW w:type="dxa" w:w="1701"/>
+            <w:vAlign w:val="center"/>
+          </w:tcPr>
+          <w:p>
+            <w:r/>
+            <w:r>
+              <w:rPr>
+                <w:b/>
+              </w:rPr>
+              <w:t>공개 범위 판단</w:t>
+            </w:r>
+          </w:p>
+        </w:tc>
+        <w:tc>
+          <w:tcPr>
+            <w:tcW w:type="dxa" w:w="4989"/>
+            <w:vAlign w:val="center"/>
+          </w:tcPr>
+          <w:p>
+            <w:r/>
+            <w:r>
+              <w:t>검증할 수 없는 수치는 공개하지 않고, 역할은 팀원 강점에 맞춰 나눔</w:t>
+            </w:r>
+          </w:p>
+        </w:tc>
+        <w:tc>
+          <w:tcPr>
+            <w:tcW w:type="dxa" w:w="3628"/>
+            <w:vAlign w:val="center"/>
+          </w:tcPr>
+          <w:p>
+            <w:r/>
+            <w:r>
+              <w:t>NCA 점수 공개 중단, Finsight 역할 조정</w:t>
+            </w:r>
+          </w:p>
+        </w:tc>
+      </w:tr>
+    </w:tbl>
     <w:p>
       <w:pPr>
         <w:keepNext/>
-        <w:keepLines/>
-        <w:spacing w:line="270" w:lineRule="exact" w:before="0" w:after="40"/>
-      </w:pPr>
-      <w:r>
-        <w:rPr>
-          <w:color w:val="000000"/>
-          <w:sz w:val="21"/>
-        </w:rPr>
-        <w:t>2025.06-10 · 3인 팀 · 팀장 · 시설 범위 제안 · 교통 데이터 · 보고서·제언 초안</w:t>
-      </w:r>
-    </w:p>
-    <w:p>
-      <w:pPr>
-        <w:keepNext/>
-        <w:keepLines/>
-        <w:spacing w:line="270" w:lineRule="exact" w:before="0" w:after="40"/>
-      </w:pPr>
-      <w:r>
-        <w:rPr>
-          <w:color w:val="000000"/>
-          <w:sz w:val="22"/>
-        </w:rPr>
-        <w:t>청년 시설을 어디까지 셀지 세 안 중 청소년·민간 문화시설 포함을 제안해 보고서 기준으로 확정했습니다. 일정 지연 때 의정부·과천 우선 검토로 좁혔고, 보고서·정책 제언 초안을 쓰고 Claude로 문장을 다듬었습니다.</w:t>
-      </w:r>
-    </w:p>
-    <w:p>
-      <w:pPr>
-        <w:keepNext w:val="0"/>
-        <w:keepLines/>
-        <w:spacing w:line="270" w:lineRule="exact" w:before="0" w:after="40"/>
+        <w:spacing w:before="200" w:after="60"/>
       </w:pPr>
       <w:r>
         <w:rPr>
           <w:b/>
           <w:sz w:val="22"/>
         </w:rPr>
-        <w:t xml:space="preserve">결과 · </w:t>
-      </w:r>
-      <w:r>
-        <w:rPr>
-          <w:color w:val="000000"/>
-          <w:sz w:val="22"/>
-        </w:rPr>
-        <w:t>57쪽 공동 보고서. 2025 경기청년 연구 랩업 대상(23팀 발표·6팀 수상, 팀 수상). 시설 정제는 팀원.</w:t>
+        <w:t>▌도구</w:t>
       </w:r>
     </w:p>
-    <w:p>
-      <w:pPr>
-        <w:pStyle w:val="Heading2"/>
-        <w:keepNext/>
-        <w:keepLines/>
-        <w:spacing w:line="270" w:lineRule="exact" w:before="80" w:after="20"/>
-      </w:pPr>
-      <w:r>
-        <w:rPr>
-          <w:b/>
-          <w:color w:val="000000"/>
-          <w:sz w:val="22"/>
-        </w:rPr>
-        <w:t>NCA 공약과 공식자료 대조</w:t>
-      </w:r>
-    </w:p>
-    <w:p>
-      <w:pPr>
-        <w:keepNext/>
-        <w:keepLines/>
-        <w:spacing w:line="270" w:lineRule="exact" w:before="0" w:after="40"/>
-      </w:pPr>
-      <w:r>
-        <w:rPr>
-          <w:color w:val="000000"/>
-          <w:sz w:val="21"/>
-        </w:rPr>
-        <w:t>2025-2026 · 2025 데이터 엔지니어링 · 2026 전환 제안·검토·승인(AI 협업 구현)</w:t>
-      </w:r>
-    </w:p>
-    <w:p>
-      <w:pPr>
-        <w:keepNext/>
-        <w:keepLines/>
-        <w:spacing w:line="270" w:lineRule="exact" w:before="0" w:after="40"/>
-      </w:pPr>
-      <w:r>
-        <w:rPr>
-          <w:color w:val="000000"/>
-          <w:sz w:val="22"/>
-        </w:rPr>
-        <w:t>뉴스 크롤러와 Gemini API 공약 PDF 파서를 작성해 원문과 대조했습니다. 2026년에는 검수 병목을 근거로 평가 수치 공개 중단·자료 대조 전환을 제안하고 4개 조건을 붙여 승인했습니다.</w:t>
-      </w:r>
-    </w:p>
-    <w:p>
-      <w:pPr>
-        <w:keepNext w:val="0"/>
-        <w:keepLines/>
-        <w:spacing w:line="270" w:lineRule="exact" w:before="0" w:after="40"/>
-      </w:pPr>
-      <w:r>
-        <w:rPr>
-          <w:b/>
-          <w:sz w:val="22"/>
-        </w:rPr>
-        <w:t xml:space="preserve">결과 · </w:t>
-      </w:r>
-      <w:r>
-        <w:rPr>
-          <w:color w:val="000000"/>
-          <w:sz w:val="22"/>
-        </w:rPr>
-        <w:t>평가 수치 공개 중단·자료 대조 화면 전환. 공약·예산 매칭 정밀도 33%→89%(검증 표본 18건 중 16건), AI 매처 오탐률 2.1%(상한 4.1%). 공개 배포 전.</w:t>
-      </w:r>
-    </w:p>
-    <w:p>
-      <w:pPr>
-        <w:pStyle w:val="Heading2"/>
-        <w:keepNext/>
-        <w:keepLines/>
-        <w:spacing w:line="270" w:lineRule="exact" w:before="80" w:after="20"/>
-      </w:pPr>
-      <w:r>
-        <w:rPr>
-          <w:b/>
-          <w:color w:val="000000"/>
-          <w:sz w:val="22"/>
-        </w:rPr>
-        <w:t>Dear Log 캡스톤 디자인</w:t>
-      </w:r>
-    </w:p>
-    <w:p>
-      <w:pPr>
-        <w:keepNext/>
-        <w:keepLines/>
-        <w:spacing w:line="270" w:lineRule="exact" w:before="0" w:after="40"/>
-      </w:pPr>
-      <w:r>
-        <w:rPr>
-          <w:color w:val="000000"/>
-          <w:sz w:val="21"/>
-        </w:rPr>
-        <w:t>2026 1학기 캡스톤 팀 · 백엔드 연결·AI 에이전트 흐름 · 6월 개발 총괄 배정 / 2026.07-10 후속 개인 운영(구현 AI 협업)</w:t>
-      </w:r>
-    </w:p>
-    <w:p>
-      <w:pPr>
-        <w:keepNext/>
-        <w:keepLines/>
-        <w:spacing w:line="270" w:lineRule="exact" w:before="0" w:after="40"/>
-      </w:pPr>
-      <w:r>
-        <w:rPr>
-          <w:color w:val="000000"/>
-          <w:sz w:val="22"/>
-        </w:rPr>
-        <w:t>데모의 글자 잘림·동의 설정·모바일 문제를 위치와 수정 방향이 담긴 요청 10건으로 전달했습니다. 학기 후에는 샘플 보기·문의만 공개, 데모·운영 서버 분리, 동의 5종 실제 적용을 결정했습니다.</w:t>
-      </w:r>
-    </w:p>
-    <w:p>
-      <w:pPr>
-        <w:keepNext w:val="0"/>
-        <w:keepLines/>
-        <w:spacing w:line="270" w:lineRule="exact" w:before="0" w:after="40"/>
-      </w:pPr>
-      <w:r>
-        <w:rPr>
-          <w:b/>
-          <w:sz w:val="22"/>
-        </w:rPr>
-        <w:t xml:space="preserve">결과 · </w:t>
-      </w:r>
-      <w:r>
-        <w:rPr>
-          <w:color w:val="000000"/>
-          <w:sz w:val="22"/>
-        </w:rPr>
-        <w:t>수정 요청 10건 모두 팀 완료 표시. dear-log.com 공개 운영 중.</w:t>
-      </w:r>
-    </w:p>
-    <w:p>
-      <w:pPr>
-        <w:pStyle w:val="Heading2"/>
-        <w:keepNext/>
-        <w:keepLines/>
-        <w:spacing w:line="270" w:lineRule="exact" w:before="80" w:after="20"/>
-      </w:pPr>
-      <w:r>
-        <w:rPr>
-          <w:b/>
-          <w:color w:val="000000"/>
-          <w:sz w:val="22"/>
-        </w:rPr>
-        <w:t>양주 광역버스 좌석 정보</w:t>
-      </w:r>
-    </w:p>
-    <w:p>
-      <w:pPr>
-        <w:keepNext/>
-        <w:keepLines/>
-        <w:spacing w:line="270" w:lineRule="exact" w:before="0" w:after="40"/>
-      </w:pPr>
-      <w:r>
-        <w:rPr>
-          <w:color w:val="000000"/>
-          <w:sz w:val="21"/>
-        </w:rPr>
-        <w:t>2026 · 양주시 미래인재 AI 공모전 5인 팀 · 응답 기준 설계 · 원천 대조 · AI 구현 검토</w:t>
-      </w:r>
-    </w:p>
-    <w:p>
-      <w:pPr>
-        <w:keepNext/>
-        <w:keepLines/>
-        <w:spacing w:line="270" w:lineRule="exact" w:before="0" w:after="40"/>
-      </w:pPr>
-      <w:r>
-        <w:rPr>
-          <w:color w:val="000000"/>
-          <w:sz w:val="22"/>
-        </w:rPr>
-        <w:t>좌석 0·정보 없음·빈 슬롯을 나누고 수집 시각과 오래된 정보(stale) 기준을 정했습니다. 근거 없는 예측 확률은 null로 두었습니다.</w:t>
-      </w:r>
-    </w:p>
-    <w:p>
-      <w:pPr>
-        <w:keepNext w:val="0"/>
-        <w:keepLines/>
-        <w:spacing w:line="270" w:lineRule="exact" w:before="0" w:after="40"/>
-      </w:pPr>
-      <w:r>
-        <w:rPr>
-          <w:b/>
-          <w:sz w:val="22"/>
-        </w:rPr>
-        <w:t xml:space="preserve">결과 · </w:t>
-      </w:r>
-      <w:r>
-        <w:rPr>
-          <w:color w:val="000000"/>
-          <w:sz w:val="22"/>
-        </w:rPr>
-        <w:t>정류장 4곳·노선/방향 매핑 6건 대조와 로컬 API(코드·테스트는 AI 작성, 183건 통과). 팀 통합·배포 전.</w:t>
-      </w:r>
-    </w:p>
-    <w:p>
-      <w:pPr>
-        <w:pStyle w:val="Heading2"/>
-        <w:keepNext/>
-        <w:keepLines/>
-        <w:spacing w:line="270" w:lineRule="exact" w:before="80" w:after="20"/>
-      </w:pPr>
-      <w:r>
-        <w:rPr>
-          <w:b/>
-          <w:color w:val="000000"/>
-          <w:sz w:val="22"/>
-        </w:rPr>
-        <w:t>Finsight ICT 한이음 드림업</w:t>
-      </w:r>
-    </w:p>
-    <w:p>
-      <w:pPr>
-        <w:keepNext/>
-        <w:keepLines/>
-        <w:spacing w:line="270" w:lineRule="exact" w:before="0" w:after="40"/>
-      </w:pPr>
-      <w:r>
-        <w:rPr>
-          <w:color w:val="000000"/>
-          <w:sz w:val="21"/>
-        </w:rPr>
-        <w:t>2025 · 5인 팀 · 팀장·PM · 기본 수집 코드 작성</w:t>
-      </w:r>
-    </w:p>
-    <w:p>
-      <w:pPr>
-        <w:keepNext/>
-        <w:keepLines/>
-        <w:spacing w:line="270" w:lineRule="exact" w:before="0" w:after="40"/>
-      </w:pPr>
-      <w:r>
-        <w:rPr>
-          <w:color w:val="000000"/>
-          <w:sz w:val="22"/>
-        </w:rPr>
-        <w:t>일정·업무를 조율하고 FnGuide·WiseReport 기본 수집 코드를 작성했습니다. PDF 문제를 본문·표·이미지로 나눠 팀원·멘토와 대안을 검토했습니다.</w:t>
-      </w:r>
-    </w:p>
-    <w:p>
-      <w:pPr>
-        <w:keepNext w:val="0"/>
-        <w:keepLines/>
-        <w:spacing w:line="270" w:lineRule="exact" w:before="0" w:after="40"/>
-      </w:pPr>
-      <w:r>
-        <w:rPr>
-          <w:b/>
-          <w:sz w:val="22"/>
-        </w:rPr>
-        <w:t xml:space="preserve">결과 · </w:t>
-      </w:r>
-      <w:r>
-        <w:rPr>
-          <w:color w:val="000000"/>
-          <w:sz w:val="22"/>
-        </w:rPr>
-        <w:t>팀 웹서비스 배포 · 본인 수집 코드 기록. 2026 개인 재구축(AI 협업)에서 파서 선택·데이터 신뢰 규칙을 결정해 리포트 2,536건·종목 591개 수집.</w:t>
-      </w:r>
-    </w:p>
-    <w:p>
-      <w:pPr>
-        <w:pStyle w:val="Heading2"/>
-        <w:keepNext/>
-        <w:keepLines/>
-        <w:spacing w:line="270" w:lineRule="exact" w:before="80" w:after="20"/>
-      </w:pPr>
-      <w:r>
-        <w:rPr>
-          <w:b/>
-          <w:color w:val="000000"/>
-          <w:sz w:val="22"/>
-        </w:rPr>
-        <w:t>KBI 금융 AI 리터러시 카드뉴스</w:t>
-      </w:r>
-    </w:p>
-    <w:p>
-      <w:pPr>
-        <w:keepNext/>
-        <w:keepLines/>
-        <w:spacing w:line="270" w:lineRule="exact" w:before="0" w:after="40"/>
-      </w:pPr>
-      <w:r>
-        <w:rPr>
-          <w:color w:val="000000"/>
-          <w:sz w:val="21"/>
-        </w:rPr>
-        <w:t>2026 · RPG 카드뉴스 5장 기획 · 생성형 AI 활용</w:t>
-      </w:r>
-    </w:p>
-    <w:p>
-      <w:pPr>
-        <w:keepNext/>
-        <w:keepLines/>
-        <w:spacing w:line="270" w:lineRule="exact" w:before="0" w:after="40"/>
-      </w:pPr>
-      <w:r>
-        <w:rPr>
-          <w:color w:val="000000"/>
-          <w:sz w:val="22"/>
-        </w:rPr>
-        <w:t>NotebookLM 정보 정리→Gemini Gems 프롬프트→나노바나나 이미지 생성 흐름을 사용했습니다. 프롬프트·이미지는 AI 산출물입니다.</w:t>
-      </w:r>
-    </w:p>
-    <w:p>
-      <w:pPr>
-        <w:keepNext w:val="0"/>
-        <w:keepLines/>
-        <w:spacing w:line="270" w:lineRule="exact" w:before="0" w:after="40"/>
-      </w:pPr>
-      <w:r>
-        <w:rPr>
-          <w:b/>
-          <w:sz w:val="22"/>
-        </w:rPr>
-        <w:t xml:space="preserve">결과 · </w:t>
-      </w:r>
-      <w:r>
-        <w:rPr>
-          <w:color w:val="000000"/>
-          <w:sz w:val="22"/>
-        </w:rPr>
-        <w:t>2026 KBI 자격 홍보 콘텐츠 공모전 카드뉴스 인기상.</w:t>
-      </w:r>
-    </w:p>
-    <w:p>
-      <w:pPr>
-        <w:pStyle w:val="Heading1"/>
-        <w:keepNext/>
-        <w:keepLines/>
-        <w:spacing w:line="320" w:lineRule="exact" w:before="140" w:after="60"/>
-      </w:pPr>
-      <w:r>
-        <w:rPr>
-          <w:b/>
-          <w:color w:val="000000"/>
-          <w:sz w:val="26"/>
-        </w:rPr>
-        <w:t>도구 활용 능력</w:t>
-      </w:r>
-    </w:p>
-    <w:p>
-      <w:pPr>
-        <w:keepNext w:val="0"/>
-        <w:keepLines/>
-        <w:spacing w:line="270" w:lineRule="exact" w:before="0" w:after="40"/>
-      </w:pPr>
-      <w:r>
-        <w:rPr>
-          <w:b/>
-          <w:sz w:val="22"/>
-        </w:rPr>
-        <w:t xml:space="preserve">Python · </w:t>
-      </w:r>
-      <w:r>
-        <w:rPr>
-          <w:color w:val="000000"/>
-          <w:sz w:val="22"/>
-        </w:rPr>
-        <w:t>Finsight 기본 수집 코드 · NCA 크롤러·PDF 파서 작성</w:t>
-      </w:r>
-    </w:p>
-    <w:p>
-      <w:pPr>
-        <w:keepNext w:val="0"/>
-        <w:keepLines/>
-        <w:spacing w:line="270" w:lineRule="exact" w:before="0" w:after="40"/>
-      </w:pPr>
-      <w:r>
-        <w:rPr>
-          <w:b/>
-          <w:sz w:val="22"/>
-        </w:rPr>
-        <w:t xml:space="preserve">SQL · </w:t>
-      </w:r>
-      <w:r>
-        <w:rPr>
-          <w:color w:val="000000"/>
-          <w:sz w:val="22"/>
-        </w:rPr>
-        <w:t>데이터 엔지니어링 교육 · API·DB 설계 검토</w:t>
-      </w:r>
-    </w:p>
-    <w:p>
-      <w:pPr>
-        <w:keepNext w:val="0"/>
-        <w:keepLines/>
-        <w:spacing w:line="270" w:lineRule="exact" w:before="0" w:after="40"/>
-      </w:pPr>
-      <w:r>
-        <w:rPr>
-          <w:b/>
-          <w:sz w:val="22"/>
-        </w:rPr>
-        <w:t xml:space="preserve">Gemini API · </w:t>
-      </w:r>
-      <w:r>
-        <w:rPr>
-          <w:color w:val="000000"/>
-          <w:sz w:val="22"/>
-        </w:rPr>
-        <w:t>NCA 공약 PDF 파서와 원문 대조</w:t>
-      </w:r>
-    </w:p>
-    <w:p>
-      <w:pPr>
-        <w:keepNext w:val="0"/>
-        <w:keepLines/>
-        <w:spacing w:line="270" w:lineRule="exact" w:before="0" w:after="40"/>
-      </w:pPr>
-      <w:r>
-        <w:rPr>
-          <w:b/>
-          <w:sz w:val="22"/>
-        </w:rPr>
-        <w:t xml:space="preserve">NotebookLM · Gemini Gems · 나노바나나 · </w:t>
-      </w:r>
-      <w:r>
-        <w:rPr>
-          <w:color w:val="000000"/>
-          <w:sz w:val="22"/>
-        </w:rPr>
-        <w:t>KBI 정보 정리·프롬프트·이미지 생성 흐름</w:t>
-      </w:r>
-    </w:p>
-    <w:p>
-      <w:pPr>
-        <w:keepNext w:val="0"/>
-        <w:keepLines/>
-        <w:spacing w:line="270" w:lineRule="exact" w:before="0" w:after="40"/>
-      </w:pPr>
-      <w:r>
-        <w:rPr>
-          <w:b/>
-          <w:sz w:val="22"/>
-        </w:rPr>
-        <w:t xml:space="preserve">Claude · </w:t>
-      </w:r>
-      <w:r>
-        <w:rPr>
-          <w:color w:val="000000"/>
-          <w:sz w:val="22"/>
-        </w:rPr>
-        <w:t>온통청년 공동 보고서 문장 다듬기</w:t>
-      </w:r>
-    </w:p>
+    <w:tbl>
+      <w:tblPr>
+        <w:tblW w:type="auto" w:w="0"/>
+        <w:tblLayout w:type="fixed"/>
+        <w:tblLook w:firstColumn="1" w:firstRow="1" w:lastColumn="0" w:lastRow="0" w:noHBand="0" w:noVBand="1" w:val="04A0"/>
+        <w:tblBorders>
+          <w:top w:val="single" w:sz="10" w:color="1A1A1A"/>
+          <w:left w:val="single" w:sz="4" w:color="B8B8B8"/>
+          <w:bottom w:val="single" w:sz="4" w:color="B8B8B8"/>
+          <w:right w:val="single" w:sz="4" w:color="B8B8B8"/>
+          <w:insideH w:val="single" w:sz="4" w:color="B8B8B8"/>
+          <w:insideV w:val="single" w:sz="4" w:color="B8B8B8"/>
+        </w:tblBorders>
+        <w:tblLayout w:type="fixed"/>
+      </w:tblPr>
+      <w:tblGrid>
+        <w:gridCol w:w="1701"/>
+        <w:gridCol w:w="8617"/>
+      </w:tblGrid>
+      <w:tr>
+        <w:trPr>
+          <w:cantSplit/>
+        </w:trPr>
+        <w:tc>
+          <w:tcPr>
+            <w:tcW w:type="dxa" w:w="1701"/>
+            <w:shd w:val="clear" w:color="auto" w:fill="F0F0F0"/>
+            <w:vAlign w:val="center"/>
+          </w:tcPr>
+          <w:p>
+            <w:pPr>
+              <w:jc w:val="center"/>
+            </w:pPr>
+            <w:r>
+              <w:rPr>
+                <w:b/>
+              </w:rPr>
+            </w:r>
+            <w:r>
+              <w:rPr>
+                <w:b/>
+              </w:rPr>
+              <w:t>Python</w:t>
+            </w:r>
+          </w:p>
+        </w:tc>
+        <w:tc>
+          <w:tcPr>
+            <w:tcW w:type="dxa" w:w="8617"/>
+            <w:vAlign w:val="center"/>
+          </w:tcPr>
+          <w:p>
+            <w:r/>
+            <w:r>
+              <w:t>Finsight 수집 코드, NCA 뉴스 크롤러와 PDF 파서</w:t>
+            </w:r>
+          </w:p>
+        </w:tc>
+      </w:tr>
+      <w:tr>
+        <w:trPr>
+          <w:cantSplit/>
+        </w:trPr>
+        <w:tc>
+          <w:tcPr>
+            <w:tcW w:type="dxa" w:w="1701"/>
+            <w:shd w:val="clear" w:color="auto" w:fill="F0F0F0"/>
+            <w:vAlign w:val="center"/>
+          </w:tcPr>
+          <w:p>
+            <w:pPr>
+              <w:jc w:val="center"/>
+            </w:pPr>
+            <w:r>
+              <w:rPr>
+                <w:b/>
+              </w:rPr>
+            </w:r>
+            <w:r>
+              <w:rPr>
+                <w:b/>
+              </w:rPr>
+              <w:t>SQL, SQLite</w:t>
+            </w:r>
+          </w:p>
+        </w:tc>
+        <w:tc>
+          <w:tcPr>
+            <w:tcW w:type="dxa" w:w="8617"/>
+            <w:vAlign w:val="center"/>
+          </w:tcPr>
+          <w:p>
+            <w:r/>
+            <w:r>
+              <w:t>데이터 엔지니어링 교육, API와 DB 설계 검토</w:t>
+            </w:r>
+          </w:p>
+        </w:tc>
+      </w:tr>
+      <w:tr>
+        <w:trPr>
+          <w:cantSplit/>
+        </w:trPr>
+        <w:tc>
+          <w:tcPr>
+            <w:tcW w:type="dxa" w:w="1701"/>
+            <w:shd w:val="clear" w:color="auto" w:fill="F0F0F0"/>
+            <w:vAlign w:val="center"/>
+          </w:tcPr>
+          <w:p>
+            <w:pPr>
+              <w:jc w:val="center"/>
+            </w:pPr>
+            <w:r>
+              <w:rPr>
+                <w:b/>
+              </w:rPr>
+            </w:r>
+            <w:r>
+              <w:rPr>
+                <w:b/>
+              </w:rPr>
+              <w:t>Gemini API</w:t>
+            </w:r>
+          </w:p>
+        </w:tc>
+        <w:tc>
+          <w:tcPr>
+            <w:tcW w:type="dxa" w:w="8617"/>
+            <w:vAlign w:val="center"/>
+          </w:tcPr>
+          <w:p>
+            <w:r/>
+            <w:r>
+              <w:t>NCA 공약 PDF 파서</w:t>
+            </w:r>
+          </w:p>
+        </w:tc>
+      </w:tr>
+      <w:tr>
+        <w:trPr>
+          <w:cantSplit/>
+        </w:trPr>
+        <w:tc>
+          <w:tcPr>
+            <w:tcW w:type="dxa" w:w="1701"/>
+            <w:shd w:val="clear" w:color="auto" w:fill="F0F0F0"/>
+            <w:vAlign w:val="center"/>
+          </w:tcPr>
+          <w:p>
+            <w:pPr>
+              <w:jc w:val="center"/>
+            </w:pPr>
+            <w:r>
+              <w:rPr>
+                <w:b/>
+              </w:rPr>
+            </w:r>
+            <w:r>
+              <w:rPr>
+                <w:b/>
+              </w:rPr>
+              <w:t>생성형 AI</w:t>
+            </w:r>
+          </w:p>
+        </w:tc>
+        <w:tc>
+          <w:tcPr>
+            <w:tcW w:type="dxa" w:w="8617"/>
+            <w:vAlign w:val="center"/>
+          </w:tcPr>
+          <w:p>
+            <w:r/>
+            <w:r>
+              <w:t>NotebookLM, Gemini Gems, 나노바나나 (KBI) / Claude (온통청년 보고서 문장 다듬기)</w:t>
+            </w:r>
+          </w:p>
+        </w:tc>
+      </w:tr>
+    </w:tbl>
     <w:sectPr>
-      <w:footerReference w:type="default" r:id="rId13"/>
       <w:pgSz w:w="11906" w:h="16838"/>
-      <w:pgMar w:top="935" w:right="1020" w:bottom="964" w:left="1020" w:header="283" w:footer="397" w:gutter="0"/>
+      <w:pgMar w:top="794" w:right="794" w:bottom="680" w:left="794" w:header="720" w:footer="720" w:gutter="0"/>
       <w:cols w:space="720"/>
       <w:docGrid w:linePitch="360"/>
     </w:sectPr>
   </w:body>
 </w:document>
-</file>
-
-<file path=word/footer1.xml><?xml version="1.0" encoding="utf-8"?>
-<w:ftr xmlns:m="http://schemas.openxmlformats.org/officeDocument/2006/math" xmlns:mc="http://schemas.openxmlformats.org/markup-compatibility/2006" xmlns:mo="http://schemas.microsoft.com/office/mac/office/2008/main" xmlns:mv="urn:schemas-microsoft-com:mac:vml" xmlns:o="urn:schemas-microsoft-com:office:office" xmlns:r="http://schemas.openxmlformats.org/officeDocument/2006/relationships" xmlns:v="urn:schemas-microsoft-com:vml" xmlns:w10="urn:schemas-microsoft-com:office:word" xmlns:w14="http://schemas.microsoft.com/office/word/2010/wordml" xmlns:w="http://schemas.openxmlformats.org/wordprocessingml/2006/main" xmlns:wne="http://schemas.microsoft.com/office/word/2006/wordml" xmlns:wp14="http://schemas.microsoft.com/office/word/2010/wordprocessingDrawing" xmlns:wp="http://schemas.openxmlformats.org/drawingml/2006/wordprocessingDrawing" xmlns:wpc="http://schemas.microsoft.com/office/word/2010/wordprocessingCanvas" xmlns:wpg="http://schemas.microsoft.com/office/word/2010/wordprocessingGroup" xmlns:wpi="http://schemas.microsoft.com/office/word/2010/wordprocessingInk" xmlns:wps="http://schemas.microsoft.com/office/word/2010/wordprocessingShape" mc:Ignorable="w14 wp14">
-  <w:p>
-    <w:pPr>
-      <w:pStyle w:val="Footer"/>
-      <w:jc w:val="right"/>
-    </w:pPr>
-    <w:r>
-      <w:rPr>
-        <w:sz w:val="18"/>
-      </w:rPr>
-      <w:t xml:space="preserve">문대한 · 서비스 기획 / PM  |  </w:t>
-    </w:r>
-    <w:fldSimple w:instr="PAGE"/>
-  </w:p>
-</w:ftr>
 </file>
 
 <file path=word/numbering.xml><?xml version="1.0" encoding="utf-8"?>
@@ -1488,13 +2912,11 @@
     <w:qFormat/>
     <w:rsid w:val="00FC693F"/>
     <w:pPr>
-      <w:widowControl/>
-      <w:spacing w:lineRule="exact" w:line="308" w:after="120"/>
+      <w:spacing w:after="0" w:line="288" w:lineRule="auto"/>
     </w:pPr>
     <w:rPr>
-      <w:rFonts w:ascii="Apple SD Gothic Neo" w:hAnsi="Apple SD Gothic Neo" w:eastAsia="Apple SD Gothic Neo" w:cs="Apple SD Gothic Neo"/>
-      <w:color w:val="000000"/>
-      <w:sz w:val="22"/>
+      <w:rFonts w:ascii="Apple SD Gothic Neo" w:hAnsi="Apple SD Gothic Neo" w:eastAsia="Apple SD Gothic Neo"/>
+      <w:sz w:val="18"/>
     </w:rPr>
   </w:style>
   <w:style w:type="paragraph" w:styleId="Header">
@@ -1552,16 +2974,15 @@
     <w:pPr>
       <w:keepNext/>
       <w:keepLines/>
-      <w:widowControl/>
-      <w:spacing w:before="340" w:after="200" w:lineRule="exact" w:line="480"/>
+      <w:spacing w:before="480" w:after="0"/>
       <w:outlineLvl w:val="0"/>
     </w:pPr>
     <w:rPr>
-      <w:rFonts w:ascii="Apple SD Gothic Neo" w:hAnsi="Apple SD Gothic Neo" w:eastAsia="Apple SD Gothic Neo" w:cs="Apple SD Gothic Neo"/>
+      <w:rFonts w:asciiTheme="majorHAnsi" w:eastAsiaTheme="majorEastAsia" w:hAnsiTheme="majorHAnsi" w:cstheme="majorBidi"/>
       <w:b/>
       <w:bCs/>
-      <w:color w:val="000000"/>
-      <w:sz w:val="34"/>
+      <w:color w:val="365F91" w:themeColor="accent1" w:themeShade="BF"/>
+      <w:sz w:val="28"/>
       <w:szCs w:val="28"/>
     </w:rPr>
   </w:style>
@@ -1577,16 +2998,15 @@
     <w:pPr>
       <w:keepNext/>
       <w:keepLines/>
-      <w:widowControl/>
-      <w:spacing w:before="220" w:after="120" w:lineRule="exact" w:line="380"/>
+      <w:spacing w:before="200" w:after="0"/>
       <w:outlineLvl w:val="1"/>
     </w:pPr>
     <w:rPr>
-      <w:rFonts w:ascii="Apple SD Gothic Neo" w:hAnsi="Apple SD Gothic Neo" w:eastAsia="Apple SD Gothic Neo" w:cs="Apple SD Gothic Neo"/>
+      <w:rFonts w:asciiTheme="majorHAnsi" w:eastAsiaTheme="majorEastAsia" w:hAnsiTheme="majorHAnsi" w:cstheme="majorBidi"/>
       <w:b/>
       <w:bCs/>
-      <w:color w:val="000000"/>
-      <w:sz w:val="25"/>
+      <w:color w:val="4F81BD" w:themeColor="accent1"/>
+      <w:sz w:val="26"/>
       <w:szCs w:val="26"/>
     </w:rPr>
   </w:style>
@@ -1602,16 +3022,14 @@
     <w:pPr>
       <w:keepNext/>
       <w:keepLines/>
-      <w:widowControl/>
-      <w:spacing w:before="180" w:after="100" w:lineRule="exact" w:line="340"/>
+      <w:spacing w:before="200" w:after="0"/>
       <w:outlineLvl w:val="2"/>
     </w:pPr>
     <w:rPr>
-      <w:rFonts w:ascii="Apple SD Gothic Neo" w:hAnsi="Apple SD Gothic Neo" w:eastAsia="Apple SD Gothic Neo" w:cs="Apple SD Gothic Neo"/>
+      <w:rFonts w:asciiTheme="majorHAnsi" w:eastAsiaTheme="majorEastAsia" w:hAnsiTheme="majorHAnsi" w:cstheme="majorBidi"/>
       <w:b/>
       <w:bCs/>
-      <w:color w:val="000000"/>
-      <w:sz w:val="23"/>
+      <w:color w:val="4F81BD" w:themeColor="accent1"/>
     </w:rPr>
   </w:style>
   <w:style w:type="paragraph" w:styleId="Heading4">
@@ -1627,18 +3045,16 @@
     <w:pPr>
       <w:keepNext/>
       <w:keepLines/>
-      <w:widowControl/>
-      <w:spacing w:before="160" w:after="100" w:lineRule="exact" w:line="340"/>
+      <w:spacing w:before="200" w:after="0"/>
       <w:outlineLvl w:val="3"/>
     </w:pPr>
     <w:rPr>
-      <w:rFonts w:ascii="Apple SD Gothic Neo" w:hAnsi="Apple SD Gothic Neo" w:eastAsia="Apple SD Gothic Neo" w:cs="Apple SD Gothic Neo"/>
+      <w:rFonts w:asciiTheme="majorHAnsi" w:eastAsiaTheme="majorEastAsia" w:hAnsiTheme="majorHAnsi" w:cstheme="majorBidi"/>
       <w:b/>
       <w:bCs/>
       <w:i/>
       <w:iCs/>
-      <w:color w:val="000000"/>
-      <w:sz w:val="23"/>
+      <w:color w:val="4F81BD" w:themeColor="accent1"/>
     </w:rPr>
   </w:style>
   <w:style w:type="paragraph" w:styleId="Heading5">
@@ -1659,7 +3075,7 @@
     </w:pPr>
     <w:rPr>
       <w:rFonts w:asciiTheme="majorHAnsi" w:eastAsiaTheme="majorEastAsia" w:hAnsiTheme="majorHAnsi" w:cstheme="majorBidi"/>
-      <w:color w:val="000000"/>
+      <w:color w:val="243F60" w:themeColor="accent1" w:themeShade="7F"/>
     </w:rPr>
   </w:style>
   <w:style w:type="paragraph" w:styleId="Heading6">
@@ -1682,7 +3098,7 @@
       <w:rFonts w:asciiTheme="majorHAnsi" w:eastAsiaTheme="majorEastAsia" w:hAnsiTheme="majorHAnsi" w:cstheme="majorBidi"/>
       <w:i/>
       <w:iCs/>
-      <w:color w:val="000000"/>
+      <w:color w:val="243F60" w:themeColor="accent1" w:themeShade="7F"/>
     </w:rPr>
   </w:style>
   <w:style w:type="paragraph" w:styleId="Heading7">
@@ -1705,7 +3121,7 @@
       <w:rFonts w:asciiTheme="majorHAnsi" w:eastAsiaTheme="majorEastAsia" w:hAnsiTheme="majorHAnsi" w:cstheme="majorBidi"/>
       <w:i/>
       <w:iCs/>
-      <w:color w:val="000000"/>
+      <w:color w:val="404040" w:themeColor="text1" w:themeTint="BF"/>
     </w:rPr>
   </w:style>
   <w:style w:type="paragraph" w:styleId="Heading8">
@@ -1726,7 +3142,7 @@
     </w:pPr>
     <w:rPr>
       <w:rFonts w:asciiTheme="majorHAnsi" w:eastAsiaTheme="majorEastAsia" w:hAnsiTheme="majorHAnsi" w:cstheme="majorBidi"/>
-      <w:color w:val="000000"/>
+      <w:color w:val="4F81BD" w:themeColor="accent1"/>
       <w:sz w:val="20"/>
       <w:szCs w:val="20"/>
     </w:rPr>
@@ -1751,7 +3167,7 @@
       <w:rFonts w:asciiTheme="majorHAnsi" w:eastAsiaTheme="majorEastAsia" w:hAnsiTheme="majorHAnsi" w:cstheme="majorBidi"/>
       <w:i/>
       <w:iCs/>
-      <w:color w:val="000000"/>
+      <w:color w:val="404040" w:themeColor="text1" w:themeTint="BF"/>
       <w:sz w:val="20"/>
       <w:szCs w:val="20"/>
     </w:rPr>
@@ -1844,18 +3260,18 @@
     <w:qFormat/>
     <w:rsid w:val="00FC693F"/>
     <w:pPr>
-      <w:keepNext/>
-      <w:widowControl/>
-      <w:spacing w:after="160" w:line="740" w:lineRule="exact" w:before="0"/>
+      <w:pBdr>
+        <w:bottom w:val="single" w:sz="8" w:space="4" w:color="4F81BD" w:themeColor="accent1"/>
+      </w:pBdr>
+      <w:spacing w:after="300" w:line="240" w:lineRule="auto"/>
       <w:contextualSpacing/>
     </w:pPr>
     <w:rPr>
-      <w:rFonts w:ascii="Apple SD Gothic Neo" w:hAnsi="Apple SD Gothic Neo" w:eastAsia="Apple SD Gothic Neo" w:cs="Apple SD Gothic Neo"/>
-      <w:b/>
-      <w:color w:val="000000"/>
+      <w:rFonts w:asciiTheme="majorHAnsi" w:eastAsiaTheme="majorEastAsia" w:hAnsiTheme="majorHAnsi" w:cstheme="majorBidi"/>
+      <w:color w:val="17365D" w:themeColor="text2" w:themeShade="BF"/>
       <w:spacing w:val="5"/>
       <w:kern w:val="28"/>
-      <w:sz w:val="56"/>
+      <w:sz w:val="52"/>
       <w:szCs w:val="52"/>
     </w:rPr>
   </w:style>
@@ -1883,19 +3299,17 @@
     <w:qFormat/>
     <w:rsid w:val="00FC693F"/>
     <w:pPr>
-      <w:widowControl/>
       <w:numPr>
         <w:ilvl w:val="1"/>
       </w:numPr>
-      <w:spacing w:lineRule="exact" w:line="308" w:after="120"/>
     </w:pPr>
     <w:rPr>
-      <w:rFonts w:ascii="Apple SD Gothic Neo" w:hAnsi="Apple SD Gothic Neo" w:eastAsia="Apple SD Gothic Neo" w:cs="Apple SD Gothic Neo"/>
+      <w:rFonts w:asciiTheme="majorHAnsi" w:eastAsiaTheme="majorEastAsia" w:hAnsiTheme="majorHAnsi" w:cstheme="majorBidi"/>
       <w:i/>
       <w:iCs/>
-      <w:color w:val="000000"/>
+      <w:color w:val="4F81BD" w:themeColor="accent1"/>
       <w:spacing w:val="15"/>
-      <w:sz w:val="22"/>
+      <w:sz w:val="24"/>
       <w:szCs w:val="24"/>
     </w:rPr>
   </w:style>
@@ -2333,6 +3747,9 @@
     <w:qFormat/>
     <w:rsid w:val="00FC693F"/>
     <w:pPr>
+      <w:pBdr>
+        <w:bottom w:val="single" w:sz="4" w:space="4" w:color="4F81BD" w:themeColor="accent1"/>
+      </w:pBdr>
       <w:spacing w:before="200" w:after="280"/>
       <w:ind w:left="936" w:right="936"/>
     </w:pPr>

</xml_diff>

<commit_message>
Add certified training and project evidence from Drive records
Courses, periods and hours copied from certificates; no personal data published.

Co-Authored-By: Claude Opus 5.5 <noreply@anthropic.com>
</commit_message>
<xml_diff>
--- a/resume.docx
+++ b/resume.docx
@@ -1451,7 +1451,7 @@
             </w:pPr>
             <w:r/>
             <w:r>
-              <w:t>2025</w:t>
+              <w:t>2025.04–10</w:t>
             </w:r>
           </w:p>
         </w:tc>
@@ -1660,7 +1660,7 @@
           <w:b/>
           <w:sz w:val="22"/>
         </w:rPr>
-        <w:t>▌수상</w:t>
+        <w:t>▌수상·선정</w:t>
       </w:r>
     </w:p>
     <w:tbl>
@@ -1906,6 +1906,68 @@
           </w:p>
         </w:tc>
       </w:tr>
+      <w:tr>
+        <w:trPr>
+          <w:cantSplit/>
+        </w:trPr>
+        <w:tc>
+          <w:tcPr>
+            <w:tcW w:type="dxa" w:w="1701"/>
+            <w:vAlign w:val="center"/>
+          </w:tcPr>
+          <w:p>
+            <w:pPr>
+              <w:jc w:val="center"/>
+            </w:pPr>
+            <w:r/>
+            <w:r>
+              <w:t>2025</w:t>
+            </w:r>
+          </w:p>
+        </w:tc>
+        <w:tc>
+          <w:tcPr>
+            <w:tcW w:type="dxa" w:w="4989"/>
+            <w:vAlign w:val="center"/>
+          </w:tcPr>
+          <w:p>
+            <w:r/>
+            <w:r>
+              <w:t>경기청년 갭이어 &lt;기회 더하기&gt; 프로젝트 플러스+</w:t>
+            </w:r>
+          </w:p>
+        </w:tc>
+        <w:tc>
+          <w:tcPr>
+            <w:tcW w:type="dxa" w:w="2041"/>
+            <w:vAlign w:val="center"/>
+          </w:tcPr>
+          <w:p>
+            <w:pPr>
+              <w:jc w:val="center"/>
+            </w:pPr>
+            <w:r/>
+            <w:r>
+              <w:t>선정</w:t>
+            </w:r>
+          </w:p>
+        </w:tc>
+        <w:tc>
+          <w:tcPr>
+            <w:tcW w:type="dxa" w:w="1587"/>
+            <w:vAlign w:val="center"/>
+          </w:tcPr>
+          <w:p>
+            <w:pPr>
+              <w:jc w:val="center"/>
+            </w:pPr>
+            <w:r/>
+            <w:r>
+              <w:t>개인</w:t>
+            </w:r>
+          </w:p>
+        </w:tc>
+      </w:tr>
     </w:tbl>
     <w:p>
       <w:pPr>
@@ -2030,6 +2092,94 @@
             </w:pPr>
             <w:r/>
             <w:r>
+              <w:t>2026.07.20–09.14</w:t>
+            </w:r>
+          </w:p>
+        </w:tc>
+        <w:tc>
+          <w:tcPr>
+            <w:tcW w:type="dxa" w:w="4989"/>
+            <w:vAlign w:val="center"/>
+          </w:tcPr>
+          <w:p>
+            <w:r/>
+            <w:r>
+              <w:t>수도권 ICT 이노베이션스퀘어 데이터 고급(AI기획자) 과정</w:t>
+            </w:r>
+          </w:p>
+        </w:tc>
+        <w:tc>
+          <w:tcPr>
+            <w:tcW w:type="dxa" w:w="3628"/>
+            <w:vAlign w:val="center"/>
+          </w:tcPr>
+          <w:p>
+            <w:r/>
+            <w:r>
+              <w:t>160시간 수료</w:t>
+            </w:r>
+          </w:p>
+        </w:tc>
+      </w:tr>
+      <w:tr>
+        <w:trPr>
+          <w:cantSplit/>
+        </w:trPr>
+        <w:tc>
+          <w:tcPr>
+            <w:tcW w:type="dxa" w:w="1701"/>
+            <w:vAlign w:val="center"/>
+          </w:tcPr>
+          <w:p>
+            <w:pPr>
+              <w:jc w:val="center"/>
+            </w:pPr>
+            <w:r/>
+            <w:r>
+              <w:t>2026.03.23–04.12</w:t>
+            </w:r>
+          </w:p>
+        </w:tc>
+        <w:tc>
+          <w:tcPr>
+            <w:tcW w:type="dxa" w:w="4989"/>
+            <w:vAlign w:val="center"/>
+          </w:tcPr>
+          <w:p>
+            <w:r/>
+            <w:r>
+              <w:t>K-ICT 빅데이터센터(NIA) AX·DX 실전 설계 아카데미</w:t>
+            </w:r>
+          </w:p>
+        </w:tc>
+        <w:tc>
+          <w:tcPr>
+            <w:tcW w:type="dxa" w:w="3628"/>
+            <w:vAlign w:val="center"/>
+          </w:tcPr>
+          <w:p>
+            <w:r/>
+            <w:r>
+              <w:t>10시간, 온라인</w:t>
+            </w:r>
+          </w:p>
+        </w:tc>
+      </w:tr>
+      <w:tr>
+        <w:trPr>
+          <w:cantSplit/>
+        </w:trPr>
+        <w:tc>
+          <w:tcPr>
+            <w:tcW w:type="dxa" w:w="1701"/>
+            <w:vAlign w:val="center"/>
+          </w:tcPr>
+          <w:p>
+            <w:pPr>
+              <w:jc w:val="center"/>
+            </w:pPr>
+            <w:r/>
+            <w:r>
               <w:t>2024.12.02–12.13</w:t>
             </w:r>
           </w:p>
@@ -2086,7 +2236,7 @@
           <w:p>
             <w:r/>
             <w:r>
-              <w:t>국립한국교통대학교 산업 인공지능 과정</w:t>
+              <w:t>국립한국교통대학교 산업 인공지능(AI) 과정</w:t>
             </w:r>
           </w:p>
         </w:tc>
@@ -2099,6 +2249,50 @@
             <w:r/>
             <w:r>
               <w:t>Python, Jupyter Notebook 기초</w:t>
+            </w:r>
+          </w:p>
+        </w:tc>
+      </w:tr>
+      <w:tr>
+        <w:trPr>
+          <w:cantSplit/>
+        </w:trPr>
+        <w:tc>
+          <w:tcPr>
+            <w:tcW w:type="dxa" w:w="1701"/>
+            <w:vAlign w:val="center"/>
+          </w:tcPr>
+          <w:p>
+            <w:pPr>
+              <w:jc w:val="center"/>
+            </w:pPr>
+            <w:r/>
+            <w:r>
+              <w:t>2024.01.02–02.26</w:t>
+            </w:r>
+          </w:p>
+        </w:tc>
+        <w:tc>
+          <w:tcPr>
+            <w:tcW w:type="dxa" w:w="4989"/>
+            <w:vAlign w:val="center"/>
+          </w:tcPr>
+          <w:p>
+            <w:r/>
+            <w:r>
+              <w:t>LG Aimers 4기 Data Intelligence</w:t>
+            </w:r>
+          </w:p>
+        </w:tc>
+        <w:tc>
+          <w:tcPr>
+            <w:tcW w:type="dxa" w:w="3628"/>
+            <w:vAlign w:val="center"/>
+          </w:tcPr>
+          <w:p>
+            <w:r/>
+            <w:r>
+              <w:t>MQL 예측 해커톤</w:t>
             </w:r>
           </w:p>
         </w:tc>
@@ -2375,7 +2569,9 @@
       </w:tblPr>
       <w:tblGrid>
         <w:gridCol w:w="1701"/>
-        <w:gridCol w:w="8617"/>
+        <w:gridCol w:w="3458"/>
+        <w:gridCol w:w="1701"/>
+        <w:gridCol w:w="3458"/>
       </w:tblGrid>
       <w:tr>
         <w:trPr>
@@ -2406,21 +2602,16 @@
         </w:tc>
         <w:tc>
           <w:tcPr>
-            <w:tcW w:type="dxa" w:w="8617"/>
+            <w:tcW w:type="dxa" w:w="3458"/>
             <w:vAlign w:val="center"/>
           </w:tcPr>
           <w:p>
             <w:r/>
             <w:r>
-              <w:t>Finsight 수집 코드, NCA 뉴스 크롤러와 PDF 파서</w:t>
+              <w:t>Finsight 수집 코드, NCA 크롤러와 PDF 파서</w:t>
             </w:r>
           </w:p>
         </w:tc>
-      </w:tr>
-      <w:tr>
-        <w:trPr>
-          <w:cantSplit/>
-        </w:trPr>
         <w:tc>
           <w:tcPr>
             <w:tcW w:type="dxa" w:w="1701"/>
@@ -2446,13 +2637,13 @@
         </w:tc>
         <w:tc>
           <w:tcPr>
-            <w:tcW w:type="dxa" w:w="8617"/>
+            <w:tcW w:type="dxa" w:w="3458"/>
             <w:vAlign w:val="center"/>
           </w:tcPr>
           <w:p>
             <w:r/>
             <w:r>
-              <w:t>데이터 엔지니어링 교육, API와 DB 설계 검토</w:t>
+              <w:t>데이터 엔지니어링 교육, API·DB 설계 검토</w:t>
             </w:r>
           </w:p>
         </w:tc>
@@ -2486,7 +2677,7 @@
         </w:tc>
         <w:tc>
           <w:tcPr>
-            <w:tcW w:type="dxa" w:w="8617"/>
+            <w:tcW w:type="dxa" w:w="3458"/>
             <w:vAlign w:val="center"/>
           </w:tcPr>
           <w:p>
@@ -2496,11 +2687,6 @@
             </w:r>
           </w:p>
         </w:tc>
-      </w:tr>
-      <w:tr>
-        <w:trPr>
-          <w:cantSplit/>
-        </w:trPr>
         <w:tc>
           <w:tcPr>
             <w:tcW w:type="dxa" w:w="1701"/>
@@ -2526,13 +2712,13 @@
         </w:tc>
         <w:tc>
           <w:tcPr>
-            <w:tcW w:type="dxa" w:w="8617"/>
+            <w:tcW w:type="dxa" w:w="3458"/>
             <w:vAlign w:val="center"/>
           </w:tcPr>
           <w:p>
             <w:r/>
             <w:r>
-              <w:t>NotebookLM, Gemini Gems, 나노바나나 (KBI) / Claude (온통청년 보고서 문장 다듬기)</w:t>
+              <w:t>NotebookLM, Gemini Gems, 나노바나나, Claude</w:t>
             </w:r>
           </w:p>
         </w:tc>

</xml_diff>

<commit_message>
Resume: role summary, four evidence-backed competencies synced across PDF, DOCX and web
Co-Authored-By: Claude Opus 5.5 <noreply@anthropic.com>
</commit_message>
<xml_diff>
--- a/resume.docx
+++ b/resume.docx
@@ -332,7 +332,16 @@
           <w:p>
             <w:r/>
             <w:r>
+              <w:rPr>
+                <w:b/>
+              </w:rPr>
               <w:t>데이터가 말할 수 있는 것만, 사용자가 이해할 수 있게 보여 준다.</w:t>
+            </w:r>
+            <w:r>
+              <w:br/>
+            </w:r>
+            <w:r>
+              <w:t>공공 데이터와 서비스 데이터를 다루며 무엇을 보여 줄지 범위부터 정해 왔다. 경기청년 연구 랩업에서 3인 팀 팀장으로 대상을 받았고, 공약 대조 서비스 NCA에서는 검수 없는 점수 공개를 멈추자고 제안했다. 가족 자서전 서비스 dear-log.com은 학기 후 혼자 공개 운영하고 있다.</w:t>
             </w:r>
           </w:p>
         </w:tc>
@@ -2465,7 +2474,7 @@
               <w:rPr>
                 <w:b/>
               </w:rPr>
-              <w:t>응답 기준 작성</w:t>
+              <w:t>범위와 기준 정의</w:t>
             </w:r>
           </w:p>
         </w:tc>
@@ -2477,7 +2486,7 @@
           <w:p>
             <w:r/>
             <w:r>
-              <w:t>같은 '없음'도 상황별로 나눠 화면 문구와 API 응답을 정함</w:t>
+              <w:t>무엇을 셀지, 어떤 값을 '없음'으로 볼지 먼저 문장으로 정함</w:t>
             </w:r>
           </w:p>
         </w:tc>
@@ -2489,7 +2498,7 @@
           <w:p>
             <w:r/>
             <w:r>
-              <w:t>양주 좌석 상태 구분, Dear Log 수정 요청 10건</w:t>
+              <w:t>온통청년 시설 범위 제안(보고서 기준 채택), 양주 좌석 0석과 정보 없음 구분</w:t>
             </w:r>
           </w:p>
         </w:tc>
@@ -2521,7 +2530,7 @@
           <w:p>
             <w:r/>
             <w:r>
-              <w:t>검증할 수 없는 수치는 공개하지 않고, 역할은 팀원 강점에 맞춰 나눔</w:t>
+              <w:t>검증할 수 없는 수치는 공개하지 않고, 보여 줄 범위와 조건부터 정함</w:t>
             </w:r>
           </w:p>
         </w:tc>
@@ -2533,7 +2542,95 @@
           <w:p>
             <w:r/>
             <w:r>
-              <w:t>NCA 점수 공개 중단, Finsight 역할 조정</w:t>
+              <w:t>NCA 점수 공개 중단과 승인 조건 4가지, Dear Log 가입 닫기와 서버 분리</w:t>
+            </w:r>
+          </w:p>
+        </w:tc>
+      </w:tr>
+      <w:tr>
+        <w:trPr>
+          <w:cantSplit/>
+        </w:trPr>
+        <w:tc>
+          <w:tcPr>
+            <w:tcW w:type="dxa" w:w="1701"/>
+            <w:vAlign w:val="center"/>
+          </w:tcPr>
+          <w:p>
+            <w:r/>
+            <w:r>
+              <w:rPr>
+                <w:b/>
+              </w:rPr>
+              <w:t>직접 써 보고 대조</w:t>
+            </w:r>
+          </w:p>
+        </w:tc>
+        <w:tc>
+          <w:tcPr>
+            <w:tcW w:type="dxa" w:w="4989"/>
+            <w:vAlign w:val="center"/>
+          </w:tcPr>
+          <w:p>
+            <w:r/>
+            <w:r>
+              <w:t>화면은 직접 써 보고 고칠 곳을 요청으로 정리, 데이터는 원천과 맞춰 봄</w:t>
+            </w:r>
+          </w:p>
+        </w:tc>
+        <w:tc>
+          <w:tcPr>
+            <w:tcW w:type="dxa" w:w="3628"/>
+            <w:vAlign w:val="center"/>
+          </w:tcPr>
+          <w:p>
+            <w:r/>
+            <w:r>
+              <w:t>Dear Log 수정 요청 10건(팀 완료), 양주 노선과 방향 매핑 6건 대조</w:t>
+            </w:r>
+          </w:p>
+        </w:tc>
+      </w:tr>
+      <w:tr>
+        <w:trPr>
+          <w:cantSplit/>
+        </w:trPr>
+        <w:tc>
+          <w:tcPr>
+            <w:tcW w:type="dxa" w:w="1701"/>
+            <w:vAlign w:val="center"/>
+          </w:tcPr>
+          <w:p>
+            <w:r/>
+            <w:r>
+              <w:rPr>
+                <w:b/>
+              </w:rPr>
+              <w:t>팀 일정과 문제 조율</w:t>
+            </w:r>
+          </w:p>
+        </w:tc>
+        <w:tc>
+          <w:tcPr>
+            <w:tcW w:type="dxa" w:w="4989"/>
+            <w:vAlign w:val="center"/>
+          </w:tcPr>
+          <w:p>
+            <w:r/>
+            <w:r>
+              <w:t>일정과 업무를 나누고, 막힌 문제는 유형별로 쪼개 팀원, 멘토와 대안을 찾음</w:t>
+            </w:r>
+          </w:p>
+        </w:tc>
+        <w:tc>
+          <w:tcPr>
+            <w:tcW w:type="dxa" w:w="3628"/>
+            <w:vAlign w:val="center"/>
+          </w:tcPr>
+          <w:p>
+            <w:r/>
+            <w:r>
+              <w:t>온통청년 팀장, Finsight PDF 처리 문제 검토</w:t>
             </w:r>
           </w:p>
         </w:tc>

</xml_diff>